<commit_message>
feat(pchsmb): add vinyl installation procedure, relief slits, and companion PDF to Backdrop D2
- Expand Appendix B Vinyl Installation into comprehensive 8-step shop procedure
- Detail hardware relief slits on long uprights (strut brackets) and bottom rail (cart brackets)
- Specify 1-1/4 in. greenhouse snap clamps (14 pcs per backdrop, Amazon B0CDZP8YVF)
- Position snap clamps directly above and below support strut brackets to lock them in place
- Add custom vinyl ordering specifications table with provisional TBD dimensions
- Document optional surface degreasing and mandatory >80F seasonal removal requirement
- Add Band Camp timing recommendation and solar warming advantage for vinyl teardown
- Generate matching 35-page companion PDF via Microsoft Word render pipeline
- Add D2 build record, manifest updates, QA audit and package diff reports
</commit_message>
<xml_diff>
--- a/PCHSMB/_Backdrop/docs/Backdrop_Assembly_Guide.docx
+++ b/PCHSMB/_Backdrop/docs/Backdrop_Assembly_Guide.docx
@@ -154,6 +154,48 @@
           </w:p>
         </w:tc>
       </w:tr>
+      <w:tr>
+        <w:tc>
+          <w:p>
+            <w:r>
+              <w:rPr>
+                <w:sz w:val="18"/>
+              </w:rPr>
+              <w:t>Release v0 (unreleased) — Development build D2</w:t>
+            </w:r>
+          </w:p>
+        </w:tc>
+        <w:tc>
+          <w:p>
+            <w:r>
+              <w:rPr>
+                <w:sz w:val="18"/>
+              </w:rPr>
+              <w:t>2026-09-10</w:t>
+            </w:r>
+          </w:p>
+        </w:tc>
+        <w:tc>
+          <w:p>
+            <w:r>
+              <w:rPr>
+                <w:sz w:val="18"/>
+              </w:rPr>
+              <w:t>WORKING DRAFT — NOT FOR USE</w:t>
+            </w:r>
+          </w:p>
+        </w:tc>
+        <w:tc>
+          <w:p>
+            <w:r>
+              <w:rPr>
+                <w:sz w:val="18"/>
+              </w:rPr>
+              <w:t>Add detailed vinyl installation procedure, specifications table, hardware relief slits, and snap clamp fastening</w:t>
+            </w:r>
+          </w:p>
+        </w:tc>
+      </w:tr>
     </w:tbl>
     <w:p>
       <w:pPr>
@@ -372,7 +414,7 @@
         <w:t xml:space="preserve">Parent revision: </w:t>
       </w:r>
       <w:r>
-        <w:t xml:space="preserve">Release v0 (unreleased) | Development build D1 | September 1, 2026</w:t>
+        <w:t xml:space="preserve">Release v0 (unreleased) | Development build D2 | September 10, 2026</w:t>
       </w:r>
     </w:p>
     <w:p>
@@ -1543,7 +1585,7 @@
         <w:t xml:space="preserve">Parent revision: </w:t>
       </w:r>
       <w:r>
-        <w:t xml:space="preserve">Release v0 (unreleased) | Development build D1 | September 1, 2026</w:t>
+        <w:t xml:space="preserve">Release v0 (unreleased) | Development build D2 | September 10, 2026</w:t>
       </w:r>
     </w:p>
     <w:p>
@@ -2213,21 +2255,51 @@
         <w:tc>
           <w:p>
             <w:r>
-              <w:t>Pipe Snap Clamps</w:t>
+              <w:t>Custom Vinyl Banner</w:t>
             </w:r>
           </w:p>
         </w:tc>
         <w:tc>
           <w:p>
             <w:r>
-              <w:t>1-5/8" Pipe Snap Clamps</w:t>
+              <w:t>Heavyweight outdoor scrim vinyl (dimensions TBD; flush straight cut, no hems/grommets)</w:t>
             </w:r>
           </w:p>
         </w:tc>
         <w:tc>
           <w:p>
             <w:r>
-              <w:t>16-24</w:t>
+              <w:t>1</w:t>
+            </w:r>
+          </w:p>
+        </w:tc>
+        <w:tc>
+          <w:p>
+            <w:r>
+              <w:t>Custom printed</w:t>
+            </w:r>
+          </w:p>
+        </w:tc>
+      </w:tr>
+      <w:tr>
+        <w:tc>
+          <w:p>
+            <w:r>
+              <w:t>Greenhouse Snap Clamps</w:t>
+            </w:r>
+          </w:p>
+        </w:tc>
+        <w:tc>
+          <w:p>
+            <w:r>
+              <w:t>1-1/4" Greenhouse Snap Clamps (sized for 1-5/8" fence pipe w/ vinyl)</w:t>
+            </w:r>
+          </w:p>
+        </w:tc>
+        <w:tc>
+          <w:p>
+            <w:r>
+              <w:t>14 pcs</w:t>
             </w:r>
           </w:p>
         </w:tc>
@@ -2243,14 +2315,14 @@
         <w:tc>
           <w:p>
             <w:r>
-              <w:t>Double-Sided Carpet Tape</w:t>
+              <w:t>Double-Sided Tape</w:t>
             </w:r>
           </w:p>
         </w:tc>
         <w:tc>
           <w:p>
             <w:r>
-              <w:t>Heavy-duty indoor/outdoor tape</w:t>
+              <w:t>1-in. heavy-duty mounting tape (14x ~4-in. strips: 4 per long side, 3 per short side; TBD)</w:t>
             </w:r>
           </w:p>
         </w:tc>
@@ -2265,6 +2337,36 @@
           <w:p>
             <w:r>
               <w:t>Hardware supplier</w:t>
+            </w:r>
+          </w:p>
+        </w:tc>
+      </w:tr>
+      <w:tr>
+        <w:tc>
+          <w:p>
+            <w:r>
+              <w:t>Moving Blankets</w:t>
+            </w:r>
+          </w:p>
+        </w:tc>
+        <w:tc>
+          <w:p>
+            <w:r>
+              <w:t>Clean protective floor pads for scratch-free vinyl staging</w:t>
+            </w:r>
+          </w:p>
+        </w:tc>
+        <w:tc>
+          <w:p>
+            <w:r>
+              <w:t>3-4</w:t>
+            </w:r>
+          </w:p>
+        </w:tc>
+        <w:tc>
+          <w:p>
+            <w:r>
+              <w:t>Shop stock</w:t>
             </w:r>
           </w:p>
         </w:tc>
@@ -2735,7 +2837,7 @@
         <w:tc>
           <w:p>
             <w:r>
-              <w:t>1-5/8" snap clamps pack, heavy-duty carpet tape, pilot hardware</w:t>
+              <w:t>1-1/4" greenhouse snap clamps pack (14 pcs), 1" heavy-duty tape, pilot hardware</w:t>
             </w:r>
           </w:p>
         </w:tc>
@@ -3455,86 +3557,623 @@
     </w:p>
     <w:p>
       <w:pPr>
-        <w:spacing w:before="60" w:after="60"/>
-        <w:ind w:left="720" w:hanging="480"/>
-      </w:pPr>
+        <w:spacing w:before="120" w:after="160" w:line="276" w:lineRule="auto"/>
+        <w:shd w:val="clear" w:fill="FFF2CC"/>
+        <w:pBdr>
+          <w:top w:val="single" w:sz="6" w:space="6" w:color="D7DBE2"/>
+          <w:left w:val="single" w:sz="6" w:space="6" w:color="D7DBE2"/>
+          <w:bottom w:val="single" w:sz="6" w:space="6" w:color="D7DBE2"/>
+          <w:right w:val="single" w:sz="6" w:space="6" w:color="D7DBE2"/>
+        </w:pBdr>
+      </w:pPr>
+      <w:r>
+        <w:rPr>
+          <w:rFonts w:ascii="Calibri" w:hAnsi="Calibri"/>
+          <w:b/>
+          <w:color w:val="7A5A00"/>
+        </w:rPr>
+        <w:t xml:space="preserve">WORKING DRAFT — VINYL INSTALLATION PROCEDURE INCLUDED: </w:t>
+      </w:r>
+      <w:r>
+        <w:rPr>
+          <w:rFonts w:ascii="Calibri" w:hAnsi="Calibri"/>
+          <w:color w:val="7A5A00"/>
+        </w:rPr>
+        <w:t>Working draft procedure for vinyl installation using perimeter double-sided tape, hardware relief slits, and mechanical greenhouse snap clamps. Recommended vinyl dimensions (image size, bleed size, overall cut size) and tape strip quantities are provisional and subject to shop fit-up confirmation.</w:t>
+      </w:r>
+    </w:p>
+    <w:p>
+      <w:r>
+        <w:t>This section governs the preparation, alignment, dual-axis tensioning, relief slit cutting, and mechanical fastening of the custom printed vinyl coverings to completed backdrop upright frames. Installing vinyl on the 10 ft x 8 ft steel frame requires a clean staging area, careful bleed centering, razor relief cuts for protruding frame hardware, double-sided tape adhesion, and mechanical clamping with greenhouse snap clamps to prevent loosening under high stadium wind loads.</w:t>
+      </w:r>
+    </w:p>
+    <w:p>
+      <w:pPr>
+        <w:pStyle w:val="Heading2"/>
+        <w:keepNext/>
+      </w:pPr>
+      <w:r>
+        <w:t>Recommended Vinyl Dimensions &amp; Ordering Specifications</w:t>
+      </w:r>
+    </w:p>
+    <w:p>
+      <w:r>
+        <w:t>Custom printed backdrop banners must be ordered to exact dimensions to provide clean full-bleed framing around the outer perimeter of the steel pipe structure. The specifications below define the required production allowances:</w:t>
+      </w:r>
+    </w:p>
+    <w:tbl>
+      <w:tblPr>
+        <w:tblW w:w="9360" w:type="dxa"/>
+        <w:tblBorders>
+          <w:top w:val="single" w:sz="4" w:space="0" w:color="CCCCCC"/>
+          <w:left w:val="single" w:sz="4" w:space="0" w:color="CCCCCC"/>
+          <w:bottom w:val="single" w:sz="4" w:space="0" w:color="CCCCCC"/>
+          <w:right w:val="single" w:sz="4" w:space="0" w:color="CCCCCC"/>
+          <w:insideH w:val="single" w:sz="4" w:space="0" w:color="CCCCCC"/>
+          <w:insideV w:val="single" w:sz="4" w:space="0" w:color="CCCCCC"/>
+        </w:tblBorders>
+      </w:tblPr>
+      <w:tr>
+        <w:trPr>
+          <w:tblHeader/>
+        </w:trPr>
+        <w:tc>
+          <w:tcPr>
+            <w:tcW w:w="3600" w:type="dxa"/>
+            <w:shd w:val="clear" w:color="auto" w:fill="F5F5F5"/>
+          </w:tcPr>
+          <w:p>
+            <w:r>
+              <w:rPr>
+                <w:b/>
+                <w:sz w:val="18"/>
+              </w:rPr>
+              <w:t>Specification / Parameter</w:t>
+            </w:r>
+          </w:p>
+        </w:tc>
+        <w:tc>
+          <w:tcPr>
+            <w:tcW w:w="5760" w:type="dxa"/>
+            <w:shd w:val="clear" w:color="auto" w:fill="F5F5F5"/>
+          </w:tcPr>
+          <w:p>
+            <w:r>
+              <w:rPr>
+                <w:b/>
+                <w:sz w:val="18"/>
+              </w:rPr>
+              <w:t>Engineering Requirement / Dimension</w:t>
+            </w:r>
+          </w:p>
+        </w:tc>
+      </w:tr>
+      <w:tr>
+        <w:tc>
+          <w:tcPr>
+            <w:tcW w:w="3600" w:type="dxa"/>
+          </w:tcPr>
+          <w:p>
+            <w:r>
+              <w:rPr>
+                <w:b/>
+                <w:sz w:val="18"/>
+              </w:rPr>
+              <w:t>Nominal Upright Frame Size</w:t>
+            </w:r>
+          </w:p>
+        </w:tc>
+        <w:tc>
+          <w:tcPr>
+            <w:tcW w:w="5760" w:type="dxa"/>
+          </w:tcPr>
+          <w:p>
+            <w:r>
+              <w:rPr>
+                <w:sz w:val="18"/>
+              </w:rPr>
+              <w:t>8 ft Width × 10 ft Height (96.0 in. × 120.0 in. outer pipe perimeter)</w:t>
+            </w:r>
+          </w:p>
+        </w:tc>
+      </w:tr>
+      <w:tr>
+        <w:tc>
+          <w:tcPr>
+            <w:tcW w:w="3600" w:type="dxa"/>
+          </w:tcPr>
+          <w:p>
+            <w:r>
+              <w:rPr>
+                <w:b/>
+                <w:sz w:val="18"/>
+              </w:rPr>
+              <w:t>Visible Graphic / Live Face</w:t>
+            </w:r>
+          </w:p>
+        </w:tc>
+        <w:tc>
+          <w:tcPr>
+            <w:tcW w:w="5760" w:type="dxa"/>
+          </w:tcPr>
+          <w:p>
+            <w:r>
+              <w:rPr>
+                <w:sz w:val="18"/>
+              </w:rPr>
+              <w:t>[TBD] in. Width × [TBD] in. Height (Front visible image area)</w:t>
+            </w:r>
+          </w:p>
+        </w:tc>
+      </w:tr>
+      <w:tr>
+        <w:tc>
+          <w:tcPr>
+            <w:tcW w:w="3600" w:type="dxa"/>
+          </w:tcPr>
+          <w:p>
+            <w:r>
+              <w:rPr>
+                <w:b/>
+                <w:sz w:val="18"/>
+              </w:rPr>
+              <w:t>Perimeter Bleed Wrap Allowance</w:t>
+            </w:r>
+          </w:p>
+        </w:tc>
+        <w:tc>
+          <w:tcPr>
+            <w:tcW w:w="5760" w:type="dxa"/>
+          </w:tcPr>
+          <w:p>
+            <w:r>
+              <w:rPr>
+                <w:sz w:val="18"/>
+              </w:rPr>
+              <w:t>[TBD] in. per border (top, bottom, left, and right outer pipe wrap)</w:t>
+            </w:r>
+          </w:p>
+        </w:tc>
+      </w:tr>
+      <w:tr>
+        <w:tc>
+          <w:tcPr>
+            <w:tcW w:w="3600" w:type="dxa"/>
+          </w:tcPr>
+          <w:p>
+            <w:r>
+              <w:rPr>
+                <w:b/>
+                <w:sz w:val="18"/>
+              </w:rPr>
+              <w:t>Overall Flat Cut Size</w:t>
+            </w:r>
+          </w:p>
+        </w:tc>
+        <w:tc>
+          <w:tcPr>
+            <w:tcW w:w="5760" w:type="dxa"/>
+          </w:tcPr>
+          <w:p>
+            <w:r>
+              <w:rPr>
+                <w:sz w:val="18"/>
+              </w:rPr>
+              <w:t>[TBD] in. Width × [TBD] in. Height (Including bleed allowance)</w:t>
+            </w:r>
+          </w:p>
+        </w:tc>
+      </w:tr>
+      <w:tr>
+        <w:tc>
+          <w:tcPr>
+            <w:tcW w:w="3600" w:type="dxa"/>
+          </w:tcPr>
+          <w:p>
+            <w:r>
+              <w:rPr>
+                <w:b/>
+                <w:sz w:val="18"/>
+              </w:rPr>
+              <w:t>Substrate Material</w:t>
+            </w:r>
+          </w:p>
+        </w:tc>
+        <w:tc>
+          <w:tcPr>
+            <w:tcW w:w="5760" w:type="dxa"/>
+          </w:tcPr>
+          <w:p>
+            <w:r>
+              <w:rPr>
+                <w:sz w:val="18"/>
+              </w:rPr>
+              <w:t>13 oz or 18 oz heavy-duty outdoor matte scrim vinyl (UV and tear resistant)</w:t>
+            </w:r>
+          </w:p>
+        </w:tc>
+      </w:tr>
+      <w:tr>
+        <w:tc>
+          <w:tcPr>
+            <w:tcW w:w="3600" w:type="dxa"/>
+          </w:tcPr>
+          <w:p>
+            <w:r>
+              <w:rPr>
+                <w:b/>
+                <w:sz w:val="18"/>
+              </w:rPr>
+              <w:t>Edge Perimeter Finish</w:t>
+            </w:r>
+          </w:p>
+        </w:tc>
+        <w:tc>
+          <w:tcPr>
+            <w:tcW w:w="5760" w:type="dxa"/>
+          </w:tcPr>
+          <w:p>
+            <w:r>
+              <w:rPr>
+                <w:sz w:val="18"/>
+              </w:rPr>
+              <w:t>Square raw-cut perimeter; DO NOT order hemmed borders or brass grommets, as raw edges wrap smoothly under snap clamps.</w:t>
+            </w:r>
+          </w:p>
+        </w:tc>
+      </w:tr>
+    </w:tbl>
+    <w:p>
+      <w:pPr>
+        <w:pStyle w:val="Heading2"/>
+        <w:keepNext/>
+      </w:pPr>
+      <w:r>
+        <w:t>Required Materials &amp; Fastening Hardware</w:t>
+      </w:r>
+    </w:p>
+    <w:p>
       <w:r>
         <w:rPr>
           <w:b/>
         </w:rPr>
-        <w:t xml:space="preserve">1.  </w:t>
-      </w:r>
+        <w:t xml:space="preserve">• Moving blankets: </w:t>
+      </w:r>
+      <w:r>
+        <w:t>Three to four clean, heavy-duty moving blankets or carpet runners spread across the shop floor to cushion the printed vinyl face against dust, grit, and concrete abrasion.</w:t>
+      </w:r>
+    </w:p>
+    <w:p>
       <w:r>
         <w:rPr>
           <w:b/>
         </w:rPr>
-        <w:t xml:space="preserve">Surface Prep: </w:t>
-      </w:r>
-      <w:r>
-        <w:t xml:space="preserve">Clean the front face of all perimeter 1-5/8 in. steel pipes with isopropyl alcohol.</w:t>
+        <w:t xml:space="preserve">• Custom vinyl banner: </w:t>
+      </w:r>
+      <w:r>
+        <w:t>One custom printed outdoor banner per backdrop (nominal 8 ft x 10 ft), rolled with print side facing inward. Unroll and inspect for print flaws and correct orientation prior to assembly.</w:t>
       </w:r>
     </w:p>
     <w:p>
-      <w:pPr>
-        <w:spacing w:before="60" w:after="60"/>
-        <w:ind w:left="720" w:hanging="480"/>
-      </w:pPr>
       <w:r>
         <w:rPr>
           <w:b/>
         </w:rPr>
-        <w:t xml:space="preserve">2.  </w:t>
-      </w:r>
+        <w:t xml:space="preserve">• Utility knife / razor: </w:t>
+      </w:r>
+      <w:r>
+        <w:t>Fresh, sharp razor knife for cutting precision relief slits around mounting brackets and tension bands.</w:t>
+      </w:r>
+    </w:p>
+    <w:p>
       <w:r>
         <w:rPr>
           <w:b/>
         </w:rPr>
-        <w:t xml:space="preserve">Carpet Tape: </w:t>
-      </w:r>
-      <w:r>
-        <w:t xml:space="preserve">Apply heavy-duty double-sided indoor/outdoor carpet tape along the front contact edges of the top rail, bottom rail, and vertical uprights.</w:t>
+        <w:t xml:space="preserve">• Double-sided tape: </w:t>
+      </w:r>
+      <w:r>
+        <w:t>1-in. wide heavy-duty outdoor mounting tape (Appendix B Table 1). Cut into fourteen (14) strips of approximately 4-in. length (~56 linear inches per frame). Application schedule: 4 strips on each vertical upright rail (8 total) and 3 strips on each cross rail (6 total). Tape quantities are provisional (TBD) and will be validated during build testing.</w:t>
       </w:r>
     </w:p>
     <w:p>
-      <w:pPr>
-        <w:spacing w:before="60" w:after="60"/>
-        <w:ind w:left="720" w:hanging="480"/>
-      </w:pPr>
       <w:r>
         <w:rPr>
           <w:b/>
         </w:rPr>
-        <w:t xml:space="preserve">3.  </w:t>
-      </w:r>
+        <w:t xml:space="preserve">• Greenhouse snap clamps: </w:t>
+      </w:r>
+      <w:r>
+        <w:t>Fourteen (14) 1-1/4 in. greenhouse clamp clips (Appendix B Index [8]). Snapped directly over the wrapped vinyl at every tape location (4 along each long vertical rail, 3 along each short cross rail). Note: While the frame uses 1-5/8 in. outer diameter fence post tubing, 1-1/4 in. greenhouse clamp clips provide the proper snug snap fit over the tubing, vinyl, and tape.</w:t>
+      </w:r>
+    </w:p>
+    <w:p>
       <w:r>
         <w:rPr>
           <w:b/>
         </w:rPr>
-        <w:t xml:space="preserve">Banner Alignment: </w:t>
-      </w:r>
-      <w:r>
-        <w:t xml:space="preserve">Stretch the 10 ft x 8 ft vinyl banner across the frame, pressing firmly into the carpet tape from the center outwards to eliminate wrinkles (Figure 6).</w:t>
+        <w:t xml:space="preserve">• Surface preparation (Optional): </w:t>
+      </w:r>
+      <w:r>
+        <w:t>Isopropyl alcohol (IPA) and clean microfiber cloth. Degreasing the steel pipe is completely optional—the heavy-duty tape combined with mechanical greenhouse snap clamps provides more than enough holding power. A weaker initial adhesive bond to the bare steel pipe is actually preferable, as it significantly simplifies tape removal and cleanup later.</w:t>
       </w:r>
     </w:p>
     <w:p>
-      <w:pPr>
-        <w:spacing w:before="60" w:after="60"/>
-        <w:ind w:left="720" w:hanging="480"/>
-      </w:pPr>
       <w:r>
         <w:rPr>
           <w:b/>
         </w:rPr>
-        <w:t xml:space="preserve">4.  </w:t>
-      </w:r>
+        <w:t xml:space="preserve">• Personnel requirement: </w:t>
+      </w:r>
+      <w:r>
+        <w:t>Minimum two operators required; three to four recommended for synchronized dual-operator transverse tensioning and safe frame lifting.</w:t>
+      </w:r>
+    </w:p>
+    <w:p>
+      <w:pPr>
+        <w:pStyle w:val="Heading2"/>
+        <w:keepNext/>
+      </w:pPr>
+      <w:r>
+        <w:t>Step-by-Step Vinyl Installation Procedure</w:t>
+      </w:r>
+    </w:p>
+    <w:p>
+      <w:pPr>
+        <w:pStyle w:val="Heading3"/>
+        <w:keepNext/>
+      </w:pPr>
+      <w:r>
+        <w:t>Step 1: Staging and Surface Protection</w:t>
+      </w:r>
+    </w:p>
+    <w:p>
+      <w:r>
+        <w:t>Clear an unobstructed shop workspace measuring at least 12 ft x 14 ft. Thoroughly sweep and vacuum the area to remove metal chips, drill burrs, or grit that could puncture or scratch the printed vinyl face.</w:t>
+      </w:r>
+    </w:p>
+    <w:p>
+      <w:r>
+        <w:t>Lay clean moving blankets flat across the floor, overlapping edges to create a continuous, cushioned staging area larger than the overall banner flat cut size.</w:t>
+      </w:r>
+    </w:p>
+    <w:p>
+      <w:r>
+        <w:t>Carefully unroll the custom vinyl banner and lay it completely face down directly onto the moving blankets. Smooth the banner flat by hand and inspect the back side to confirm it is clean and free of trapped debris.</w:t>
+      </w:r>
+    </w:p>
+    <w:p>
+      <w:pPr>
+        <w:pStyle w:val="Heading3"/>
+        <w:keepNext/>
+      </w:pPr>
+      <w:r>
+        <w:t>Step 2: Frame Placement and Bleed Alignment</w:t>
+      </w:r>
+    </w:p>
+    <w:p>
+      <w:r>
+        <w:t>With two operators lifting opposite ends, carry the assembled 10 ft x 8 ft steel upright frame onto the staging area and place it face down centered over the back side of the vinyl banner.</w:t>
+      </w:r>
+    </w:p>
+    <w:p>
+      <w:r>
+        <w:t>Measure the bleed wrap margin extending beyond the outer edge of the steel tubing along all four perimeter borders. Shift the frame incrementally until an equal reveal of bleed extends evenly on all four sides (top, bottom, left, and right outer rails).</w:t>
+      </w:r>
+    </w:p>
+    <w:p>
+      <w:r>
+        <w:t>Verify frame squareness by measuring crossed diagonals prior to applying tape or making relief cuts.</w:t>
+      </w:r>
+    </w:p>
+    <w:p>
+      <w:pPr>
+        <w:pStyle w:val="Heading3"/>
+        <w:keepNext/>
+      </w:pPr>
+      <w:r>
+        <w:t>Step 3: Hardware Relief Slits</w:t>
+      </w:r>
+    </w:p>
+    <w:p>
+      <w:r>
+        <w:t>Before adhering tape or wrapping vinyl, use a fresh, sharp utility razor knife to make small, neat relief slits in the vinyl bleed wrap allowance to accommodate protruding frame hardware:</w:t>
+      </w:r>
+    </w:p>
+    <w:p>
       <w:r>
         <w:rPr>
           <w:b/>
         </w:rPr>
-        <w:t xml:space="preserve">Mechanical Snap Clamping: </w:t>
-      </w:r>
-      <w:r>
-        <w:t xml:space="preserve">Snap 1-5/8 in. pipe snap clamps (Index [8]) directly over the vinyl at every taped contact location (spaced 12–16 inches apart). The snap clamps mechanically lock the banner against dynamic wind shear.</w:t>
+        <w:t xml:space="preserve">• Long edges (Vertical Uprights): </w:t>
+      </w:r>
+      <w:r>
+        <w:t>Cut small slits directly aligned with the diagonal support strut attachment brackets (tension bands) on the left and right upright rails. These slits allow the strut brackets to protrude through the bleed wrap cleanly, preventing unsightly puckering, tenting, or bunching of the visible banner face.</w:t>
+      </w:r>
+    </w:p>
+    <w:p>
+      <w:r>
+        <w:rPr>
+          <w:b/>
+        </w:rPr>
+        <w:t xml:space="preserve">• Bottom edge (Cart-Mounting Interface): </w:t>
+      </w:r>
+      <w:r>
+        <w:t>Cut two small relief slits along the bottom rail bleed wrap corresponding to the base tension bands and mounting brackets that secure the upright frame to the wood cart base.</w:t>
+      </w:r>
+    </w:p>
+    <w:p>
+      <w:pPr>
+        <w:pStyle w:val="Heading3"/>
+        <w:keepNext/>
+      </w:pPr>
+      <w:r>
+        <w:t>Step 4: Perimeter Double-Sided Tape Application</w:t>
+      </w:r>
+    </w:p>
+    <w:p>
+      <w:r>
+        <w:t>Cut fourteen (14) strips of 1-in. heavy-duty double-sided tape, each approximately 4 inches in length.</w:t>
+      </w:r>
+    </w:p>
+    <w:p>
+      <w:r>
+        <w:t>Apply the tape strips to the rear-facing surface of the perimeter steel fence post tubing according to the following layout:</w:t>
+      </w:r>
+    </w:p>
+    <w:p>
+      <w:r>
+        <w:rPr>
+          <w:b/>
+        </w:rPr>
+        <w:t xml:space="preserve">• Long rails (Left and Right 10-ft Vertical Uprights): </w:t>
+      </w:r>
+      <w:r>
+        <w:t>Apply 4 strips along each upright (8 total). Crucially, position two of the strips immediately above and below the support strut bracket to anchor the vinyl around the bracket interface, and place two additional strips spaced along the remaining length of each upright.</w:t>
+      </w:r>
+    </w:p>
+    <w:p>
+      <w:r>
+        <w:rPr>
+          <w:b/>
+        </w:rPr>
+        <w:t xml:space="preserve">• Short end rails (Top and Bottom 8-ft Cross Rails): </w:t>
+      </w:r>
+      <w:r>
+        <w:t>Apply 3 strips evenly spaced along each rail (one centered and two approximately 6 inches inward from the corner brackets; 6 strips total).</w:t>
+      </w:r>
+    </w:p>
+    <w:p>
+      <w:r>
+        <w:t>Burnish each tape strip firmly onto the steel pipe surface, then peel and discard the protective release liners from all 14 strips.</w:t>
+      </w:r>
+    </w:p>
+    <w:p>
+      <w:pPr>
+        <w:pStyle w:val="Heading3"/>
+        <w:keepNext/>
+      </w:pPr>
+      <w:r>
+        <w:t>Step 5: Long-Side Tensioning and Initial Wrap</w:t>
+      </w:r>
+    </w:p>
+    <w:p>
+      <w:r>
+        <w:t>Start along one designated long side (left vertical upright). Beginning at the support strut bracket, ease the bracket through its pre-cut relief slit, fold the vinyl bleed margin tightly around the steel pipe, and press it firmly into the 4 double-sided tape strips on the rear of the tube.</w:t>
+      </w:r>
+    </w:p>
+    <w:p>
+      <w:r>
+        <w:t>Move to the opposing long side (right vertical upright). Pull the vinyl firmly across the frame face to eliminate all slack and wrinkles. Ease the second support strut bracket through its relief slit, fold the vinyl edge tightly around the steel pipe, and press it securely into the 4 opposing tape strips.</w:t>
+      </w:r>
+    </w:p>
+    <w:p>
+      <w:r>
+        <w:t>Sight down the front face: confirm that longitudinal tension is smooth, uniform, and drum-tight, with no diagonal wrinkling or wave patterns.</w:t>
+      </w:r>
+    </w:p>
+    <w:p>
+      <w:pPr>
+        <w:pStyle w:val="Heading3"/>
+        <w:keepNext/>
+      </w:pPr>
+      <w:r>
+        <w:t>Step 6: Short-Side Dual-Operator Tensioning and Wrap</w:t>
+      </w:r>
+    </w:p>
+    <w:p>
+      <w:r>
+        <w:t>Station operators at opposite short ends (top cross rail and bottom cross rail).</w:t>
+      </w:r>
+    </w:p>
+    <w:p>
+      <w:r>
+        <w:t>Working simultaneously, both operators firmly grasp the vinyl bleed margin on opposite ends and pull outward in opposing directions away from the center. This synchronized outward pull establishes balanced transverse tension across the entire frame without racking the structure out of square.</w:t>
+      </w:r>
+    </w:p>
+    <w:p>
+      <w:r>
+        <w:t>While maintaining continuous outward tension, wrap the top vinyl edge over the top cross rail and press into the 3 tape strips. At the bottom rail, guide the cart-mounting base brackets through their two pre-cut relief slits, wrap the vinyl edge tightly around the bottom pipe, and press into the 3 bottom tape strips.</w:t>
+      </w:r>
+    </w:p>
+    <w:p>
+      <w:r>
+        <w:t>Neatly fold excess vinyl corner tabs around the 3-way corner elbow brackets, flattening the material to maintain clean, square corners without bulky bunches.</w:t>
+      </w:r>
+    </w:p>
+    <w:p>
+      <w:pPr>
+        <w:pStyle w:val="Heading3"/>
+        <w:keepNext/>
+      </w:pPr>
+      <w:r>
+        <w:t>Step 7: Greenhouse Snap Clamp Installation</w:t>
+      </w:r>
+    </w:p>
+    <w:p>
+      <w:r>
+        <w:t>Install the 1-1/4 in. greenhouse snap clamps directly over the wrapped vinyl at every tape location, pressing each clamp firmly over the pipe until it snaps into full mechanical lock:</w:t>
+      </w:r>
+    </w:p>
+    <w:p>
+      <w:r>
+        <w:rPr>
+          <w:b/>
+        </w:rPr>
+        <w:t xml:space="preserve">• Long rails (Vertical Uprights): </w:t>
+      </w:r>
+      <w:r>
+        <w:t>Install 4 snap clamps on each upright (8 clamps total). Crucially, position two of the snap clamps immediately above and below each support strut bracket to firmly sandwich and hold the bracket in place, preventing bracket slip, flutter, or vinyl detachment under wind loads.</w:t>
+      </w:r>
+    </w:p>
+    <w:p>
+      <w:r>
+        <w:rPr>
+          <w:b/>
+        </w:rPr>
+        <w:t xml:space="preserve">• Short end rails (Top and Bottom Cross Rails): </w:t>
+      </w:r>
+      <w:r>
+        <w:t>Install 3 snap clamps on the top rail and 3 snap clamps on the bottom rail (6 clamps total).</w:t>
+      </w:r>
+    </w:p>
+    <w:p>
+      <w:r>
+        <w:t>The 1-1/4 in. greenhouse snap clamps compress the vinyl tightly against the tape and 1-5/8 in. steel fence post tubing, providing heavy-duty mechanical clamping that prevents edge detachment under stadium wind gusts or rough transport handling.</w:t>
+      </w:r>
+    </w:p>
+    <w:p>
+      <w:r>
+        <w:t>Confirm that no snap clamp interferes with the cart-mounting base brackets or corner elbow clamp bolts.</w:t>
+      </w:r>
+    </w:p>
+    <w:p>
+      <w:pPr>
+        <w:pStyle w:val="Heading3"/>
+        <w:keepNext/>
+      </w:pPr>
+      <w:r>
+        <w:t>Step 8: Final Tension Inspection and Frame Re-Mounting</w:t>
+      </w:r>
+    </w:p>
+    <w:p>
+      <w:r>
+        <w:t>With three to four operators, carefully lift the completed backdrop frame upright off the moving blankets.</w:t>
+      </w:r>
+    </w:p>
+    <w:p>
+      <w:r>
+        <w:t>Inspect the front vinyl face in bright lighting: verify that the graphic is drum-tight, square, free of wrinkles or sagging, and cleanly fitted around all protruding bracket slits.</w:t>
+      </w:r>
+    </w:p>
+    <w:p>
+      <w:r>
+        <w:t>Verify that all 14 greenhouse snap clamps are fully seated and firmly gripping the tubing over each tape strip.</w:t>
+      </w:r>
+    </w:p>
+    <w:p>
+      <w:r>
+        <w:t>Re-secure the vertical upright posts into the cart base tension bands and re-connect the diagonal support struts. Confirm that the wrapped vinyl and snap clamps do not bind or impede strut attachment.</w:t>
       </w:r>
     </w:p>
     <w:p>
@@ -3593,6 +4232,102 @@
     <w:p>
       <w:pPr>
         <w:pStyle w:val="Heading2"/>
+        <w:keepNext/>
+      </w:pPr>
+      <w:r>
+        <w:t>Vinyl Removal &amp; End-of-Season Teardown Protocol</w:t>
+      </w:r>
+    </w:p>
+    <w:p>
+      <w:pPr>
+        <w:spacing w:before="80" w:after="160" w:line="276" w:lineRule="auto"/>
+        <w:shd w:val="clear" w:fill="FFF4CE"/>
+        <w:pBdr>
+          <w:top w:val="single" w:sz="6" w:space="6" w:color="D7DBE2"/>
+          <w:left w:val="single" w:sz="6" w:space="6" w:color="D7DBE2"/>
+          <w:bottom w:val="single" w:sz="6" w:space="6" w:color="D7DBE2"/>
+          <w:right w:val="single" w:sz="6" w:space="6" w:color="D7DBE2"/>
+        </w:pBdr>
+      </w:pPr>
+      <w:r>
+        <w:rPr>
+          <w:rFonts w:ascii="Calibri" w:hAnsi="Calibri"/>
+          <w:b/>
+          <w:color w:val="C00000"/>
+        </w:rPr>
+        <w:t xml:space="preserve">CAUTION — Temperature Requirement for Vinyl Removal: </w:t>
+      </w:r>
+      <w:r>
+        <w:rPr>
+          <w:rFonts w:ascii="Calibri" w:hAnsi="Calibri"/>
+          <w:color w:val="333333"/>
+        </w:rPr>
+        <w:t>Do not attempt removal of the vinyl or adhesive tape unless the ambient temperature is above 80°F (27°C). Attempting to peel the vinyl at lower temperatures will cause the material to tear and permanently damage the custom banner face. In cooler weather, warm the shop or gently heat the taped perimeter with a heat gun on low before peeling.</w:t>
+      </w:r>
+    </w:p>
+    <w:p>
+      <w:r>
+        <w:t>When taking down backdrops or preparing frames for graphic replacement:</w:t>
+      </w:r>
+    </w:p>
+    <w:p>
+      <w:r>
+        <w:rPr>
+          <w:b/>
+        </w:rPr>
+        <w:t xml:space="preserve">• Recommended timing (Defer to Band Camp): </w:t>
+      </w:r>
+      <w:r>
+        <w:t>It is usually much easier to leave the vinyl on the frames over the winter and wait until summer band camp of the following season before attempting removal. Cold late-fall temperatures following competition season make adhesive stiff and brittle, drastically increasing tear risk.</w:t>
+      </w:r>
+    </w:p>
+    <w:p>
+      <w:r>
+        <w:rPr>
+          <w:b/>
+        </w:rPr>
+        <w:t xml:space="preserve">• Solar heating advantage: </w:t>
+      </w:r>
+      <w:r>
+        <w:t>The warmer it is outside, the better. Staging the backdrops outdoors in direct sunlight for just a few minutes prior to peeling warms the steel tubing and softens the tape adhesive, allowing the vinyl and tape to release cleanly and effortlessly with minimal pull resistance.</w:t>
+      </w:r>
+    </w:p>
+    <w:p>
+      <w:r>
+        <w:rPr>
+          <w:b/>
+        </w:rPr>
+        <w:t xml:space="preserve">• Remove greenhouse snap clamps: </w:t>
+      </w:r>
+      <w:r>
+        <w:t>Carefully pry off all 14 greenhouse snap clamps from the perimeter tubing.</w:t>
+      </w:r>
+    </w:p>
+    <w:p>
+      <w:r>
+        <w:rPr>
+          <w:b/>
+        </w:rPr>
+        <w:t xml:space="preserve">• Peel slowly at shallow angle: </w:t>
+      </w:r>
+      <w:r>
+        <w:t>Starting at one corner, slowly peel the vinyl wrap back at a shallow angle. Warm adhesive releases cleanly from the bare steel pipe without pulling the scrim or ink layer.</w:t>
+      </w:r>
+    </w:p>
+    <w:p>
+      <w:r>
+        <w:rPr>
+          <w:b/>
+        </w:rPr>
+        <w:t xml:space="preserve">• Tape stripping &amp; cleanup: </w:t>
+      </w:r>
+      <w:r>
+        <w:t>Peel remaining tape strips from the steel pipe. Because the pipe was not aggressively degreased during initial assembly, tape strips will pull off cleanly with minimal adhesive residue.</w:t>
+      </w:r>
+    </w:p>
+    <w:p>
+      <w:pPr>
+        <w:pStyle w:val="Heading2"/>
         <w:pageBreakBefore/>
       </w:pPr>
       <w:r>
@@ -3948,7 +4683,7 @@
         <w:pStyle w:val="IndexSourceEntry"/>
       </w:pPr>
       <w:r>
-        <w:t xml:space="preserve">[8] 1-5/8 in. Pipe Snap Clamps - Amazon</w:t>
+        <w:t xml:space="preserve">[8] Greenhouse snap clamps (1-1/4 in.) - Amazon</w:t>
       </w:r>
     </w:p>
     <w:p>
@@ -4197,7 +4932,7 @@
         <w:sz w:val="17"/>
         <w:color w:val="777777"/>
       </w:rPr>
-      <w:t>Release v0 (unreleased) — Development build D1</w:t>
+      <w:t>Release v0 (unreleased) — Development build D2</w:t>
     </w:r>
     <w:r>
       <w:tab/>
@@ -4229,7 +4964,7 @@
         <w:sz w:val="17"/>
         <w:color w:val="777777"/>
       </w:rPr>
-      <w:t>Release v0 (unreleased) — Development build D1</w:t>
+      <w:t>Release v0 (unreleased) — Development build D2</w:t>
     </w:r>
     <w:r>
       <w:tab/>
@@ -4261,7 +4996,7 @@
         <w:sz w:val="17"/>
         <w:color w:val="777777"/>
       </w:rPr>
-      <w:t>Release v0 (unreleased) — Development build D1</w:t>
+      <w:t>Release v0 (unreleased) — Development build D2</w:t>
     </w:r>
     <w:r>
       <w:tab/>
@@ -4293,7 +5028,7 @@
         <w:sz w:val="17"/>
         <w:color w:val="777777"/>
       </w:rPr>
-      <w:t>Release v0 (unreleased) — Development build D1</w:t>
+      <w:t>Release v0 (unreleased) — Development build D2</w:t>
     </w:r>
     <w:r>
       <w:tab/>
@@ -4325,7 +5060,7 @@
         <w:sz w:val="17"/>
         <w:color w:val="777777"/>
       </w:rPr>
-      <w:t>Release v0 (unreleased) — Development build D1</w:t>
+      <w:t>Release v0 (unreleased) — Development build D2</w:t>
     </w:r>
     <w:r>
       <w:tab/>
@@ -4357,7 +5092,7 @@
         <w:sz w:val="17"/>
         <w:color w:val="777777"/>
       </w:rPr>
-      <w:t>Release v0 (unreleased) — Development build D1</w:t>
+      <w:t>Release v0 (unreleased) — Development build D2</w:t>
     </w:r>
     <w:r>
       <w:tab/>
@@ -4389,7 +5124,7 @@
         <w:sz w:val="17"/>
         <w:color w:val="777777"/>
       </w:rPr>
-      <w:t>Release v0 (unreleased) — Development build D1</w:t>
+      <w:t>Release v0 (unreleased) — Development build D2</w:t>
     </w:r>
     <w:r>
       <w:tab/>
@@ -4421,7 +5156,7 @@
         <w:sz w:val="17"/>
         <w:color w:val="777777"/>
       </w:rPr>
-      <w:t>Release v0 (unreleased) — Development build D1</w:t>
+      <w:t>Release v0 (unreleased) — Development build D2</w:t>
     </w:r>
     <w:r>
       <w:tab/>

</xml_diff>

<commit_message>
feat(pchsmb): add wind loading analysis, relief slit specs, and tiered ballast schedule to Backdrop D3
- Incorporate engineering wind loading analysis and critical forward-tipping asymmetry model
- Add Step 3.1 to Appendix B Vinyl Installation detailing 6-flap inverted-U crescent wind relief slits
- Mandate 3/8-in. (10 mm) round tear-arrest hole punches at flap corners to prevent banner tears
- Standardize on 15-lb double-bagged handle sandbags for normal and high-wind deployments
- Detail rear-rail ballast leverage optimization providing 2x overturning resistance up to 22.5 mph
- Retain 70-lb Sakrete traction tube sand strictly as an emergency reserve
- Add Tiered Ballasting & Wind Speed Schedule table and strict >20 mph / >25 mph gust abort criteria
- Render updated 37-page companion PDF via Microsoft Word AppleScript pipeline
- Add D3 build record, manifest updates, QA audit and package diff reports
</commit_message>
<xml_diff>
--- a/PCHSMB/_Backdrop/docs/Backdrop_Assembly_Guide.docx
+++ b/PCHSMB/_Backdrop/docs/Backdrop_Assembly_Guide.docx
@@ -1,6 +1,6 @@
 
 <file path=word/document.xml><?xml version="1.0" encoding="utf-8"?>
-<w:document xmlns:w="http://schemas.openxmlformats.org/wordprocessingml/2006/main" xmlns:r="http://schemas.openxmlformats.org/officeDocument/2006/relationships" xmlns:wp="http://schemas.openxmlformats.org/drawingml/2006/wordprocessingDrawing" xmlns:a="http://schemas.openxmlformats.org/drawingml/2006/main" xmlns:pic="http://schemas.openxmlformats.org/drawingml/2006/picture">
+<w:document xmlns:ns1="http://schemas.openxmlformats.org/drawingml/2006/wordprocessingDrawing" xmlns:ns2="http://schemas.openxmlformats.org/drawingml/2006/main" xmlns:ns3="http://schemas.openxmlformats.org/drawingml/2006/picture" xmlns:r="http://schemas.openxmlformats.org/officeDocument/2006/relationships" xmlns:w="http://schemas.openxmlformats.org/wordprocessingml/2006/main">
   <w:body>
     <w:p>
       <w:pPr>
@@ -196,6 +196,48 @@
           </w:p>
         </w:tc>
       </w:tr>
+      <w:tr>
+        <w:tc>
+          <w:p>
+            <w:r>
+              <w:rPr>
+                <w:sz w:val="18"/>
+              </w:rPr>
+              <w:t>Release v0 (unreleased) — Development build D3</w:t>
+            </w:r>
+          </w:p>
+        </w:tc>
+        <w:tc>
+          <w:p>
+            <w:r>
+              <w:rPr>
+                <w:sz w:val="18"/>
+              </w:rPr>
+              <w:t>2026-09-10</w:t>
+            </w:r>
+          </w:p>
+        </w:tc>
+        <w:tc>
+          <w:p>
+            <w:r>
+              <w:rPr>
+                <w:sz w:val="18"/>
+              </w:rPr>
+              <w:t>WORKING DRAFT — NOT FOR USE</w:t>
+            </w:r>
+          </w:p>
+        </w:tc>
+        <w:tc>
+          <w:p>
+            <w:r>
+              <w:rPr>
+                <w:sz w:val="18"/>
+              </w:rPr>
+              <w:t>Add engineered wind relief slit specifications, tiered 15-lb handle sandbag ballast schedule, rear-rail leverage optimization, and high-wind emergency protocol</w:t>
+            </w:r>
+          </w:p>
+        </w:tc>
+      </w:tr>
     </w:tbl>
     <w:p>
       <w:pPr>
@@ -222,39 +264,39 @@
       </w:pPr>
       <w:r>
         <w:drawing>
-          <wp:inline distT="0" distB="0" distL="0" distR="0">
-            <wp:extent cx="5486400" cy="3086100"/>
-            <wp:effectExtent l="0" t="0" r="0" b="0"/>
-            <wp:docPr id="2" name="Figure 2" descr="High-angle stadium view of multiple rolling backdrops deployed along 10 to 50 yard lines during marching band performance setup."/>
-            <wp:cNvGraphicFramePr>
-              <a:graphicFrameLocks xmlns:a="http://schemas.openxmlformats.org/drawingml/2006/main" noChangeAspect="1"/>
-            </wp:cNvGraphicFramePr>
-            <a:graphic xmlns:a="http://schemas.openxmlformats.org/drawingml/2006/main">
-              <a:graphicData uri="http://schemas.openxmlformats.org/drawingml/2006/picture">
-                <pic:pic xmlns:pic="http://schemas.openxmlformats.org/drawingml/2006/picture">
-                  <pic:nvPicPr>
-                    <pic:cNvPr id="0" name="Figure 2"/>
-                    <pic:cNvPicPr/>
-                  </pic:nvPicPr>
-                  <pic:blipFill>
-                    <a:blip r:embed="rId20"/>
-                    <a:stretch>
-                      <a:fillRect/>
-                    </a:stretch>
-                  </pic:blipFill>
-                  <pic:spPr>
-                    <a:xfrm>
-                      <a:off x="0" y="0"/>
-                      <a:ext cx="5486400" cy="3086100"/>
-                    </a:xfrm>
-                    <a:prstGeom prst="rect">
-                      <a:avLst/>
-                    </a:prstGeom>
-                  </pic:spPr>
-                </pic:pic>
-              </a:graphicData>
-            </a:graphic>
-          </wp:inline>
+          <ns1:inline distT="0" distB="0" distL="0" distR="0">
+            <ns1:extent cx="5486400" cy="3086100"/>
+            <ns1:effectExtent l="0" t="0" r="0" b="0"/>
+            <ns1:docPr id="2" name="Figure 2" descr="High-angle stadium view of multiple rolling backdrops deployed along 10 to 50 yard lines during marching band performance setup."/>
+            <ns1:cNvGraphicFramePr>
+              <ns2:graphicFrameLocks noChangeAspect="1"/>
+            </ns1:cNvGraphicFramePr>
+            <ns2:graphic>
+              <ns2:graphicData uri="http://schemas.openxmlformats.org/drawingml/2006/picture">
+                <ns3:pic>
+                  <ns3:nvPicPr>
+                    <ns3:cNvPr id="0" name="Figure 2"/>
+                    <ns3:cNvPicPr/>
+                  </ns3:nvPicPr>
+                  <ns3:blipFill>
+                    <ns2:blip r:embed="rId20"/>
+                    <ns2:stretch>
+                      <ns2:fillRect/>
+                    </ns2:stretch>
+                  </ns3:blipFill>
+                  <ns3:spPr>
+                    <ns2:xfrm>
+                      <ns2:off x="0" y="0"/>
+                      <ns2:ext cx="5486400" cy="3086100"/>
+                    </ns2:xfrm>
+                    <ns2:prstGeom prst="rect">
+                      <ns2:avLst/>
+                    </ns2:prstGeom>
+                  </ns3:spPr>
+                </ns3:pic>
+              </ns2:graphicData>
+            </ns2:graphic>
+          </ns1:inline>
         </w:drawing>
       </w:r>
     </w:p>
@@ -414,7 +456,7 @@
         <w:t xml:space="preserve">Parent revision: </w:t>
       </w:r>
       <w:r>
-        <w:t xml:space="preserve">Release v0 (unreleased) | Development build D2 | September 10, 2026</w:t>
+        <w:t xml:space="preserve">Release v0 (unreleased) | Development build D3 | September 10, 2026</w:t>
       </w:r>
     </w:p>
     <w:p>
@@ -635,39 +677,39 @@
       </w:pPr>
       <w:r>
         <w:drawing>
-          <wp:inline distT="0" distB="0" distL="0" distR="0">
-            <wp:extent cx="5486400" cy="3086100"/>
-            <wp:effectExtent l="0" t="0" r="0" b="0"/>
-            <wp:docPr id="3" name="Figure 3" descr="Close-up view of assembled rolling backdrop props with printed vinyl banners and diagonal support struts staged in stadium entrance area."/>
-            <wp:cNvGraphicFramePr>
-              <a:graphicFrameLocks xmlns:a="http://schemas.openxmlformats.org/drawingml/2006/main" noChangeAspect="1"/>
-            </wp:cNvGraphicFramePr>
-            <a:graphic xmlns:a="http://schemas.openxmlformats.org/drawingml/2006/main">
-              <a:graphicData uri="http://schemas.openxmlformats.org/drawingml/2006/picture">
-                <pic:pic xmlns:pic="http://schemas.openxmlformats.org/drawingml/2006/picture">
-                  <pic:nvPicPr>
-                    <pic:cNvPr id="0" name="Figure 3"/>
-                    <pic:cNvPicPr/>
-                  </pic:nvPicPr>
-                  <pic:blipFill>
-                    <a:blip r:embed="rId21"/>
-                    <a:stretch>
-                      <a:fillRect/>
-                    </a:stretch>
-                  </pic:blipFill>
-                  <pic:spPr>
-                    <a:xfrm>
-                      <a:off x="0" y="0"/>
-                      <a:ext cx="5486400" cy="3086100"/>
-                    </a:xfrm>
-                    <a:prstGeom prst="rect">
-                      <a:avLst/>
-                    </a:prstGeom>
-                  </pic:spPr>
-                </pic:pic>
-              </a:graphicData>
-            </a:graphic>
-          </wp:inline>
+          <ns1:inline distT="0" distB="0" distL="0" distR="0">
+            <ns1:extent cx="5486400" cy="3086100"/>
+            <ns1:effectExtent l="0" t="0" r="0" b="0"/>
+            <ns1:docPr id="3" name="Figure 3" descr="Close-up view of assembled rolling backdrop props with printed vinyl banners and diagonal support struts staged in stadium entrance area."/>
+            <ns1:cNvGraphicFramePr>
+              <ns2:graphicFrameLocks noChangeAspect="1"/>
+            </ns1:cNvGraphicFramePr>
+            <ns2:graphic>
+              <ns2:graphicData uri="http://schemas.openxmlformats.org/drawingml/2006/picture">
+                <ns3:pic>
+                  <ns3:nvPicPr>
+                    <ns3:cNvPr id="0" name="Figure 3"/>
+                    <ns3:cNvPicPr/>
+                  </ns3:nvPicPr>
+                  <ns3:blipFill>
+                    <ns2:blip r:embed="rId21"/>
+                    <ns2:stretch>
+                      <ns2:fillRect/>
+                    </ns2:stretch>
+                  </ns3:blipFill>
+                  <ns3:spPr>
+                    <ns2:xfrm>
+                      <ns2:off x="0" y="0"/>
+                      <ns2:ext cx="5486400" cy="3086100"/>
+                    </ns2:xfrm>
+                    <ns2:prstGeom prst="rect">
+                      <ns2:avLst/>
+                    </ns2:prstGeom>
+                  </ns3:spPr>
+                </ns3:pic>
+              </ns2:graphicData>
+            </ns2:graphic>
+          </ns1:inline>
         </w:drawing>
       </w:r>
     </w:p>
@@ -892,24 +934,419 @@
         <w:rPr>
           <w:b/>
         </w:rPr>
-        <w:t xml:space="preserve">High Wind Emergency Response: </w:t>
-      </w:r>
-      <w:r>
-        <w:t xml:space="preserve">If sustained winds exceed 20 mph or sudden gusts threaten prop stability during a performance, student handlers maintain firm contact on the wooden base with all brakes locked. Parent pit crew members stationed along the sideline with Field Pass wristbands will step onto the field to provide perimeter stabilization as directed by band directors.</w:t>
+        <w:t xml:space="preserve">High Wind Emergency Response &amp; Abort Protocol: </w:t>
+      </w:r>
+      <w:r>
+        <w:t xml:space="preserve">If sustained winds exceed 20 mph or sudden gusts exceed 25 mph, rolling backdrops MUST NOT enter the performance field (strict safety NO-GO threshold). If severe gusts strike while props are already on the field, student handlers must immediately lock all four caster brakes, position themselves on the upwind side of the cart, and brace the lower 2x4 framing. At no time should students attempt to hold backdrops from the upper steel pipe rails or climb the frame. Designated parent volunteers with Field Pass wristbands (Rule 9.07) will step onto the field to provide perimeter stabilization or assist handlers in immediately tipping the props flat onto the turf if ordered by band directors.</w:t>
       </w:r>
     </w:p>
     <w:p>
       <w:pPr>
         <w:pStyle w:val="Heading2"/>
-        <w:pageBreakBefore/>
-      </w:pPr>
-      <w:r>
-        <w:t xml:space="preserve">1.4 Ballasting System, Wing Retention Posts, and Double-Bagging Protocol</w:t>
+      </w:pPr>
+      <w:r>
+        <w:t>1.4 Ballasting System, Tiered Wind Schedule, and Double-Bagging Protocol</w:t>
       </w:r>
     </w:p>
     <w:p>
       <w:r>
-        <w:t xml:space="preserve">To maintain vertical stability against outdoor wind shear while protecting stadium athletic turf, follow this exact ballasting standard:</w:t>
+        <w:t>To maintain vertical stability against outdoor wind shear while strictly protecting stadium athletic turf from rutting and sand contamination, all backdrop props must adhere to this engineering ballasting standard and operational loading schedule.</w:t>
+      </w:r>
+    </w:p>
+    <w:p>
+      <w:pPr>
+        <w:pStyle w:val="Heading3"/>
+        <w:keepNext/>
+      </w:pPr>
+      <w:r>
+        <w:t>A. Standardized Tiered Ballasting &amp; Wind Speed Schedule</w:t>
+      </w:r>
+    </w:p>
+    <w:p>
+      <w:r>
+        <w:t>Ballasting requirements are scaled dynamically based on observed stadium wind velocity and peak gust forecasts prior to field gate ingress:</w:t>
+      </w:r>
+    </w:p>
+    <w:tbl>
+      <w:tblPr>
+        <w:tblW w:w="9360" w:type="dxa"/>
+        <w:tblBorders>
+          <w:top w:val="single" w:sz="4" w:space="0" w:color="CCCCCC"/>
+          <w:left w:val="single" w:sz="4" w:space="0" w:color="CCCCCC"/>
+          <w:bottom w:val="single" w:sz="4" w:space="0" w:color="CCCCCC"/>
+          <w:right w:val="single" w:sz="4" w:space="0" w:color="CCCCCC"/>
+          <w:insideH w:val="single" w:sz="4" w:space="0" w:color="CCCCCC"/>
+          <w:insideV w:val="single" w:sz="4" w:space="0" w:color="CCCCCC"/>
+        </w:tblBorders>
+      </w:tblPr>
+      <w:tr>
+        <w:trPr>
+          <w:tblHeader/>
+        </w:trPr>
+        <w:tc>
+          <w:tcPr>
+            <w:tcW w:w="1400" w:type="dxa"/>
+            <w:shd w:val="clear" w:color="auto" w:fill="EAEAEA"/>
+          </w:tcPr>
+          <w:p>
+            <w:r>
+              <w:rPr>
+                <w:b/>
+                <w:sz w:val="18"/>
+              </w:rPr>
+              <w:t>Tier / State</w:t>
+            </w:r>
+          </w:p>
+        </w:tc>
+        <w:tc>
+          <w:tcPr>
+            <w:tcW w:w="1400" w:type="dxa"/>
+            <w:shd w:val="clear" w:color="auto" w:fill="EAEAEA"/>
+          </w:tcPr>
+          <w:p>
+            <w:r>
+              <w:rPr>
+                <w:b/>
+                <w:sz w:val="18"/>
+              </w:rPr>
+              <w:t>Wind Velocity</w:t>
+            </w:r>
+          </w:p>
+        </w:tc>
+        <w:tc>
+          <w:tcPr>
+            <w:tcW w:w="1700" w:type="dxa"/>
+            <w:shd w:val="clear" w:color="auto" w:fill="EAEAEA"/>
+          </w:tcPr>
+          <w:p>
+            <w:r>
+              <w:rPr>
+                <w:b/>
+                <w:sz w:val="18"/>
+              </w:rPr>
+              <w:t>Wing Posts (3/4" Pipe)</w:t>
+            </w:r>
+          </w:p>
+        </w:tc>
+        <w:tc>
+          <w:tcPr>
+            <w:tcW w:w="1500" w:type="dxa"/>
+            <w:shd w:val="clear" w:color="auto" w:fill="EAEAEA"/>
+          </w:tcPr>
+          <w:p>
+            <w:r>
+              <w:rPr>
+                <w:b/>
+                <w:sz w:val="18"/>
+              </w:rPr>
+              <w:t>Rear Rail (2x4 A)</w:t>
+            </w:r>
+          </w:p>
+        </w:tc>
+        <w:tc>
+          <w:tcPr>
+            <w:tcW w:w="1160" w:type="dxa"/>
+            <w:shd w:val="clear" w:color="auto" w:fill="EAEAEA"/>
+          </w:tcPr>
+          <w:p>
+            <w:r>
+              <w:rPr>
+                <w:b/>
+                <w:sz w:val="18"/>
+              </w:rPr>
+              <w:t>Total Ballast</w:t>
+            </w:r>
+          </w:p>
+        </w:tc>
+        <w:tc>
+          <w:tcPr>
+            <w:tcW w:w="2200" w:type="dxa"/>
+            <w:shd w:val="clear" w:color="auto" w:fill="EAEAEA"/>
+          </w:tcPr>
+          <w:p>
+            <w:r>
+              <w:rPr>
+                <w:b/>
+                <w:sz w:val="18"/>
+              </w:rPr>
+              <w:t>Max Safe Gust &amp; Protocol</w:t>
+            </w:r>
+          </w:p>
+        </w:tc>
+      </w:tr>
+      <w:tr>
+        <w:tc>
+          <w:tcPr>
+            <w:tcW w:w="1400" w:type="dxa"/>
+          </w:tcPr>
+          <w:p>
+            <w:r>
+              <w:rPr>
+                <w:b/>
+              </w:rPr>
+              <w:t>Tier 1: Normal</w:t>
+            </w:r>
+          </w:p>
+        </w:tc>
+        <w:tc>
+          <w:tcPr>
+            <w:tcW w:w="1400" w:type="dxa"/>
+          </w:tcPr>
+          <w:p>
+            <w:r>
+              <w:t>Calm to light breeze (0–12 mph)</w:t>
+            </w:r>
+          </w:p>
+        </w:tc>
+        <w:tc>
+          <w:tcPr>
+            <w:tcW w:w="1700" w:type="dxa"/>
+          </w:tcPr>
+          <w:p>
+            <w:r>
+              <w:t>4x 15-lb bags (2 per wing post; 30 lb/side)</w:t>
+            </w:r>
+          </w:p>
+        </w:tc>
+        <w:tc>
+          <w:tcPr>
+            <w:tcW w:w="1500" w:type="dxa"/>
+          </w:tcPr>
+          <w:p>
+            <w:r>
+              <w:t>None</w:t>
+            </w:r>
+          </w:p>
+        </w:tc>
+        <w:tc>
+          <w:tcPr>
+            <w:tcW w:w="1160" w:type="dxa"/>
+          </w:tcPr>
+          <w:p>
+            <w:r>
+              <w:t>60 lbs (213 lb total)</w:t>
+            </w:r>
+          </w:p>
+        </w:tc>
+        <w:tc>
+          <w:tcPr>
+            <w:tcW w:w="2200" w:type="dxa"/>
+          </w:tcPr>
+          <w:p>
+            <w:r>
+              <w:t>16.9 mph max gust. Standard operations; zero turf compaction.</w:t>
+            </w:r>
+          </w:p>
+        </w:tc>
+      </w:tr>
+      <w:tr>
+        <w:tc>
+          <w:tcPr>
+            <w:tcW w:w="1400" w:type="dxa"/>
+          </w:tcPr>
+          <w:p>
+            <w:r>
+              <w:rPr>
+                <w:b/>
+              </w:rPr>
+              <w:t>Tier 2: Advisory</w:t>
+            </w:r>
+          </w:p>
+        </w:tc>
+        <w:tc>
+          <w:tcPr>
+            <w:tcW w:w="1400" w:type="dxa"/>
+          </w:tcPr>
+          <w:p>
+            <w:r>
+              <w:t>Moderate breeze (12–18 mph)</w:t>
+            </w:r>
+          </w:p>
+        </w:tc>
+        <w:tc>
+          <w:tcPr>
+            <w:tcW w:w="1700" w:type="dxa"/>
+          </w:tcPr>
+          <w:p>
+            <w:r>
+              <w:t>6x 15-lb bags (3 per wing post; 45 lb/side)</w:t>
+            </w:r>
+          </w:p>
+        </w:tc>
+        <w:tc>
+          <w:tcPr>
+            <w:tcW w:w="1500" w:type="dxa"/>
+          </w:tcPr>
+          <w:p>
+            <w:r>
+              <w:t>None</w:t>
+            </w:r>
+          </w:p>
+        </w:tc>
+        <w:tc>
+          <w:tcPr>
+            <w:tcW w:w="1160" w:type="dxa"/>
+          </w:tcPr>
+          <w:p>
+            <w:r>
+              <w:t>90 lbs (243 lb total)</w:t>
+            </w:r>
+          </w:p>
+        </w:tc>
+        <w:tc>
+          <w:tcPr>
+            <w:tcW w:w="2200" w:type="dxa"/>
+          </w:tcPr>
+          <w:p>
+            <w:r>
+              <w:t>18.4 mph max gust. Handlers verify all 4 caster locks on field.</w:t>
+            </w:r>
+          </w:p>
+        </w:tc>
+      </w:tr>
+      <w:tr>
+        <w:tc>
+          <w:tcPr>
+            <w:tcW w:w="1400" w:type="dxa"/>
+          </w:tcPr>
+          <w:p>
+            <w:r>
+              <w:rPr>
+                <w:b/>
+              </w:rPr>
+              <w:t>Tier 3: High-Wind</w:t>
+            </w:r>
+          </w:p>
+        </w:tc>
+        <w:tc>
+          <w:tcPr>
+            <w:tcW w:w="1400" w:type="dxa"/>
+          </w:tcPr>
+          <w:p>
+            <w:r>
+              <w:t>High wind advisory (18–22 mph)</w:t>
+            </w:r>
+          </w:p>
+        </w:tc>
+        <w:tc>
+          <w:tcPr>
+            <w:tcW w:w="1700" w:type="dxa"/>
+          </w:tcPr>
+          <w:p>
+            <w:r>
+              <w:t>6x 15-lb bags (3 per wing post; 45 lb/side)</w:t>
+            </w:r>
+          </w:p>
+        </w:tc>
+        <w:tc>
+          <w:tcPr>
+            <w:tcW w:w="1500" w:type="dxa"/>
+          </w:tcPr>
+          <w:p>
+            <w:r>
+              <w:t>3x 15-lb bags laid flat along rear rail A</w:t>
+            </w:r>
+          </w:p>
+        </w:tc>
+        <w:tc>
+          <w:tcPr>
+            <w:tcW w:w="1160" w:type="dxa"/>
+          </w:tcPr>
+          <w:p>
+            <w:r>
+              <w:t>135 lbs (288 lb total)</w:t>
+            </w:r>
+          </w:p>
+        </w:tc>
+        <w:tc>
+          <w:tcPr>
+            <w:tcW w:w="2200" w:type="dxa"/>
+          </w:tcPr>
+          <w:p>
+            <w:r>
+              <w:t>22.5 mph max gust. Symmetrical stability; max safe turf limit.</w:t>
+            </w:r>
+          </w:p>
+        </w:tc>
+      </w:tr>
+      <w:tr>
+        <w:tc>
+          <w:tcPr>
+            <w:tcW w:w="1400" w:type="dxa"/>
+          </w:tcPr>
+          <w:p>
+            <w:r>
+              <w:rPr>
+                <w:b/>
+              </w:rPr>
+              <w:t>Tier 4: Safety Abort</w:t>
+            </w:r>
+          </w:p>
+        </w:tc>
+        <w:tc>
+          <w:tcPr>
+            <w:tcW w:w="1400" w:type="dxa"/>
+          </w:tcPr>
+          <w:p>
+            <w:r>
+              <w:t>Severe gale (&gt;20 mph sustained / &gt;25 mph gusts)</w:t>
+            </w:r>
+          </w:p>
+        </w:tc>
+        <w:tc>
+          <w:tcPr>
+            <w:tcW w:w="1700" w:type="dxa"/>
+          </w:tcPr>
+          <w:p>
+            <w:r>
+              <w:t>—</w:t>
+            </w:r>
+          </w:p>
+        </w:tc>
+        <w:tc>
+          <w:tcPr>
+            <w:tcW w:w="1500" w:type="dxa"/>
+          </w:tcPr>
+          <w:p>
+            <w:r>
+              <w:t>—</w:t>
+            </w:r>
+          </w:p>
+        </w:tc>
+        <w:tc>
+          <w:tcPr>
+            <w:tcW w:w="1160" w:type="dxa"/>
+          </w:tcPr>
+          <w:p>
+            <w:r>
+              <w:t>—</w:t>
+            </w:r>
+          </w:p>
+        </w:tc>
+        <w:tc>
+          <w:tcPr>
+            <w:tcW w:w="2200" w:type="dxa"/>
+          </w:tcPr>
+          <w:p>
+            <w:r>
+              <w:t>UNSAFE. Field withdrawal / NO-GO. Props kept off field or laid flat.</w:t>
+            </w:r>
+          </w:p>
+        </w:tc>
+      </w:tr>
+    </w:tbl>
+    <w:p>
+      <w:pPr>
+        <w:pStyle w:val="Heading3"/>
+        <w:keepNext/>
+      </w:pPr>
+      <w:r>
+        <w:t>B. High-Wind Rear-Rail Ballast Leverage Optimization</w:t>
+      </w:r>
+    </w:p>
+    <w:p>
+      <w:r>
+        <w:t>Because the 10 ft x 8 ft vertical upright steel frame sits on the front perimeter rail (A) of the cart base, the structure possesses an inherent tipping asymmetry:</w:t>
       </w:r>
     </w:p>
     <w:p>
@@ -927,10 +1364,10 @@
         <w:rPr>
           <w:b/>
         </w:rPr>
-        <w:t xml:space="preserve">Vertical Ballast Retention Posts: </w:t>
-      </w:r>
-      <w:r>
-        <w:t xml:space="preserve">Each cart is equipped with two vertical 3/4-in. black iron pipe posts (18 inches tall) screwed into floor flanges through-bolted to the center of the left and right 1/2" plywood decking wings (see Appendix B, Stage 2).</w:t>
+        <w:t xml:space="preserve">Critical Failure Mode (Forward Tipping): </w:t>
+      </w:r>
+      <w:r>
+        <w:t xml:space="preserve">When wind blows from the rear toward the front, the cart pivots about the front caster wheels. Because the 48-lb steel frame and vinyl banner sit directly above the front caster line, their deadweight provides zero restoring leverage. As a result, an unballasted prop tips forward at just 12.4 mph (11.2 mph at sea level).</w:t>
       </w:r>
     </w:p>
     <w:p>
@@ -948,10 +1385,10 @@
         <w:rPr>
           <w:b/>
         </w:rPr>
-        <w:t xml:space="preserve">Primary Ballast Standard (4–6 Bags, 60–90 lbs): </w:t>
-      </w:r>
-      <w:r>
-        <w:t xml:space="preserve">Standard ballasting uses 4 to 6 15-lb heavy-duty sandbags with sewn-in handles (Index [13]). Stack 2 to 3 sandbags on the left wing and 2 to 3 sandbags on the right wing, looping the handles securely over the 3/4" vertical iron pipe posts. The vertical posts prevent sandbags from shifting, sliding off, or falling during cart movement or high winds.</w:t>
+        <w:t xml:space="preserve">The Rear-Rail Mechanical Advantage: </w:t>
+      </w:r>
+      <w:r>
+        <w:t xml:space="preserve">The 3/4-in. wing pipe posts sit at mid-depth (22.25 in. from front), providing a restoring lever arm of 1.71 ft to the front casters. By contrast, placing supplemental sandbags along the rear 2x4 framing rail (A) behind the instrument tote increases the lever arm to 3.46 ft (41.5 in.)—more than double the mechanical leverage! Three 15-lb bags placed across the rear rail produce the overturning resistance of six bags stacked on the center posts, equalizing forward and backward tipping thresholds to 22.5 mph.</w:t>
       </w:r>
     </w:p>
     <w:p>
@@ -969,43 +1406,53 @@
         <w:rPr>
           <w:b/>
         </w:rPr>
-        <w:t xml:space="preserve">Mandatory Double-Bagging (Rule 8.05): </w:t>
-      </w:r>
-      <w:r>
-        <w:t xml:space="preserve">All 15-lb sandbags MUST utilize heavy-duty inner plastic liner insert bags (Index [14]) sealed securely inside the outer fabric sandbags. This dual-layer containment strictly satisfies the mandatory CBA competition anti-leakage rule.</w:t>
+        <w:t xml:space="preserve">Turf Compaction Ceiling: </w:t>
+      </w:r>
+      <w:r>
+        <w:t xml:space="preserve">Total supplemental ballast must never exceed 140 lbs (293 lbs total prop deadweight). Concentrating more than ~75 lbs per caster wheel causes casters to sink into artificial turf rubber infill, multiplying rolling drag and risking permanent turf depressions or track damage.</w:t>
       </w:r>
     </w:p>
     <w:p>
       <w:pPr>
-        <w:spacing w:before="60" w:after="60"/>
-        <w:ind w:left="720" w:hanging="480"/>
+        <w:pStyle w:val="Heading3"/>
+        <w:keepNext/>
+      </w:pPr>
+      <w:r>
+        <w:t>C. Mandatory Double-Bagging Protocol (CBA Rule 8.05)</w:t>
+      </w:r>
+    </w:p>
+    <w:p>
+      <w:r>
+        <w:t>All 15-lb sandbags MUST utilize heavy-duty inner plastic liner insert bags (Index [14]) sealed securely inside the outer fabric cordura bags. Under no circumstances may unbagged or single-layer sandbags be brought onto any competition turf. If an outer fabric bag abrades, splits, or suffers seam failure, the heavy-duty inner liner guarantees zero sand escapes onto the performance field.</w:t>
+      </w:r>
+    </w:p>
+    <w:p>
+      <w:pPr>
+        <w:pStyle w:val="Heading3"/>
+        <w:keepNext/>
+      </w:pPr>
+      <w:r>
+        <w:t>D. Emergency Reserve Protocol (70-lb Tube Sand)</w:t>
+      </w:r>
+    </w:p>
+    <w:p>
+      <w:r>
+        <w:t>In the event that 15-lb handle sandbags are depleted or extreme wind gusts threaten during stationary staging, crew may deploy 1 to 2 70-lb Sakrete traction tube sand bags (Index [15]) positioned flat across the rear lumber framing rail. MANDATORY: Every 70-lb tube sandbag MUST be completely wrapped and sealed inside a thick contractor-grade garbage bag to satisfy the secondary containment rule before entering the stadium.</w:t>
+      </w:r>
+    </w:p>
+    <w:p>
+      <w:pPr>
+        <w:pStyle w:val="WarningCallout"/>
       </w:pPr>
       <w:r>
         <w:rPr>
           <w:b/>
-        </w:rPr>
-        <w:t xml:space="preserve">4.  </w:t>
-      </w:r>
-      <w:r>
-        <w:rPr>
-          <w:b/>
-        </w:rPr>
-        <w:t xml:space="preserve">High-Wind Reserve Ballast (70-lb Tube Sand): </w:t>
-      </w:r>
-      <w:r>
-        <w:t xml:space="preserve">On severe high-wind days (sustained winds &gt;15–20 mph), crew may add one or two 70-lb Sakrete traction tube sand bags (Index [15]) placed across the lower center frame joists. MANDATORY: Every 70-lb tube sandbag MUST be completely wrapped and sealed inside a thick contractor-grade garbage bag to satisfy the secondary containment rule before entering the stadium.</w:t>
-      </w:r>
-    </w:p>
-    <w:p>
-      <w:r>
-        <w:rPr>
-          <w:b/>
-          <w:color w:val="B42814"/>
+          <w:color w:val="C00000"/>
         </w:rPr>
         <w:t xml:space="preserve">CRITICAL TURF OPERATION &amp; DOUBLE-BAGGING WARNING: </w:t>
       </w:r>
       <w:r>
-        <w:t xml:space="preserve">Under no circumstances may unbagged or single-layer sandbags be brought onto any competition turf (see Section 1.5, Rule 8.05). In addition, do not exceed 100–140 lbs total ballast under normal conditions, as excessive weight causes casters to sink into artificial turf rubber infill, multiplying rolling friction and making carts sluggish for student handlers.</w:t>
+        <w:t xml:space="preserve">Under no circumstances may unbagged or single-layer sandbags be brought onto any competition turf (see Section 1.5, Rule 8.05). In addition, do not exceed 135–140 lbs total ballast under any operational conditions, as excessive weight causes casters to sink into artificial turf rubber infill, multiplying rolling friction and making carts sluggish for student handlers.</w:t>
       </w:r>
     </w:p>
     <w:p>
@@ -1392,39 +1839,39 @@
       </w:pPr>
       <w:r>
         <w:drawing>
-          <wp:inline distT="0" distB="0" distL="0" distR="0">
-            <wp:extent cx="5486400" cy="3086100"/>
-            <wp:effectExtent l="0" t="0" r="0" b="0"/>
-            <wp:docPr id="4" name="Figure 4" descr="Equipment trailer interior showing wooden backdrop cart bases secured vertically against the front nose wall with heavy-duty E-track ratchet straps."/>
-            <wp:cNvGraphicFramePr>
-              <a:graphicFrameLocks xmlns:a="http://schemas.openxmlformats.org/drawingml/2006/main" noChangeAspect="1"/>
-            </wp:cNvGraphicFramePr>
-            <a:graphic xmlns:a="http://schemas.openxmlformats.org/drawingml/2006/main">
-              <a:graphicData uri="http://schemas.openxmlformats.org/drawingml/2006/picture">
-                <pic:pic xmlns:pic="http://schemas.openxmlformats.org/drawingml/2006/picture">
-                  <pic:nvPicPr>
-                    <pic:cNvPr id="0" name="Figure 4"/>
-                    <pic:cNvPicPr/>
-                  </pic:nvPicPr>
-                  <pic:blipFill>
-                    <a:blip r:embed="rId22"/>
-                    <a:stretch>
-                      <a:fillRect/>
-                    </a:stretch>
-                  </pic:blipFill>
-                  <pic:spPr>
-                    <a:xfrm>
-                      <a:off x="0" y="0"/>
-                      <a:ext cx="5486400" cy="3086100"/>
-                    </a:xfrm>
-                    <a:prstGeom prst="rect">
-                      <a:avLst/>
-                    </a:prstGeom>
-                  </pic:spPr>
-                </pic:pic>
-              </a:graphicData>
-            </a:graphic>
-          </wp:inline>
+          <ns1:inline distT="0" distB="0" distL="0" distR="0">
+            <ns1:extent cx="5486400" cy="3086100"/>
+            <ns1:effectExtent l="0" t="0" r="0" b="0"/>
+            <ns1:docPr id="4" name="Figure 4" descr="Equipment trailer interior showing wooden backdrop cart bases secured vertically against the front nose wall with heavy-duty E-track ratchet straps."/>
+            <ns1:cNvGraphicFramePr>
+              <ns2:graphicFrameLocks noChangeAspect="1"/>
+            </ns1:cNvGraphicFramePr>
+            <ns2:graphic>
+              <ns2:graphicData uri="http://schemas.openxmlformats.org/drawingml/2006/picture">
+                <ns3:pic>
+                  <ns3:nvPicPr>
+                    <ns3:cNvPr id="0" name="Figure 4"/>
+                    <ns3:cNvPicPr/>
+                  </ns3:nvPicPr>
+                  <ns3:blipFill>
+                    <ns2:blip r:embed="rId22"/>
+                    <ns2:stretch>
+                      <ns2:fillRect/>
+                    </ns2:stretch>
+                  </ns3:blipFill>
+                  <ns3:spPr>
+                    <ns2:xfrm>
+                      <ns2:off x="0" y="0"/>
+                      <ns2:ext cx="5486400" cy="3086100"/>
+                    </ns2:xfrm>
+                    <ns2:prstGeom prst="rect">
+                      <ns2:avLst/>
+                    </ns2:prstGeom>
+                  </ns3:spPr>
+                </ns3:pic>
+              </ns2:graphicData>
+            </ns2:graphic>
+          </ns1:inline>
         </w:drawing>
       </w:r>
     </w:p>
@@ -1445,39 +1892,39 @@
       </w:pPr>
       <w:r>
         <w:drawing>
-          <wp:inline distT="0" distB="0" distL="0" distR="0">
-            <wp:extent cx="5486400" cy="3086100"/>
-            <wp:effectExtent l="0" t="0" r="0" b="0"/>
-            <wp:docPr id="5" name="Figure 5" descr="Stack of completed steel pipe frames with vinyl banners attached and pipe snap clamps holding edges during transit."/>
-            <wp:cNvGraphicFramePr>
-              <a:graphicFrameLocks xmlns:a="http://schemas.openxmlformats.org/drawingml/2006/main" noChangeAspect="1"/>
-            </wp:cNvGraphicFramePr>
-            <a:graphic xmlns:a="http://schemas.openxmlformats.org/drawingml/2006/main">
-              <a:graphicData uri="http://schemas.openxmlformats.org/drawingml/2006/picture">
-                <pic:pic xmlns:pic="http://schemas.openxmlformats.org/drawingml/2006/picture">
-                  <pic:nvPicPr>
-                    <pic:cNvPr id="0" name="Figure 5"/>
-                    <pic:cNvPicPr/>
-                  </pic:nvPicPr>
-                  <pic:blipFill>
-                    <a:blip r:embed="rId23"/>
-                    <a:stretch>
-                      <a:fillRect/>
-                    </a:stretch>
-                  </pic:blipFill>
-                  <pic:spPr>
-                    <a:xfrm>
-                      <a:off x="0" y="0"/>
-                      <a:ext cx="5486400" cy="3086100"/>
-                    </a:xfrm>
-                    <a:prstGeom prst="rect">
-                      <a:avLst/>
-                    </a:prstGeom>
-                  </pic:spPr>
-                </pic:pic>
-              </a:graphicData>
-            </a:graphic>
-          </wp:inline>
+          <ns1:inline distT="0" distB="0" distL="0" distR="0">
+            <ns1:extent cx="5486400" cy="3086100"/>
+            <ns1:effectExtent l="0" t="0" r="0" b="0"/>
+            <ns1:docPr id="5" name="Figure 5" descr="Stack of completed steel pipe frames with vinyl banners attached and pipe snap clamps holding edges during transit."/>
+            <ns1:cNvGraphicFramePr>
+              <ns2:graphicFrameLocks noChangeAspect="1"/>
+            </ns1:cNvGraphicFramePr>
+            <ns2:graphic>
+              <ns2:graphicData uri="http://schemas.openxmlformats.org/drawingml/2006/picture">
+                <ns3:pic>
+                  <ns3:nvPicPr>
+                    <ns3:cNvPr id="0" name="Figure 5"/>
+                    <ns3:cNvPicPr/>
+                  </ns3:nvPicPr>
+                  <ns3:blipFill>
+                    <ns2:blip r:embed="rId23"/>
+                    <ns2:stretch>
+                      <ns2:fillRect/>
+                    </ns2:stretch>
+                  </ns3:blipFill>
+                  <ns3:spPr>
+                    <ns2:xfrm>
+                      <ns2:off x="0" y="0"/>
+                      <ns2:ext cx="5486400" cy="3086100"/>
+                    </ns2:xfrm>
+                    <ns2:prstGeom prst="rect">
+                      <ns2:avLst/>
+                    </ns2:prstGeom>
+                  </ns3:spPr>
+                </ns3:pic>
+              </ns2:graphicData>
+            </ns2:graphic>
+          </ns1:inline>
         </w:drawing>
       </w:r>
     </w:p>
@@ -1585,7 +2032,7 @@
         <w:t xml:space="preserve">Parent revision: </w:t>
       </w:r>
       <w:r>
-        <w:t xml:space="preserve">Release v0 (unreleased) | Development build D2 | September 10, 2026</w:t>
+        <w:t xml:space="preserve">Release v0 (unreleased) | Development build D3 | September 10, 2026</w:t>
       </w:r>
     </w:p>
     <w:p>
@@ -2179,7 +2626,7 @@
         <w:tc>
           <w:p>
             <w:r>
-              <w:t>4–6 pcs</w:t>
+              <w:t>4–9 pcs (4–6 wing, 3 rear rail)</w:t>
             </w:r>
           </w:p>
         </w:tc>
@@ -2209,7 +2656,7 @@
         <w:tc>
           <w:p>
             <w:r>
-              <w:t>4–6 pcs</w:t>
+              <w:t>4–9 pcs (Double-Bag Compliance)</w:t>
             </w:r>
           </w:p>
         </w:tc>
@@ -2232,7 +2679,7 @@
         <w:tc>
           <w:p>
             <w:r>
-              <w:t>Sakrete 70-lb Traction Tube Sand + Contractor Bags</w:t>
+              <w:t>Sakrete 70-lb Traction Tube Sand + Contractor Bags (emergency reserve only)</w:t>
             </w:r>
           </w:p>
         </w:tc>
@@ -2367,6 +2814,36 @@
           <w:p>
             <w:r>
               <w:t>Shop stock</w:t>
+            </w:r>
+          </w:p>
+        </w:tc>
+      </w:tr>
+      <w:tr>
+        <w:tc>
+          <w:p>
+            <w:r>
+              <w:t>Relief Hole Punch Tool</w:t>
+            </w:r>
+          </w:p>
+        </w:tc>
+        <w:tc>
+          <w:p>
+            <w:r>
+              <w:t>3/8-in. (10 mm) Rotary Leather Punch / Gasket Hole Punch</w:t>
+            </w:r>
+          </w:p>
+        </w:tc>
+        <w:tc>
+          <w:p>
+            <w:r>
+              <w:t>1 pc</w:t>
+            </w:r>
+          </w:p>
+        </w:tc>
+        <w:tc>
+          <w:p>
+            <w:r>
+              <w:t>Workshop stock</w:t>
             </w:r>
           </w:p>
         </w:tc>
@@ -2914,39 +3391,39 @@
       </w:pPr>
       <w:r>
         <w:drawing>
-          <wp:inline distT="0" distB="0" distL="0" distR="0">
-            <wp:extent cx="5850000" cy="2750000"/>
-            <wp:effectExtent l="0" t="0" r="0" b="0"/>
-            <wp:docPr id="1" name="Figure 1" descr="Top-down 2x4 rolling cart frame layout showing outer rails A, end rails B, inner rails C, and six cross joists D with red and blue screw fastening markers."/>
-            <wp:cNvGraphicFramePr>
-              <a:graphicFrameLocks xmlns:a="http://schemas.openxmlformats.org/drawingml/2006/main" noChangeAspect="1"/>
-            </wp:cNvGraphicFramePr>
-            <a:graphic xmlns:a="http://schemas.openxmlformats.org/drawingml/2006/main">
-              <a:graphicData uri="http://schemas.openxmlformats.org/drawingml/2006/picture">
-                <pic:pic xmlns:pic="http://schemas.openxmlformats.org/drawingml/2006/picture">
-                  <pic:nvPicPr>
-                    <pic:cNvPr id="0" name="Figure 1"/>
-                    <pic:cNvPicPr/>
-                  </pic:nvPicPr>
-                  <pic:blipFill>
-                    <a:blip r:embed="rId5"/>
-                    <a:stretch>
-                      <a:fillRect/>
-                    </a:stretch>
-                  </pic:blipFill>
-                  <pic:spPr>
-                    <a:xfrm>
-                      <a:off x="0" y="0"/>
-                      <a:ext cx="5850000" cy="2750000"/>
-                    </a:xfrm>
-                    <a:prstGeom prst="rect">
-                      <a:avLst/>
-                    </a:prstGeom>
-                  </pic:spPr>
-                </pic:pic>
-              </a:graphicData>
-            </a:graphic>
-          </wp:inline>
+          <ns1:inline distT="0" distB="0" distL="0" distR="0">
+            <ns1:extent cx="5850000" cy="2750000"/>
+            <ns1:effectExtent l="0" t="0" r="0" b="0"/>
+            <ns1:docPr id="1" name="Figure 1" descr="Top-down 2x4 rolling cart frame layout showing outer rails A, end rails B, inner rails C, and six cross joists D with red and blue screw fastening markers."/>
+            <ns1:cNvGraphicFramePr>
+              <ns2:graphicFrameLocks noChangeAspect="1"/>
+            </ns1:cNvGraphicFramePr>
+            <ns2:graphic>
+              <ns2:graphicData uri="http://schemas.openxmlformats.org/drawingml/2006/picture">
+                <ns3:pic>
+                  <ns3:nvPicPr>
+                    <ns3:cNvPr id="0" name="Figure 1"/>
+                    <ns3:cNvPicPr/>
+                  </ns3:nvPicPr>
+                  <ns3:blipFill>
+                    <ns2:blip r:embed="rId5"/>
+                    <ns2:stretch>
+                      <ns2:fillRect/>
+                    </ns2:stretch>
+                  </ns3:blipFill>
+                  <ns3:spPr>
+                    <ns2:xfrm>
+                      <ns2:off x="0" y="0"/>
+                      <ns2:ext cx="5850000" cy="2750000"/>
+                    </ns2:xfrm>
+                    <ns2:prstGeom prst="rect">
+                      <ns2:avLst/>
+                    </ns2:prstGeom>
+                  </ns3:spPr>
+                </ns3:pic>
+              </ns2:graphicData>
+            </ns2:graphic>
+          </ns1:inline>
         </w:drawing>
       </w:r>
     </w:p>
@@ -3254,39 +3731,39 @@
       </w:pPr>
       <w:r>
         <w:drawing>
-          <wp:inline distT="0" distB="0" distL="0" distR="0">
-            <wp:extent cx="5486400" cy="3086100"/>
-            <wp:effectExtent l="0" t="0" r="0" b="0"/>
-            <wp:docPr id="7" name="Figure 7" descr="Batch of assembled 2x4 cart bases painted black with plywood decking wings installed."/>
-            <wp:cNvGraphicFramePr>
-              <a:graphicFrameLocks xmlns:a="http://schemas.openxmlformats.org/drawingml/2006/main" noChangeAspect="1"/>
-            </wp:cNvGraphicFramePr>
-            <a:graphic xmlns:a="http://schemas.openxmlformats.org/drawingml/2006/main">
-              <a:graphicData uri="http://schemas.openxmlformats.org/drawingml/2006/picture">
-                <pic:pic xmlns:pic="http://schemas.openxmlformats.org/drawingml/2006/picture">
-                  <pic:nvPicPr>
-                    <pic:cNvPr id="0" name="Figure 7"/>
-                    <pic:cNvPicPr/>
-                  </pic:nvPicPr>
-                  <pic:blipFill>
-                    <a:blip r:embed="rId25"/>
-                    <a:stretch>
-                      <a:fillRect/>
-                    </a:stretch>
-                  </pic:blipFill>
-                  <pic:spPr>
-                    <a:xfrm>
-                      <a:off x="0" y="0"/>
-                      <a:ext cx="5486400" cy="3086100"/>
-                    </a:xfrm>
-                    <a:prstGeom prst="rect">
-                      <a:avLst/>
-                    </a:prstGeom>
-                  </pic:spPr>
-                </pic:pic>
-              </a:graphicData>
-            </a:graphic>
-          </wp:inline>
+          <ns1:inline distT="0" distB="0" distL="0" distR="0">
+            <ns1:extent cx="5486400" cy="3086100"/>
+            <ns1:effectExtent l="0" t="0" r="0" b="0"/>
+            <ns1:docPr id="7" name="Figure 7" descr="Batch of assembled 2x4 cart bases painted black with plywood decking wings installed."/>
+            <ns1:cNvGraphicFramePr>
+              <ns2:graphicFrameLocks noChangeAspect="1"/>
+            </ns1:cNvGraphicFramePr>
+            <ns2:graphic>
+              <ns2:graphicData uri="http://schemas.openxmlformats.org/drawingml/2006/picture">
+                <ns3:pic>
+                  <ns3:nvPicPr>
+                    <ns3:cNvPr id="0" name="Figure 7"/>
+                    <ns3:cNvPicPr/>
+                  </ns3:nvPicPr>
+                  <ns3:blipFill>
+                    <ns2:blip r:embed="rId25"/>
+                    <ns2:stretch>
+                      <ns2:fillRect/>
+                    </ns2:stretch>
+                  </ns3:blipFill>
+                  <ns3:spPr>
+                    <ns2:xfrm>
+                      <ns2:off x="0" y="0"/>
+                      <ns2:ext cx="5486400" cy="3086100"/>
+                    </ns2:xfrm>
+                    <ns2:prstGeom prst="rect">
+                      <ns2:avLst/>
+                    </ns2:prstGeom>
+                  </ns3:spPr>
+                </ns3:pic>
+              </ns2:graphicData>
+            </ns2:graphic>
+          </ns1:inline>
         </w:drawing>
       </w:r>
     </w:p>
@@ -3307,39 +3784,39 @@
       </w:pPr>
       <w:r>
         <w:drawing>
-          <wp:inline distT="0" distB="0" distL="0" distR="0">
-            <wp:extent cx="5486400" cy="3086100"/>
-            <wp:effectExtent l="0" t="0" r="0" b="0"/>
-            <wp:docPr id="9" name="Figure 9" descr="Underside view of heavy-duty swivel caster plate mounted with structural fasteners to 2x4 lumber intersection."/>
-            <wp:cNvGraphicFramePr>
-              <a:graphicFrameLocks xmlns:a="http://schemas.openxmlformats.org/drawingml/2006/main" noChangeAspect="1"/>
-            </wp:cNvGraphicFramePr>
-            <a:graphic xmlns:a="http://schemas.openxmlformats.org/drawingml/2006/main">
-              <a:graphicData uri="http://schemas.openxmlformats.org/drawingml/2006/picture">
-                <pic:pic xmlns:pic="http://schemas.openxmlformats.org/drawingml/2006/picture">
-                  <pic:nvPicPr>
-                    <pic:cNvPr id="0" name="Figure 9"/>
-                    <pic:cNvPicPr/>
-                  </pic:nvPicPr>
-                  <pic:blipFill>
-                    <a:blip r:embed="rId27"/>
-                    <a:stretch>
-                      <a:fillRect/>
-                    </a:stretch>
-                  </pic:blipFill>
-                  <pic:spPr>
-                    <a:xfrm>
-                      <a:off x="0" y="0"/>
-                      <a:ext cx="5486400" cy="3086100"/>
-                    </a:xfrm>
-                    <a:prstGeom prst="rect">
-                      <a:avLst/>
-                    </a:prstGeom>
-                  </pic:spPr>
-                </pic:pic>
-              </a:graphicData>
-            </a:graphic>
-          </wp:inline>
+          <ns1:inline distT="0" distB="0" distL="0" distR="0">
+            <ns1:extent cx="5486400" cy="3086100"/>
+            <ns1:effectExtent l="0" t="0" r="0" b="0"/>
+            <ns1:docPr id="9" name="Figure 9" descr="Underside view of heavy-duty swivel caster plate mounted with structural fasteners to 2x4 lumber intersection."/>
+            <ns1:cNvGraphicFramePr>
+              <ns2:graphicFrameLocks noChangeAspect="1"/>
+            </ns1:cNvGraphicFramePr>
+            <ns2:graphic>
+              <ns2:graphicData uri="http://schemas.openxmlformats.org/drawingml/2006/picture">
+                <ns3:pic>
+                  <ns3:nvPicPr>
+                    <ns3:cNvPr id="0" name="Figure 9"/>
+                    <ns3:cNvPicPr/>
+                  </ns3:nvPicPr>
+                  <ns3:blipFill>
+                    <ns2:blip r:embed="rId27"/>
+                    <ns2:stretch>
+                      <ns2:fillRect/>
+                    </ns2:stretch>
+                  </ns3:blipFill>
+                  <ns3:spPr>
+                    <ns2:xfrm>
+                      <ns2:off x="0" y="0"/>
+                      <ns2:ext cx="5486400" cy="3086100"/>
+                    </ns2:xfrm>
+                    <ns2:prstGeom prst="rect">
+                      <ns2:avLst/>
+                    </ns2:prstGeom>
+                  </ns3:spPr>
+                </ns3:pic>
+              </ns2:graphicData>
+            </ns2:graphic>
+          </ns1:inline>
         </w:drawing>
       </w:r>
     </w:p>
@@ -3500,39 +3977,39 @@
       </w:pPr>
       <w:r>
         <w:drawing>
-          <wp:inline distT="0" distB="0" distL="0" distR="0">
-            <wp:extent cx="2743200" cy="4876800"/>
-            <wp:effectExtent l="0" t="0" r="0" b="0"/>
-            <wp:docPr id="8" name="Figure 8" descr="Full upright 10 ft x 8 ft steel pipe frame mounted to rolling wooden base with rear diagonal support struts standing outdoors."/>
-            <wp:cNvGraphicFramePr>
-              <a:graphicFrameLocks xmlns:a="http://schemas.openxmlformats.org/drawingml/2006/main" noChangeAspect="1"/>
-            </wp:cNvGraphicFramePr>
-            <a:graphic xmlns:a="http://schemas.openxmlformats.org/drawingml/2006/main">
-              <a:graphicData uri="http://schemas.openxmlformats.org/drawingml/2006/picture">
-                <pic:pic xmlns:pic="http://schemas.openxmlformats.org/drawingml/2006/picture">
-                  <pic:nvPicPr>
-                    <pic:cNvPr id="0" name="Figure 8"/>
-                    <pic:cNvPicPr/>
-                  </pic:nvPicPr>
-                  <pic:blipFill>
-                    <a:blip r:embed="rId26"/>
-                    <a:stretch>
-                      <a:fillRect/>
-                    </a:stretch>
-                  </pic:blipFill>
-                  <pic:spPr>
-                    <a:xfrm>
-                      <a:off x="0" y="0"/>
-                      <a:ext cx="2743200" cy="4876800"/>
-                    </a:xfrm>
-                    <a:prstGeom prst="rect">
-                      <a:avLst/>
-                    </a:prstGeom>
-                  </pic:spPr>
-                </pic:pic>
-              </a:graphicData>
-            </a:graphic>
-          </wp:inline>
+          <ns1:inline distT="0" distB="0" distL="0" distR="0">
+            <ns1:extent cx="2743200" cy="4876800"/>
+            <ns1:effectExtent l="0" t="0" r="0" b="0"/>
+            <ns1:docPr id="8" name="Figure 8" descr="Full upright 10 ft x 8 ft steel pipe frame mounted to rolling wooden base with rear diagonal support struts standing outdoors."/>
+            <ns1:cNvGraphicFramePr>
+              <ns2:graphicFrameLocks noChangeAspect="1"/>
+            </ns1:cNvGraphicFramePr>
+            <ns2:graphic>
+              <ns2:graphicData uri="http://schemas.openxmlformats.org/drawingml/2006/picture">
+                <ns3:pic>
+                  <ns3:nvPicPr>
+                    <ns3:cNvPr id="0" name="Figure 8"/>
+                    <ns3:cNvPicPr/>
+                  </ns3:nvPicPr>
+                  <ns3:blipFill>
+                    <ns2:blip r:embed="rId26"/>
+                    <ns2:stretch>
+                      <ns2:fillRect/>
+                    </ns2:stretch>
+                  </ns3:blipFill>
+                  <ns3:spPr>
+                    <ns2:xfrm>
+                      <ns2:off x="0" y="0"/>
+                      <ns2:ext cx="2743200" cy="4876800"/>
+                    </ns2:xfrm>
+                    <ns2:prstGeom prst="rect">
+                      <ns2:avLst/>
+                    </ns2:prstGeom>
+                  </ns3:spPr>
+                </ns3:pic>
+              </ns2:graphicData>
+            </ns2:graphic>
+          </ns1:inline>
         </w:drawing>
       </w:r>
     </w:p>
@@ -4008,6 +4485,103 @@
         <w:keepNext/>
       </w:pPr>
       <w:r>
+        <w:t>Step 3.1: Cutting Engineered Wind Relief Slits</w:t>
+      </w:r>
+    </w:p>
+    <w:p>
+      <w:r>
+        <w:t>To prevent violent wind flutter, reduce peak dynamic overturning impulses during stadium gusts, and protect greenhouse snap clamps from popping off under high wind loads, cut six (6) engineered inverted-U crescent wind relief flaps into the custom vinyl banner while it remains face-down on the cushioned moving blankets:</w:t>
+      </w:r>
+    </w:p>
+    <w:p>
+      <w:r>
+        <w:rPr>
+          <w:b/>
+        </w:rPr>
+        <w:t xml:space="preserve">• Mandatory Tear-Arrest Relief Holes: </w:t>
+      </w:r>
+      <w:r>
+        <w:t>CRITICAL FABRICATION RULE: NEVER cut wind relief slits purely with a utility razor knife leaving sharp 90° corners. Sharp razor corners create extreme stress concentration factors (Kt ≥ 3.0) that will rapidly propagate into catastrophic tears across the entire banner during the first stadium wind gust. Before making any razor cuts, use a 3/8-in. (10 mm) rotary leather punch or clean gasket punch against a wooden backup block to punch two smooth, circular holes at the upper hinge corners of each planned flap.</w:t>
+      </w:r>
+    </w:p>
+    <w:p>
+      <w:r>
+        <w:rPr>
+          <w:b/>
+        </w:rPr>
+        <w:t xml:space="preserve">• Inverted "U" Crescent Flap Geometry: </w:t>
+      </w:r>
+      <w:r>
+        <w:t>Each flap measures 8.0 in. wide with a 5.0 to 6.0 in. downward curved drop. The top 8.0-in. span between the two punched relief holes remains uncut to serve as a flexible vinyl hinge. Using a fresh utility razor knife, cut a smooth downward curve starting from the bottom of one hole, curving down 5 to 6 inches, and terminating cleanly into the bottom of the second hole.</w:t>
+      </w:r>
+    </w:p>
+    <w:p>
+      <w:r>
+        <w:rPr>
+          <w:b/>
+        </w:rPr>
+        <w:t xml:space="preserve">• Aerodynamic Function &amp; Audience Appearance: </w:t>
+      </w:r>
+      <w:r>
+        <w:t>Under calm conditions, gravity pulls the flap flush against the banner face. From audience stands 50 to 150 feet away, the narrow slit line is virtually invisible, preserving complete graphic visual continuity. Under forward or rear wind pressure, the flap swings open freely, venting dynamic pressure spikes and damping vortex-shedding flutter oscillations.</w:t>
+      </w:r>
+    </w:p>
+    <w:p>
+      <w:r>
+        <w:rPr>
+          <w:b/>
+        </w:rPr>
+        <w:t xml:space="preserve">• Upper-Venting Zone Layout (Row 1 &amp; Row 2): </w:t>
+      </w:r>
+      <w:r>
+        <w:t>Because overturning moment increases directly with height above the turf (M = F · y), venting pressure near the top of the prop is 2.5 times more effective at preventing tipping than venting near the bottom. Slits must be concentrated in the upper 40%–60% of the banner:</w:t>
+      </w:r>
+    </w:p>
+    <w:p>
+      <w:pPr>
+        <w:ind w:left="360"/>
+      </w:pPr>
+      <w:r>
+        <w:rPr>
+          <w:b/>
+        </w:rPr>
+        <w:t xml:space="preserve">- Row 1 (Upper Tier): </w:t>
+      </w:r>
+      <w:r>
+        <w:t>Located 8.0 ft (96 in.) above the bottom rail (2.0 ft below top rail). Center three flaps across the width at X = 2.0 ft (24 in.), X = 4.0 ft (48 in. centerline), and X = 6.0 ft (72 in.) from the left outer edge.</w:t>
+      </w:r>
+    </w:p>
+    <w:p>
+      <w:pPr>
+        <w:ind w:left="360"/>
+      </w:pPr>
+      <w:r>
+        <w:rPr>
+          <w:b/>
+        </w:rPr>
+        <w:t xml:space="preserve">- Row 2 (Mid-Upper Tier): </w:t>
+      </w:r>
+      <w:r>
+        <w:t>Located 5.5 ft (66 in.) above the bottom rail. Center three flaps across the width at X = 2.0 ft (24 in.), X = 4.0 ft (48 in. centerline), and X = 6.0 ft (72 in.) from the left outer edge.</w:t>
+      </w:r>
+    </w:p>
+    <w:p>
+      <w:r>
+        <w:rPr>
+          <w:b/>
+        </w:rPr>
+        <w:t xml:space="preserve">• Artwork &amp; Graphic Clearance Rules: </w:t>
+      </w:r>
+      <w:r>
+        <w:t>Before punching or cutting, inspect the front face of the custom printed artwork. Adjust flap centerlines horizontally by ±6 to 12 inches to place slits in solid background fields, skies, or low-contrast negative space. NEVER cut across student performer faces, school crests, band logos, or sharp typographic lettering.</w:t>
+      </w:r>
+    </w:p>
+    <w:p>
+      <w:pPr>
+        <w:pStyle w:val="Heading3"/>
+        <w:keepNext/>
+      </w:pPr>
+      <w:r>
         <w:t>Step 4: Perimeter Double-Sided Tape Application</w:t>
       </w:r>
     </w:p>
@@ -4183,39 +4757,39 @@
       </w:pPr>
       <w:r>
         <w:drawing>
-          <wp:inline distT="0" distB="0" distL="0" distR="0">
-            <wp:extent cx="5486400" cy="3086100"/>
-            <wp:effectExtent l="0" t="0" r="0" b="0"/>
-            <wp:docPr id="6" name="Figure 6" descr="Volunteer build crew stretching vinyl banner across steel frame over protective blankets with faces blurred for privacy."/>
-            <wp:cNvGraphicFramePr>
-              <a:graphicFrameLocks xmlns:a="http://schemas.openxmlformats.org/drawingml/2006/main" noChangeAspect="1"/>
-            </wp:cNvGraphicFramePr>
-            <a:graphic xmlns:a="http://schemas.openxmlformats.org/drawingml/2006/main">
-              <a:graphicData uri="http://schemas.openxmlformats.org/drawingml/2006/picture">
-                <pic:pic xmlns:pic="http://schemas.openxmlformats.org/drawingml/2006/picture">
-                  <pic:nvPicPr>
-                    <pic:cNvPr id="0" name="Figure 6"/>
-                    <pic:cNvPicPr/>
-                  </pic:nvPicPr>
-                  <pic:blipFill>
-                    <a:blip r:embed="rId24"/>
-                    <a:stretch>
-                      <a:fillRect/>
-                    </a:stretch>
-                  </pic:blipFill>
-                  <pic:spPr>
-                    <a:xfrm>
-                      <a:off x="0" y="0"/>
-                      <a:ext cx="5486400" cy="3086100"/>
-                    </a:xfrm>
-                    <a:prstGeom prst="rect">
-                      <a:avLst/>
-                    </a:prstGeom>
-                  </pic:spPr>
-                </pic:pic>
-              </a:graphicData>
-            </a:graphic>
-          </wp:inline>
+          <ns1:inline distT="0" distB="0" distL="0" distR="0">
+            <ns1:extent cx="5486400" cy="3086100"/>
+            <ns1:effectExtent l="0" t="0" r="0" b="0"/>
+            <ns1:docPr id="6" name="Figure 6" descr="Volunteer build crew stretching vinyl banner across steel frame over protective blankets with faces blurred for privacy."/>
+            <ns1:cNvGraphicFramePr>
+              <ns2:graphicFrameLocks noChangeAspect="1"/>
+            </ns1:cNvGraphicFramePr>
+            <ns2:graphic>
+              <ns2:graphicData uri="http://schemas.openxmlformats.org/drawingml/2006/picture">
+                <ns3:pic>
+                  <ns3:nvPicPr>
+                    <ns3:cNvPr id="0" name="Figure 6"/>
+                    <ns3:cNvPicPr/>
+                  </ns3:nvPicPr>
+                  <ns3:blipFill>
+                    <ns2:blip r:embed="rId24"/>
+                    <ns2:stretch>
+                      <ns2:fillRect/>
+                    </ns2:stretch>
+                  </ns3:blipFill>
+                  <ns3:spPr>
+                    <ns2:xfrm>
+                      <ns2:off x="0" y="0"/>
+                      <ns2:ext cx="5486400" cy="3086100"/>
+                    </ns2:xfrm>
+                    <ns2:prstGeom prst="rect">
+                      <ns2:avLst/>
+                    </ns2:prstGeom>
+                  </ns3:spPr>
+                </ns3:pic>
+              </ns2:graphicData>
+            </ns2:graphic>
+          </ns1:inline>
         </w:drawing>
       </w:r>
     </w:p>
@@ -4932,7 +5506,7 @@
         <w:sz w:val="17"/>
         <w:color w:val="777777"/>
       </w:rPr>
-      <w:t>Release v0 (unreleased) — Development build D2</w:t>
+      <w:t>Release v0 (unreleased) — Development build D3</w:t>
     </w:r>
     <w:r>
       <w:tab/>
@@ -4964,7 +5538,7 @@
         <w:sz w:val="17"/>
         <w:color w:val="777777"/>
       </w:rPr>
-      <w:t>Release v0 (unreleased) — Development build D2</w:t>
+      <w:t>Release v0 (unreleased) — Development build D3</w:t>
     </w:r>
     <w:r>
       <w:tab/>
@@ -4996,7 +5570,7 @@
         <w:sz w:val="17"/>
         <w:color w:val="777777"/>
       </w:rPr>
-      <w:t>Release v0 (unreleased) — Development build D2</w:t>
+      <w:t>Release v0 (unreleased) — Development build D3</w:t>
     </w:r>
     <w:r>
       <w:tab/>
@@ -5028,7 +5602,7 @@
         <w:sz w:val="17"/>
         <w:color w:val="777777"/>
       </w:rPr>
-      <w:t>Release v0 (unreleased) — Development build D2</w:t>
+      <w:t>Release v0 (unreleased) — Development build D3</w:t>
     </w:r>
     <w:r>
       <w:tab/>
@@ -5060,7 +5634,7 @@
         <w:sz w:val="17"/>
         <w:color w:val="777777"/>
       </w:rPr>
-      <w:t>Release v0 (unreleased) — Development build D2</w:t>
+      <w:t>Release v0 (unreleased) — Development build D3</w:t>
     </w:r>
     <w:r>
       <w:tab/>
@@ -5092,7 +5666,7 @@
         <w:sz w:val="17"/>
         <w:color w:val="777777"/>
       </w:rPr>
-      <w:t>Release v0 (unreleased) — Development build D2</w:t>
+      <w:t>Release v0 (unreleased) — Development build D3</w:t>
     </w:r>
     <w:r>
       <w:tab/>
@@ -5124,7 +5698,7 @@
         <w:sz w:val="17"/>
         <w:color w:val="777777"/>
       </w:rPr>
-      <w:t>Release v0 (unreleased) — Development build D2</w:t>
+      <w:t>Release v0 (unreleased) — Development build D3</w:t>
     </w:r>
     <w:r>
       <w:tab/>
@@ -5156,7 +5730,7 @@
         <w:sz w:val="17"/>
         <w:color w:val="777777"/>
       </w:rPr>
-      <w:t>Release v0 (unreleased) — Development build D2</w:t>
+      <w:t>Release v0 (unreleased) — Development build D3</w:t>
     </w:r>
     <w:r>
       <w:tab/>

</xml_diff>

<commit_message>
docs(pchsmb): replace Section 1.1 ballast wall of text with quick-reference table
</commit_message>
<xml_diff>
--- a/PCHSMB/_Backdrop/docs/Backdrop_Assembly_Guide.docx
+++ b/PCHSMB/_Backdrop/docs/Backdrop_Assembly_Guide.docx
@@ -518,12 +518,330 @@
         <ns0:rPr>
           <ns0:b/>
         </ns0:rPr>
-        <ns0:t xml:space="preserve">• Ballast Loading &amp; Wind Schedule Compliance: </ns0:t>
-      </ns0:r>
-      <ns0:r>
-        <ns0:t xml:space="preserve">Assess venue wind conditions and stage double-bagged 15-lb sandbags according to the Standardized Tiered Ballasting &amp; Wind Speed Schedule (Section 1.4, Table 1.4). Under Tier 1 normal conditions (0–12 mph), place 2 sandbags over each vertical wing post (4 bags / 60 lbs). Under Tier 2 advisory conditions (12–18 mph), place 3 sandbags over each wing post (6 bags / 90 lbs). Under Tier 3 high-wind conditions (18–22 mph), maintain 3 bags per wing post and place 3 supplemental sandbags flat across the rear 2x4 rail (9 bags / 135 lbs). Never deploy backdrops if sustained winds exceed 20 mph or gusts exceed 25 mph (Tier 4 NO-GO).</ns0:t>
+        <ns0:t xml:space="preserve">• Ballast Loading &amp; Staging: </ns0:t>
+      </ns0:r>
+      <ns0:r>
+        <ns0:t>Assess stadium wind conditions and stage double-bagged 15-lb sandbags according to the quick-reference schedule below (see Section 1.4 for full engineering analysis and leverage details):</ns0:t>
       </ns0:r>
     </ns0:p>
+    <ns0:tbl>
+      <ns0:tblPr>
+        <ns0:tblW ns0:w="9360" ns0:type="dxa"/>
+        <ns0:tblBorders>
+          <ns0:top ns0:val="single" ns0:sz="4" ns0:space="0" ns0:color="CCCCCC"/>
+          <ns0:left ns0:val="single" ns0:sz="4" ns0:space="0" ns0:color="CCCCCC"/>
+          <ns0:bottom ns0:val="single" ns0:sz="4" ns0:space="0" ns0:color="CCCCCC"/>
+          <ns0:right ns0:val="single" ns0:sz="4" ns0:space="0" ns0:color="CCCCCC"/>
+          <ns0:insideH ns0:val="single" ns0:sz="4" ns0:space="0" ns0:color="CCCCCC"/>
+          <ns0:insideV ns0:val="single" ns0:sz="4" ns0:space="0" ns0:color="CCCCCC"/>
+        </ns0:tblBorders>
+      </ns0:tblPr>
+      <ns0:tr>
+        <ns0:trPr>
+          <ns0:tblHeader/>
+        </ns0:trPr>
+        <ns0:tc>
+          <ns0:tcPr>
+            <ns0:tcW ns0:w="1800" ns0:type="dxa"/>
+            <ns0:shd ns0:val="clear" ns0:color="auto" ns0:fill="EAEAEA"/>
+          </ns0:tcPr>
+          <ns0:p>
+            <ns0:r>
+              <ns0:rPr>
+                <ns0:b/>
+                <ns0:sz ns0:val="18"/>
+              </ns0:rPr>
+              <ns0:t>Wind Condition</ns0:t>
+            </ns0:r>
+          </ns0:p>
+        </ns0:tc>
+        <ns0:tc>
+          <ns0:tcPr>
+            <ns0:tcW ns0:w="2400" ns0:type="dxa"/>
+            <ns0:shd ns0:val="clear" ns0:color="auto" ns0:fill="EAEAEA"/>
+          </ns0:tcPr>
+          <ns0:p>
+            <ns0:r>
+              <ns0:rPr>
+                <ns0:b/>
+                <ns0:sz ns0:val="18"/>
+              </ns0:rPr>
+              <ns0:t>Wing Posts (3/4" Pipe)</ns0:t>
+            </ns0:r>
+          </ns0:p>
+        </ns0:tc>
+        <ns0:tc>
+          <ns0:tcPr>
+            <ns0:tcW ns0:w="2000" ns0:type="dxa"/>
+            <ns0:shd ns0:val="clear" ns0:color="auto" ns0:fill="EAEAEA"/>
+          </ns0:tcPr>
+          <ns0:p>
+            <ns0:r>
+              <ns0:rPr>
+                <ns0:b/>
+                <ns0:sz ns0:val="18"/>
+              </ns0:rPr>
+              <ns0:t>Rear Rail (2x4 A)</ns0:t>
+            </ns0:r>
+          </ns0:p>
+        </ns0:tc>
+        <ns0:tc>
+          <ns0:tcPr>
+            <ns0:tcW ns0:w="1400" ns0:type="dxa"/>
+            <ns0:shd ns0:val="clear" ns0:color="auto" ns0:fill="EAEAEA"/>
+          </ns0:tcPr>
+          <ns0:p>
+            <ns0:r>
+              <ns0:rPr>
+                <ns0:b/>
+                <ns0:sz ns0:val="18"/>
+              </ns0:rPr>
+              <ns0:t>Total Ballast</ns0:t>
+            </ns0:r>
+          </ns0:p>
+        </ns0:tc>
+        <ns0:tc>
+          <ns0:tcPr>
+            <ns0:tcW ns0:w="1760" ns0:type="dxa"/>
+            <ns0:shd ns0:val="clear" ns0:color="auto" ns0:fill="EAEAEA"/>
+          </ns0:tcPr>
+          <ns0:p>
+            <ns0:r>
+              <ns0:rPr>
+                <ns0:b/>
+                <ns0:sz ns0:val="18"/>
+              </ns0:rPr>
+              <ns0:t>Field Status</ns0:t>
+            </ns0:r>
+          </ns0:p>
+        </ns0:tc>
+      </ns0:tr>
+      <ns0:tr>
+        <ns0:tc>
+          <ns0:tcPr>
+            <ns0:tcW ns0:w="1800" ns0:type="dxa"/>
+          </ns0:tcPr>
+          <ns0:p>
+            <ns0:r>
+              <ns0:rPr>
+                <ns0:b/>
+              </ns0:rPr>
+              <ns0:t>Calm / Normal (0–12 mph)</ns0:t>
+            </ns0:r>
+          </ns0:p>
+        </ns0:tc>
+        <ns0:tc>
+          <ns0:tcPr>
+            <ns0:tcW ns0:w="2400" ns0:type="dxa"/>
+          </ns0:tcPr>
+          <ns0:p>
+            <ns0:r>
+              <ns0:t>4x 15-lb bags (2 per wing post)</ns0:t>
+            </ns0:r>
+          </ns0:p>
+        </ns0:tc>
+        <ns0:tc>
+          <ns0:tcPr>
+            <ns0:tcW ns0:w="2000" ns0:type="dxa"/>
+          </ns0:tcPr>
+          <ns0:p>
+            <ns0:r>
+              <ns0:t>None</ns0:t>
+            </ns0:r>
+          </ns0:p>
+        </ns0:tc>
+        <ns0:tc>
+          <ns0:tcPr>
+            <ns0:tcW ns0:w="1400" ns0:type="dxa"/>
+          </ns0:tcPr>
+          <ns0:p>
+            <ns0:r>
+              <ns0:t>60 lbs (213 lb prop)</ns0:t>
+            </ns0:r>
+          </ns0:p>
+        </ns0:tc>
+        <ns0:tc>
+          <ns0:tcPr>
+            <ns0:tcW ns0:w="1760" ns0:type="dxa"/>
+          </ns0:tcPr>
+          <ns0:p>
+            <ns0:r>
+              <ns0:t>Standard Deployment</ns0:t>
+            </ns0:r>
+          </ns0:p>
+        </ns0:tc>
+      </ns0:tr>
+      <ns0:tr>
+        <ns0:tc>
+          <ns0:tcPr>
+            <ns0:tcW ns0:w="1800" ns0:type="dxa"/>
+          </ns0:tcPr>
+          <ns0:p>
+            <ns0:r>
+              <ns0:rPr>
+                <ns0:b/>
+              </ns0:rPr>
+              <ns0:t>Advisory (12–18 mph)</ns0:t>
+            </ns0:r>
+          </ns0:p>
+        </ns0:tc>
+        <ns0:tc>
+          <ns0:tcPr>
+            <ns0:tcW ns0:w="2400" ns0:type="dxa"/>
+          </ns0:tcPr>
+          <ns0:p>
+            <ns0:r>
+              <ns0:t>6x 15-lb bags (3 per wing post)</ns0:t>
+            </ns0:r>
+          </ns0:p>
+        </ns0:tc>
+        <ns0:tc>
+          <ns0:tcPr>
+            <ns0:tcW ns0:w="2000" ns0:type="dxa"/>
+          </ns0:tcPr>
+          <ns0:p>
+            <ns0:r>
+              <ns0:t>None</ns0:t>
+            </ns0:r>
+          </ns0:p>
+        </ns0:tc>
+        <ns0:tc>
+          <ns0:tcPr>
+            <ns0:tcW ns0:w="1400" ns0:type="dxa"/>
+          </ns0:tcPr>
+          <ns0:p>
+            <ns0:r>
+              <ns0:t>90 lbs (243 lb prop)</ns0:t>
+            </ns0:r>
+          </ns0:p>
+        </ns0:tc>
+        <ns0:tc>
+          <ns0:tcPr>
+            <ns0:tcW ns0:w="1760" ns0:type="dxa"/>
+          </ns0:tcPr>
+          <ns0:p>
+            <ns0:r>
+              <ns0:t>Attentive Staging</ns0:t>
+            </ns0:r>
+          </ns0:p>
+        </ns0:tc>
+      </ns0:tr>
+      <ns0:tr>
+        <ns0:tc>
+          <ns0:tcPr>
+            <ns0:tcW ns0:w="1800" ns0:type="dxa"/>
+          </ns0:tcPr>
+          <ns0:p>
+            <ns0:r>
+              <ns0:rPr>
+                <ns0:b/>
+              </ns0:rPr>
+              <ns0:t>High-Wind (18–22 mph)</ns0:t>
+            </ns0:r>
+          </ns0:p>
+        </ns0:tc>
+        <ns0:tc>
+          <ns0:tcPr>
+            <ns0:tcW ns0:w="2400" ns0:type="dxa"/>
+          </ns0:tcPr>
+          <ns0:p>
+            <ns0:r>
+              <ns0:t>6x 15-lb bags (3 per wing post)</ns0:t>
+            </ns0:r>
+          </ns0:p>
+        </ns0:tc>
+        <ns0:tc>
+          <ns0:tcPr>
+            <ns0:tcW ns0:w="2000" ns0:type="dxa"/>
+          </ns0:tcPr>
+          <ns0:p>
+            <ns0:r>
+              <ns0:t>3x 15-lb bags laid flat</ns0:t>
+            </ns0:r>
+          </ns0:p>
+        </ns0:tc>
+        <ns0:tc>
+          <ns0:tcPr>
+            <ns0:tcW ns0:w="1400" ns0:type="dxa"/>
+          </ns0:tcPr>
+          <ns0:p>
+            <ns0:r>
+              <ns0:t>135 lbs (288 lb prop)</ns0:t>
+            </ns0:r>
+          </ns0:p>
+        </ns0:tc>
+        <ns0:tc>
+          <ns0:tcPr>
+            <ns0:tcW ns0:w="1760" ns0:type="dxa"/>
+          </ns0:tcPr>
+          <ns0:p>
+            <ns0:r>
+              <ns0:t>Max Safe Turf Limit</ns0:t>
+            </ns0:r>
+          </ns0:p>
+        </ns0:tc>
+      </ns0:tr>
+      <ns0:tr>
+        <ns0:tc>
+          <ns0:tcPr>
+            <ns0:tcW ns0:w="1800" ns0:type="dxa"/>
+          </ns0:tcPr>
+          <ns0:p>
+            <ns0:r>
+              <ns0:rPr>
+                <ns0:b/>
+                <ns0:color ns0:val="C00000"/>
+              </ns0:rPr>
+              <ns0:t>Abort (&gt;20 mph / gusts &gt;25)</ns0:t>
+            </ns0:r>
+          </ns0:p>
+        </ns0:tc>
+        <ns0:tc>
+          <ns0:tcPr>
+            <ns0:tcW ns0:w="2400" ns0:type="dxa"/>
+          </ns0:tcPr>
+          <ns0:p>
+            <ns0:r>
+              <ns0:t>—</ns0:t>
+            </ns0:r>
+          </ns0:p>
+        </ns0:tc>
+        <ns0:tc>
+          <ns0:tcPr>
+            <ns0:tcW ns0:w="2000" ns0:type="dxa"/>
+          </ns0:tcPr>
+          <ns0:p>
+            <ns0:r>
+              <ns0:t>—</ns0:t>
+            </ns0:r>
+          </ns0:p>
+        </ns0:tc>
+        <ns0:tc>
+          <ns0:tcPr>
+            <ns0:tcW ns0:w="1400" ns0:type="dxa"/>
+          </ns0:tcPr>
+          <ns0:p>
+            <ns0:r>
+              <ns0:t>—</ns0:t>
+            </ns0:r>
+          </ns0:p>
+        </ns0:tc>
+        <ns0:tc>
+          <ns0:tcPr>
+            <ns0:tcW ns0:w="1760" ns0:type="dxa"/>
+          </ns0:tcPr>
+          <ns0:p>
+            <ns0:r>
+              <ns0:rPr>
+                <ns0:b/>
+                <ns0:color ns0:val="C00000"/>
+              </ns0:rPr>
+              <ns0:t>NO-GO / LAY FLAT</ns0:t>
+            </ns0:r>
+          </ns0:p>
+        </ns0:tc>
+      </ns0:tr>
+    </ns0:tbl>
     <ns0:p>
       <ns0:pPr>
         <ns0:pStyle ns0:val="ListBullet"/>

</xml_diff>

<commit_message>
fix(pchsmb): clarify non-locking swivel casters and ground sandbag chocking protocol in Backdrop D3
</commit_message>
<xml_diff>
--- a/PCHSMB/_Backdrop/docs/Backdrop_Assembly_Guide.docx
+++ b/PCHSMB/_Backdrop/docs/Backdrop_Assembly_Guide.docx
@@ -843,22 +843,14 @@
       </ns0:tr>
     </ns0:tbl>
     <ns0:p>
-      <ns0:pPr>
-        <ns0:pStyle ns0:val="ListBullet"/>
-        <ns0:spacing ns0:before="40" ns0:after="40"/>
-        <ns0:ind ns0:left="720" ns0:hanging="360"/>
-      </ns0:pPr>
-      <ns0:r>
-        <ns0:t xml:space="preserve">• </ns0:t>
-      </ns0:r>
       <ns0:r>
         <ns0:rPr>
           <ns0:b/>
         </ns0:rPr>
-        <ns0:t xml:space="preserve">Pre-Show Safety Check: </ns0:t>
-      </ns0:r>
-      <ns0:r>
-        <ns0:t xml:space="preserve">Verify all four swivel casters rotate freely, brake levers are disengaged for transit, and strut mounting hardware is secure.</ns0:t>
+        <ns0:t xml:space="preserve">• Pre-Show Safety Check: </ns0:t>
+      </ns0:r>
+      <ns0:r>
+        <ns0:t xml:space="preserve">Verify all four swivel casters rotate freely, 360° swivel action is smooth without binding, mounting hex nuts are tightened securely, and strut hardware has zero play.</ns0:t>
       </ns0:r>
     </ns0:p>
     <ns0:p>
@@ -962,22 +954,14 @@
       </ns0:r>
     </ns0:p>
     <ns0:p>
-      <ns0:pPr>
-        <ns0:pStyle ns0:val="ListBullet"/>
-        <ns0:spacing ns0:before="40" ns0:after="40"/>
-        <ns0:ind ns0:left="720" ns0:hanging="360"/>
-      </ns0:pPr>
-      <ns0:r>
-        <ns0:t xml:space="preserve">• </ns0:t>
-      </ns0:r>
       <ns0:r>
         <ns0:rPr>
           <ns0:b/>
         </ns0:rPr>
-        <ns0:t xml:space="preserve">On-Field Locking &amp; Egress: </ns0:t>
-      </ns0:r>
-      <ns0:r>
-        <ns0:t xml:space="preserve">Students engage all four caster wheel locks upon reaching field coordinates and release locks immediately upon show exit cue.</ns0:t>
+        <ns0:t xml:space="preserve">• On-Field Positioning &amp; Ground Chocking: </ns0:t>
+      </ns0:r>
+      <ns0:r>
+        <ns0:t xml:space="preserve">Carts are equipped with non-locking swivel casters to maximize rolling agility during rapid field entrances and exits. When props reach their drill coordinates in windy conditions, handlers or parent pit crew deploy supplemental double-bagged 15-lb sandbags on the ground directly against the wheels to serve as wheel chocks, preventing field drift during the performance.</ns0:t>
       </ns0:r>
     </ns0:p>
     <ns0:p>
@@ -1104,10 +1088,10 @@
         <ns0:rPr>
           <ns0:b/>
         </ns0:rPr>
-        <ns0:t xml:space="preserve">Drill Coordinate Placement &amp; Wheel Locking: </ns0:t>
-      </ns0:r>
-      <ns0:r>
-        <ns0:t xml:space="preserve">Guide the cart to its exact field drill coordinate. Once in position, both handlers immediately depress the foot-operated wheel brake locks on all four swivel casters to prevent prop drift during wind gusts or choreography, retrieve their instruments from the center tote, and enter field positions.</ns0:t>
+        <ns0:t xml:space="preserve">Drill Coordinate Placement &amp; Ground Chocking: </ns0:t>
+      </ns0:r>
+      <ns0:r>
+        <ns0:t xml:space="preserve">Guide the cart to its exact field drill coordinate. Because carts utilize non-locking swivel casters, handlers position the cart square to the front sideline. When needed in breezy conditions, place extra double-bagged 15-lb sandbags on the ground firmly against the caster wheels as temporary wheel chocks to eliminate roll drift, retrieve instruments from the center tote, and take show positions.</ns0:t>
       </ns0:r>
     </ns0:p>
     <ns0:p>
@@ -1128,7 +1112,7 @@
         <ns0:t xml:space="preserve">Rapid Field Egress: </ns0:t>
       </ns0:r>
       <ns0:r>
-        <ns0:t xml:space="preserve">On the final performance cue, handlers place instruments in the tote and both handlers kick-release all four caster brakes simultaneously. Push the carts in assigned exit order directly toward the exit gate where the parent catch crew is stationed to assist with deceleration and off-field handover. All props must maintain continuous movement until completely off the performance field per Rule 8.05.</ns0:t>
+        <ns0:t xml:space="preserve">On the final performance cue, handlers place instruments in the tote, quickly lift any ground sandbag chocks onto the cart base or hand them to sideline crew, and push the carts in assigned exit order directly toward the exit gate. All props must maintain continuous movement off the field per Rule 8.05.</ns0:t>
       </ns0:r>
     </ns0:p>
     <ns0:p>
@@ -1205,7 +1189,7 @@
         <ns0:t xml:space="preserve">Rehearsal Run-Throughs: </ns0:t>
       </ns0:r>
       <ns0:r>
-        <ns0:t xml:space="preserve">Conduct full-speed timed entry, positioning, brake-setting, brake-releasing, and exit drills during dress rehearsals on both synthetic turf and natural grass surfaces.</ns0:t>
+        <ns0:t xml:space="preserve">Conduct full-speed timed entry, positioning, ground sandbag chocking, and egress drills during dress rehearsals on both synthetic turf and natural grass surfaces.</ns0:t>
       </ns0:r>
     </ns0:p>
     <ns0:p>
@@ -1226,7 +1210,7 @@
         <ns0:t xml:space="preserve">Handshake &amp; Communication Protocol: </ns0:t>
       </ns0:r>
       <ns0:r>
-        <ns0:t xml:space="preserve">The student on the outer sideline edge acts as the primary caller ('Clear left', 'Approaching curb', 'Brakes locked', 'Brakes released'). Handlers maintain continuous verbal communication during moves.</ns0:t>
+        <ns0:t xml:space="preserve">The student on the outer sideline edge acts as the primary caller ('Clear left', 'Approaching curb', 'On coordinate', 'Chocks set', 'Chocks clear'). Handlers maintain continuous verbal communication during moves.</ns0:t>
       </ns0:r>
     </ns0:p>
     <ns0:p>
@@ -1247,7 +1231,7 @@
         <ns0:t xml:space="preserve">High Wind Emergency Response &amp; Abort Protocol: </ns0:t>
       </ns0:r>
       <ns0:r>
-        <ns0:t xml:space="preserve">If sustained winds exceed 20 mph or sudden gusts exceed 25 mph, rolling backdrops MUST NOT enter the performance field (strict safety NO-GO threshold). If severe gusts strike while props are already on the field, student handlers must immediately lock all four caster brakes, position themselves on the upwind side of the cart, and brace the lower 2x4 framing. At no time should students attempt to hold backdrops from the upper steel pipe rails or climb the frame. Designated parent volunteers with Field Pass wristbands (Rule 9.07) will step onto the field to provide perimeter stabilization or assist handlers in immediately tipping the props flat onto the turf if ordered by band directors.</ns0:t>
+        <ns0:t xml:space="preserve">If sustained winds exceed 20 mph or sudden gusts exceed 25 mph, rolling backdrops MUST NOT enter the performance field (strict safety NO-GO threshold). If severe gusts strike while props are already on the field, student handlers position themselves on the upwind side of the cart, place ground sandbag chocks firmly against wheels, and brace the lower 2x4 framing. At no time should students attempt to hold backdrops from the upper steel pipe rails or climb the frame. Designated parent volunteers with Field Pass wristbands (Rule 9.07) will step onto the field to provide perimeter stabilization or assist handlers in immediately tipping the props flat onto the turf if ordered by band directors.</ns0:t>
       </ns0:r>
     </ns0:p>
     <ns0:p>
@@ -1509,7 +1493,7 @@
           </ns0:tcPr>
           <ns0:p>
             <ns0:r>
-              <ns0:t>18.4 mph max gust. Handlers verify all 4 caster locks on field.</ns0:t>
+              <ns0:t>18.4 mph max gust. Handlers deploy ground sandbag chocks if breezy.</ns0:t>
             </ns0:r>
           </ns0:p>
         </ns0:tc>
@@ -2749,7 +2733,7 @@
         <ns0:tc>
           <ns0:p>
             <ns0:r>
-              <ns0:t>Heavy-duty turf-compatible swivel plate casters w/ brakes</ns0:t>
+              <ns0:t>Heavy-duty turf-compatible non-locking swivel plate casters</ns0:t>
             </ns0:r>
           </ns0:p>
         </ns0:tc>
@@ -3532,7 +3516,7 @@
         <ns0:tc>
           <ns0:p>
             <ns0:r>
-              <ns0:t>4x Heavy-duty swivel casters w/ brakes, 4x ASA corner bumpers</ns0:t>
+              <ns0:t>4x Heavy-duty non-locking swivel casters, 4x ASA corner bumpers</ns0:t>
             </ns0:r>
           </ns0:p>
         </ns0:tc>
@@ -5316,9 +5300,6 @@
         <ns0:ind ns0:left="720" ns0:hanging="480"/>
       </ns0:pPr>
       <ns0:r>
-        <ns0:rPr>
-          <ns0:b/>
-        </ns0:rPr>
         <ns0:t xml:space="preserve">□  </ns0:t>
       </ns0:r>
       <ns0:r>
@@ -5328,7 +5309,7 @@
         <ns0:t xml:space="preserve">Casters: </ns0:t>
       </ns0:r>
       <ns0:r>
-        <ns0:t xml:space="preserve">Smooth 360° swivel action; hex nuts tightened securely; brake levers lock.</ns0:t>
+        <ns0:t xml:space="preserve">Smooth 360° swivel action; hex nuts tightened securely; wheels roll freely without wobble (non-locking agility design).</ns0:t>
       </ns0:r>
     </ns0:p>
     <ns0:p>

</xml_diff>

<commit_message>
feat(pchsmb): add Tier 0 (0-sandbag) calm day ballast deployment threshold to Backdrop D3
</commit_message>
<xml_diff>
--- a/PCHSMB/_Backdrop/docs/Backdrop_Assembly_Guide.docx
+++ b/PCHSMB/_Backdrop/docs/Backdrop_Assembly_Guide.docx
@@ -626,7 +626,62 @@
               <ns0:rPr>
                 <ns0:b/>
               </ns0:rPr>
-              <ns0:t>Calm / Normal (0–12 mph)</ns0:t>
+              <ns0:t>Calm / Zero-Wind (0–8 mph)</ns0:t>
+            </ns0:r>
+          </ns0:p>
+        </ns0:tc>
+        <ns0:tc>
+          <ns0:tcPr>
+            <ns0:tcW ns0:w="2400" ns0:type="dxa"/>
+          </ns0:tcPr>
+          <ns0:p>
+            <ns0:r>
+              <ns0:t>0 bags (unballasted)</ns0:t>
+            </ns0:r>
+          </ns0:p>
+        </ns0:tc>
+        <ns0:tc>
+          <ns0:tcPr>
+            <ns0:tcW ns0:w="2000" ns0:type="dxa"/>
+          </ns0:tcPr>
+          <ns0:p>
+            <ns0:r>
+              <ns0:t>None</ns0:t>
+            </ns0:r>
+          </ns0:p>
+        </ns0:tc>
+        <ns0:tc>
+          <ns0:tcPr>
+            <ns0:tcW ns0:w="1400" ns0:type="dxa"/>
+          </ns0:tcPr>
+          <ns0:p>
+            <ns0:r>
+              <ns0:t>0 lbs (153 lb prop)</ns0:t>
+            </ns0:r>
+          </ns0:p>
+        </ns0:tc>
+        <ns0:tc>
+          <ns0:tcPr>
+            <ns0:tcW ns0:w="1760" ns0:type="dxa"/>
+          </ns0:tcPr>
+          <ns0:p>
+            <ns0:r>
+              <ns0:t>Safe to 8 mph (10 mph gust max)</ns0:t>
+            </ns0:r>
+          </ns0:p>
+        </ns0:tc>
+      </ns0:tr>
+      <ns0:tr>
+        <ns0:tc>
+          <ns0:tcPr>
+            <ns0:tcW ns0:w="1800" ns0:type="dxa"/>
+          </ns0:tcPr>
+          <ns0:p>
+            <ns0:r>
+              <ns0:rPr>
+                <ns0:b/>
+              </ns0:rPr>
+              <ns0:t>Light Breeze (8–12 mph)</ns0:t>
             </ns0:r>
           </ns0:p>
         </ns0:tc>
@@ -1378,6 +1433,71 @@
               <ns0:rPr>
                 <ns0:b/>
               </ns0:rPr>
+              <ns0:t>Tier 0: Calm</ns0:t>
+            </ns0:r>
+          </ns0:p>
+        </ns0:tc>
+        <ns0:tc>
+          <ns0:tcPr>
+            <ns0:tcW ns0:w="1400" ns0:type="dxa"/>
+          </ns0:tcPr>
+          <ns0:p>
+            <ns0:r>
+              <ns0:t>Calm / light air (0–8 mph, gusts ≤10 mph)</ns0:t>
+            </ns0:r>
+          </ns0:p>
+        </ns0:tc>
+        <ns0:tc>
+          <ns0:tcPr>
+            <ns0:tcW ns0:w="1700" ns0:type="dxa"/>
+          </ns0:tcPr>
+          <ns0:p>
+            <ns0:r>
+              <ns0:t>0 bags (unballasted)</ns0:t>
+            </ns0:r>
+          </ns0:p>
+        </ns0:tc>
+        <ns0:tc>
+          <ns0:tcPr>
+            <ns0:tcW ns0:w="1500" ns0:type="dxa"/>
+          </ns0:tcPr>
+          <ns0:p>
+            <ns0:r>
+              <ns0:t>None</ns0:t>
+            </ns0:r>
+          </ns0:p>
+        </ns0:tc>
+        <ns0:tc>
+          <ns0:tcPr>
+            <ns0:tcW ns0:w="1160" ns0:type="dxa"/>
+          </ns0:tcPr>
+          <ns0:p>
+            <ns0:r>
+              <ns0:t>0 lbs (153 lb total)</ns0:t>
+            </ns0:r>
+          </ns0:p>
+        </ns0:tc>
+        <ns0:tc>
+          <ns0:tcPr>
+            <ns0:tcW ns0:w="2200" ns0:type="dxa"/>
+          </ns0:tcPr>
+          <ns0:p>
+            <ns0:r>
+              <ns0:t>10.0 mph max safe gust (14.4 mph tipping limit). FoS ≥ 2.07. Must upgrade to Tier 1 if wind exceeds 8 mph.</ns0:t>
+            </ns0:r>
+          </ns0:p>
+        </ns0:tc>
+      </ns0:tr>
+      <ns0:tr>
+        <ns0:tc>
+          <ns0:tcPr>
+            <ns0:tcW ns0:w="1400" ns0:type="dxa"/>
+          </ns0:tcPr>
+          <ns0:p>
+            <ns0:r>
+              <ns0:rPr>
+                <ns0:b/>
+              </ns0:rPr>
               <ns0:t>Tier 1: Normal</ns0:t>
             </ns0:r>
           </ns0:p>
@@ -1388,7 +1508,7 @@
           </ns0:tcPr>
           <ns0:p>
             <ns0:r>
-              <ns0:t>Calm to light breeze (0–12 mph)</ns0:t>
+              <ns0:t>Light breeze (8–12 mph)</ns0:t>
             </ns0:r>
           </ns0:p>
         </ns0:tc>

</xml_diff>

<commit_message>
feat(pchsmb): add detailed trailer loading, unloading, two-piece strut, and vinyl protection protocols to Backdrop D3
</commit_message>
<xml_diff>
--- a/PCHSMB/_Backdrop/docs/Backdrop_Assembly_Guide.docx
+++ b/PCHSMB/_Backdrop/docs/Backdrop_Assembly_Guide.docx
@@ -497,7 +497,7 @@
     <ns0:p>
       <ns0:pPr>
         <ns0:pStyle ns0:val="ListBullet"/>
-        <ns0:spacing ns0:before="40" ns0:after="40"/>
+        <ns0:spacing ns0:before="60" ns0:after="40"/>
         <ns0:ind ns0:left="720" ns0:hanging="360"/>
       </ns0:pPr>
       <ns0:r>
@@ -507,10 +507,85 @@
         <ns0:rPr>
           <ns0:b/>
         </ns0:rPr>
-        <ns0:t xml:space="preserve">Trailer Unloading &amp; Staging: </ns0:t>
-      </ns0:r>
-      <ns0:r>
-        <ns0:t xml:space="preserve">Offload backdrop carts from the equipment trailer and roll them to the stadium entrance tunnel or staging chute (Figure 3).</ns0:t>
+        <ns0:t xml:space="preserve">Trailer Unloading &amp; Field Staging Protocol: </ns0:t>
+      </ns0:r>
+      <ns0:r>
+        <ns0:t>To fit inside equipment trailers, backdrops travel with the 10 ft × 8 ft steel frame detached from the cart base. Logistics crew execute field reassembly in the stadium tunnel or staging chute (Figure 3) as the exact reverse of trailer loading:</ns0:t>
+      </ns0:r>
+    </ns0:p>
+    <ns0:p>
+      <ns0:pPr>
+        <ns0:spacing ns0:before="30" ns0:after="30"/>
+        <ns0:ind ns0:left="1080" ns0:hanging="360"/>
+      </ns0:pPr>
+      <ns0:r>
+        <ns0:rPr>
+          <ns0:b/>
+        </ns0:rPr>
+        <ns0:t xml:space="preserve">1.  Cart Base Offloading: </ns0:t>
+      </ns0:r>
+      <ns0:r>
+        <ns0:t>Release the heavy-duty E-track ratchet straps securing the cart bases against the front nose wall of the trailer. Carefully lower each cart base from its vertical short-end orientation onto all four swivel casters and roll it down the ramp to the level venue staging area.</ns0:t>
+      </ns0:r>
+    </ns0:p>
+    <ns0:p>
+      <ns0:pPr>
+        <ns0:spacing ns0:before="30" ns0:after="30"/>
+        <ns0:ind ns0:left="1080" ns0:hanging="360"/>
+      </ns0:pPr>
+      <ns0:r>
+        <ns0:rPr>
+          <ns0:b/>
+        </ns0:rPr>
+        <ns0:t xml:space="preserve">2.  Vinyl Frame Retrieval &amp; Protective Tennis Ball Removal: </ns0:t>
+      </ns0:r>
+      <ns0:r>
+        <ns0:t>With two operators lifting opposite sides, retrieve the 10 ft × 8 ft steel frames with attached vinyl banners from the trailer’s interior cross support beams (Figure 5). Pull off the protective cut tennis balls from the exposed ends of the upper strut arms and stow the tennis balls in the cart’s center HDX tough tote for post-show repacking.</ns0:t>
+      </ns0:r>
+    </ns0:p>
+    <ns0:p>
+      <ns0:pPr>
+        <ns0:spacing ns0:before="30" ns0:after="30"/>
+        <ns0:ind ns0:left="1080" ns0:hanging="360"/>
+      </ns0:pPr>
+      <ns0:r>
+        <ns0:rPr>
+          <ns0:b/>
+        </ns0:rPr>
+        <ns0:t xml:space="preserve">3.  Rapid Frame-to-Cart Fastening (Power Driver Recommended): </ns0:t>
+      </ns0:r>
+      <ns0:r>
+        <ns0:t>Set the upright steel frame into the base mounting tension bands / clamp brackets along the front 2x4 rail of the cart base. Retrieve the mounting bolts from the tote. Using a cordless power drill/driver with an appropriate socket is strongly recommended to rapidly spin on and torque the hex nuts and lock washers, securing the upright frame to the cart in seconds.</ns0:t>
+      </ns0:r>
+    </ns0:p>
+    <ns0:p>
+      <ns0:pPr>
+        <ns0:spacing ns0:before="30" ns0:after="30"/>
+        <ns0:ind ns0:left="1080" ns0:hanging="360"/>
+      </ns0:pPr>
+      <ns0:r>
+        <ns0:rPr>
+          <ns0:b/>
+        </ns0:rPr>
+        <ns0:t xml:space="preserve">4.  Two-Piece Strut Mating &amp; Pinning: </ns0:t>
+      </ns0:r>
+      <ns0:r>
+        <ns0:t>Pivot the lower strut section up from the cart base (where it remained attached during transit), align it with the upper strut section attached to the frame upright, slide the sleeved two-piece joint together, and insert and lock the quick-release retaining pin through the aligned pin holes. Confirm both diagonal struts are rigid with zero slop.</ns0:t>
+      </ns0:r>
+    </ns0:p>
+    <ns0:p>
+      <ns0:pPr>
+        <ns0:spacing ns0:before="30" ns0:after="40"/>
+        <ns0:ind ns0:left="1080" ns0:hanging="360"/>
+      </ns0:pPr>
+      <ns0:r>
+        <ns0:rPr>
+          <ns0:b/>
+        </ns0:rPr>
+        <ns0:t xml:space="preserve">5.  Pre-Show Staging &amp; Ballasting: </ns0:t>
+      </ns0:r>
+      <ns0:r>
+        <ns0:t>Roll assembled backdrops to the field entrance gate in numerical show drill order. Load the required tiered sandbag ballast onto the wing posts (and rear rail if high wind), stage extra double-bagged 15-lb ground sandbag chocks for on-field use, verify 360° caster rotation, and prepare for gate ingress.</ns0:t>
       </ns0:r>
     </ns0:p>
     <ns0:p>
@@ -2143,7 +2218,7 @@
     </ns0:p>
     <ns0:p>
       <ns0:pPr>
-        <ns0:spacing ns0:before="60" ns0:after="60"/>
+        <ns0:spacing ns0:before="60" ns0:after="40"/>
         <ns0:ind ns0:left="720" ns0:hanging="480"/>
       </ns0:pPr>
       <ns0:r>
@@ -2156,15 +2231,15 @@
         <ns0:rPr>
           <ns0:b/>
         </ns0:rPr>
-        <ns0:t xml:space="preserve">Immediate De-Ballasting: </ns0:t>
-      </ns0:r>
-      <ns0:r>
-        <ns0:t xml:space="preserve">Remove all 15-lb sandbags from the 3/4" vertical wing posts and rear framing rail at the stadium exit chute immediately following performance exit. Never transport carts in trailers or across curbs with sandbags installed on the posts or frame.</ns0:t>
+        <ns0:t xml:space="preserve">Immediate De-Ballasting &amp; Chock Retrieval: </ns0:t>
+      </ns0:r>
+      <ns0:r>
+        <ns0:t>Remove all 15-lb sandbags from the 3/4" vertical wing posts, rear lumber framing rail, and ground wheel chocks at the stadium exit chute immediately following performance exit. Never transport carts in trailers or across curbs with ballast loaded on the posts or frame.</ns0:t>
       </ns0:r>
     </ns0:p>
     <ns0:p>
       <ns0:pPr>
-        <ns0:spacing ns0:before="60" ns0:after="60"/>
+        <ns0:spacing ns0:before="40" ns0:after="40"/>
         <ns0:ind ns0:left="720" ns0:hanging="480"/>
       </ns0:pPr>
       <ns0:r>
@@ -2180,12 +2255,12 @@
         <ns0:t xml:space="preserve">Sandbag Trailer Staging: </ns0:t>
       </ns0:r>
       <ns0:r>
-        <ns0:t xml:space="preserve">Stack sandbags low over the trailer axles on rubber floor mats to maintain a low trailer center of gravity.</ns0:t>
+        <ns0:t>Stack all de-ballasted sandbags low over the trailer axles on rubber floor mats to maintain a low trailer center of gravity and prevent shifting during road transit.</ns0:t>
       </ns0:r>
     </ns0:p>
     <ns0:p>
       <ns0:pPr>
-        <ns0:spacing ns0:before="60" ns0:after="60"/>
+        <ns0:spacing ns0:before="40" ns0:after="40"/>
         <ns0:ind ns0:left="720" ns0:hanging="480"/>
       </ns0:pPr>
       <ns0:r>
@@ -2198,15 +2273,15 @@
         <ns0:rPr>
           <ns0:b/>
         </ns0:rPr>
-        <ns0:t xml:space="preserve">Cart Base Loading: </ns0:t>
-      </ns0:r>
-      <ns0:r>
-        <ns0:t xml:space="preserve">Roll empty cart bases into the front trailer nose wall standing upright (Figure 4). The 3D-printed Black ASA corner bumper braces prevent scuffing between adjacent carts.</ns0:t>
+        <ns0:t xml:space="preserve">Two-Piece Strut Disassembly &amp; Pin Stowage: </ns0:t>
+      </ns0:r>
+      <ns0:r>
+        <ns0:t>Each diagonal support strut is a two-piece modular assembly. Pull the quick-release retaining pin holding the upper and lower strut pieces together. Stow the pins immediately in the hardware container inside the center HDX tough tote to prevent loss.</ns0:t>
       </ns0:r>
     </ns0:p>
     <ns0:p>
       <ns0:pPr>
-        <ns0:spacing ns0:before="60" ns0:after="60"/>
+        <ns0:spacing ns0:before="40" ns0:after="40"/>
         <ns0:ind ns0:left="720" ns0:hanging="480"/>
       </ns0:pPr>
       <ns0:r>
@@ -2219,15 +2294,15 @@
         <ns0:rPr>
           <ns0:b/>
         </ns0:rPr>
-        <ns0:t xml:space="preserve">Ratchet Strap Restraint: </ns0:t>
-      </ns0:r>
-      <ns0:r>
-        <ns0:t xml:space="preserve">Secure cart bases using heavy-duty E-track ratchet straps wrapped around the bottom 2x4 lumber rails (Figure 4). NEVER strap across the steel pipe frame or struts.</ns0:t>
+        <ns0:t xml:space="preserve">Strut Lower Arm Stowing &amp; Upper Arm Vinyl Protection (Tennis Balls): </ns0:t>
+      </ns0:r>
+      <ns0:r>
+        <ns0:t>Allow the lower half of each strut to pivot down flat against the cart decking (it remains anchored to the base U-bolt throughout transport). Install a standard tennis ball with a hole cut in it securely over the exposed open end of each upper strut arm (which remains attached to the vinyl frame upright). This cushioned ball prevents the metal tube end from puncturing, tearing, or abrading the printed scrim vinyl during transit and handling.</ns0:t>
       </ns0:r>
     </ns0:p>
     <ns0:p>
       <ns0:pPr>
-        <ns0:spacing ns0:before="60" ns0:after="60"/>
+        <ns0:spacing ns0:before="40" ns0:after="40"/>
         <ns0:ind ns0:left="720" ns0:hanging="480"/>
       </ns0:pPr>
       <ns0:r>
@@ -2240,10 +2315,52 @@
         <ns0:rPr>
           <ns0:b/>
         </ns0:rPr>
-        <ns0:t xml:space="preserve">Frame &amp; Banner Rack: </ns0:t>
-      </ns0:r>
-      <ns0:r>
-        <ns0:t xml:space="preserve">Store detached 10' x 8' steel frames with attached vinyl banners upright in protective padded storage racks (Figure 5).</ns0:t>
+        <ns0:t xml:space="preserve">Rapid Frame-to-Cart Unbolting (Power Driver Recommended): </ns0:t>
+      </ns0:r>
+      <ns0:r>
+        <ns0:t>Remove the bolts securing the vertical upright steel frame to the cart base tension bands / clamp brackets along the front lumber rail. Using a cordless power drill/driver with an appropriate socket is strongly recommended to accelerate nut and bolt removal during tight post-show teardown intervals. Stow all mounting bolts, nuts, and washers in the cart's hardware container.</ns0:t>
+      </ns0:r>
+    </ns0:p>
+    <ns0:p>
+      <ns0:pPr>
+        <ns0:spacing ns0:before="40" ns0:after="40"/>
+        <ns0:ind ns0:left="720" ns0:hanging="480"/>
+      </ns0:pPr>
+      <ns0:r>
+        <ns0:rPr>
+          <ns0:b/>
+        </ns0:rPr>
+        <ns0:t xml:space="preserve">6.  </ns0:t>
+      </ns0:r>
+      <ns0:r>
+        <ns0:rPr>
+          <ns0:b/>
+        </ns0:rPr>
+        <ns0:t xml:space="preserve">Vinyl Frame Loading onto Trailer Cross Support Beams: </ns0:t>
+      </ns0:r>
+      <ns0:r>
+        <ns0:t>With two operators lifting opposite sides, carry the detached 10 ft × 8 ft steel frame with installed vinyl banner (and tennis-ball protected upper strut arms) into the equipment truck/trailer. Slide the frames onto the trailer's interior cross support beams (load bars / shoring beams / attic deck racks) as shown in Figure 5.</ns0:t>
+      </ns0:r>
+    </ns0:p>
+    <ns0:p>
+      <ns0:pPr>
+        <ns0:spacing ns0:before="40" ns0:after="60"/>
+        <ns0:ind ns0:left="720" ns0:hanging="480"/>
+      </ns0:pPr>
+      <ns0:r>
+        <ns0:rPr>
+          <ns0:b/>
+        </ns0:rPr>
+        <ns0:t xml:space="preserve">7.  </ns0:t>
+      </ns0:r>
+      <ns0:r>
+        <ns0:rPr>
+          <ns0:b/>
+        </ns0:rPr>
+        <ns0:t xml:space="preserve">Cart Base Stowing on Short End &amp; Ratchet Strap Restraint: </ns0:t>
+      </ns0:r>
+      <ns0:r>
+        <ns0:t>Roll the detached wooden cart bases into the truck. Stand each cart base vertically on its short end up against the front nose wall of the truck (Figure 4). The 3D-printed ASA corner bumpers prevent scuffing between adjacent carts. Secure the cart bases firmly against the nose wall using heavy-duty E-track ratchet straps wrapped around the 2x4 lumber framing rails. NEVER strap across the steel pipe posts or the lower strut arms.</ns0:t>
       </ns0:r>
     </ns0:p>
     <ns0:p>
@@ -3262,6 +3379,96 @@
           </ns0:p>
         </ns0:tc>
       </ns0:tr>
+      <ns0:tr>
+        <ns0:tc>
+          <ns0:tcPr>
+            <ns0:tcW ns0:w="2400" ns0:type="dxa"/>
+          </ns0:tcPr>
+          <ns0:p>
+            <ns0:r>
+              <ns0:rPr>
+                <ns0:b/>
+              </ns0:rPr>
+              <ns0:t>Strut Retaining Pins</ns0:t>
+            </ns0:r>
+          </ns0:p>
+        </ns0:tc>
+        <ns0:tc>
+          <ns0:tcPr>
+            <ns0:tcW ns0:w="3800" ns0:type="dxa"/>
+          </ns0:tcPr>
+          <ns0:p>
+            <ns0:r>
+              <ns0:t>1/4" or 5/16" Wire lock hitch pins for 2-piece strut joint</ns0:t>
+            </ns0:r>
+          </ns0:p>
+        </ns0:tc>
+        <ns0:tc>
+          <ns0:tcPr>
+            <ns0:tcW ns0:w="1200" ns0:type="dxa"/>
+          </ns0:tcPr>
+          <ns0:p>
+            <ns0:r>
+              <ns0:t>2 pcs</ns0:t>
+            </ns0:r>
+          </ns0:p>
+        </ns0:tc>
+        <ns0:tc>
+          <ns0:tcPr>
+            <ns0:tcW ns0:w="1960" ns0:type="dxa"/>
+          </ns0:tcPr>
+          <ns0:p>
+            <ns0:r>
+              <ns0:t>Hardware stock; stowed in cart tote</ns0:t>
+            </ns0:r>
+          </ns0:p>
+        </ns0:tc>
+      </ns0:tr>
+      <ns0:tr>
+        <ns0:tc>
+          <ns0:tcPr>
+            <ns0:tcW ns0:w="2400" ns0:type="dxa"/>
+          </ns0:tcPr>
+          <ns0:p>
+            <ns0:r>
+              <ns0:rPr>
+                <ns0:b/>
+              </ns0:rPr>
+              <ns0:t>Protective Tennis Balls</ns0:t>
+            </ns0:r>
+          </ns0:p>
+        </ns0:tc>
+        <ns0:tc>
+          <ns0:tcPr>
+            <ns0:tcW ns0:w="3800" ns0:type="dxa"/>
+          </ns0:tcPr>
+          <ns0:p>
+            <ns0:r>
+              <ns0:t>Standard tennis balls with cut hole (protective caps for upper strut ends)</ns0:t>
+            </ns0:r>
+          </ns0:p>
+        </ns0:tc>
+        <ns0:tc>
+          <ns0:tcPr>
+            <ns0:tcW ns0:w="1200" ns0:type="dxa"/>
+          </ns0:tcPr>
+          <ns0:p>
+            <ns0:r>
+              <ns0:t>2 pcs</ns0:t>
+            </ns0:r>
+          </ns0:p>
+        </ns0:tc>
+        <ns0:tc>
+          <ns0:tcPr>
+            <ns0:tcW ns0:w="1960" ns0:type="dxa"/>
+          </ns0:tcPr>
+          <ns0:p>
+            <ns0:r>
+              <ns0:t>Pit crew equipment; protects vinyl banner</ns0:t>
+            </ns0:r>
+          </ns0:p>
+        </ns0:tc>
+      </ns0:tr>
     </ns0:tbl>
     <ns0:p>
       <ns0:pPr>
@@ -4385,6 +4592,9 @@
       </ns0:r>
       <ns0:r>
         <ns0:t xml:space="preserve">Mount upper tension bands on the vertical posts using the 3D-printed Strut Bracket Marker template (Index [12]). Bolt the upper strut end caps to the tension bands. Anchor the lower strut end caps to the rear 2x4 cart framing with heavy-duty steel U-bolts (Index [7]) as shown in Figure 8.</ns0:t>
+      </ns0:r>
+      <ns0:r>
+        <ns0:t xml:space="preserve"> In production, each diagonal strut is fabricated as a two-piece modular assembly with a mid-span sleeved joint and drilled retaining pin hole (secured with a quick-release wire-lock pin). This enables rapid separation during trailer loading, allowing the lower arm to fold flat onto the cart while the upper arm remains on the frame with a protective tennis ball cap.</ns0:t>
       </ns0:r>
     </ns0:p>
     <ns0:p>

</xml_diff>

<commit_message>
feat(pchsmb): add Appendix C one-page operations summary placard with 4x6 drill card space
</commit_message>
<xml_diff>
--- a/PCHSMB/_Backdrop/docs/Backdrop_Assembly_Guide.docx
+++ b/PCHSMB/_Backdrop/docs/Backdrop_Assembly_Guide.docx
@@ -254,7 +254,7 @@
         <ns0:pStyle ns0:val="OverviewLead"/>
       </ns0:pPr>
       <ns0:r>
-        <ns0:t xml:space="preserve">This master manual is organized as two independently printable appendices under one controlled revision history. The complete package contains the system overview, field operations procedures, 2026 competition rules compliance, construction instructions, and purchasing index for the Pine Creek High School Marching Band rolling backdrop prop.</ns0:t>
+        <ns0:t xml:space="preserve">This master manual is organized as three independently printable appendices under one controlled revision history. The complete package contains the system overview, field operations procedures, 2026 competition rules compliance, construction instructions, and purchasing index for the Pine Creek High School Marching Band rolling backdrop prop.</ns0:t>
       </ns0:r>
     </ns0:p>
     <ns0:p>
@@ -334,6 +334,23 @@
     <ns0:p>
       <ns0:r>
         <ns0:t xml:space="preserve">Covers workshop safety, materials, 2x4 rolling cart base fabrication, decking and 3/4-inch ballast post flange installation, 1-5/8 in. steel pipe upright frame assembly, diagonal support strut pre-drilling and mounting, vinyl banner installation with snap clamps, inspection checklist, and source lookup. Intended for fabrication volunteers and workshop build teams.</ns0:t>
+      </ns0:r>
+    </ns0:p>
+    <ns0:p>
+      <ns0:pPr>
+        <ns0:pStyle ns0:val="Heading2"/>
+        <ns0:spacing ns0:before="120" ns0:after="40"/>
+      </ns0:pPr>
+      <ns0:r>
+        <ns0:t>Appendix C: Field Operations Placard</ns0:t>
+      </ns0:r>
+    </ns0:p>
+    <ns0:p>
+      <ns0:pPr>
+        <ns0:spacing ns0:before="0" ns0:after="80"/>
+      </ns0:pPr>
+      <ns0:r>
+        <ns0:t>A dedicated one-page quick-reference sheet designed to be printed, laminated, and attached directly to each backdrop cart for instant field reference by trained student handlers and parent pit crew. Contains the tiered wind limits and ballast schedule, emergency abort rules, rapid assembly/teardown steps, and a dedicated 4" × 6" space for each prop's show drill coordinate diagram.</ns0:t>
       </ns0:r>
     </ns0:p>
     <ns0:p>
@@ -6104,6 +6121,805 @@
         </ns0:r>
       </ns0:hyperlink>
     </ns0:p>
+    <ns0:p>
+      <ns0:pPr>
+        <ns0:pStyle ns0:val="Heading1"/>
+        <ns0:pageBreakBefore/>
+        <ns0:spacing ns0:before="0" ns0:after="40"/>
+        <ns0:jc ns0:val="center"/>
+      </ns0:pPr>
+      <ns0:r>
+        <ns0:rPr>
+          <ns0:b/>
+          <ns0:sz ns0:val="24"/>
+          <ns0:color ns0:val="1A365D"/>
+        </ns0:rPr>
+        <ns0:t>APPENDIX C: FIELD OPERATIONS PLACARD</ns0:t>
+      </ns0:r>
+    </ns0:p>
+    <ns0:p>
+      <ns0:pPr>
+        <ns0:spacing ns0:before="0" ns0:after="60"/>
+        <ns0:jc ns0:val="center"/>
+      </ns0:pPr>
+      <ns0:r>
+        <ns0:rPr>
+          <ns0:i/>
+          <ns0:sz ns0:val="17"/>
+          <ns0:color ns0:val="4A5568"/>
+        </ns0:rPr>
+        <ns0:t>One-Page Laminated Field Reference for Trained Student Handlers &amp; Parent Pit Crew</ns0:t>
+      </ns0:r>
+    </ns0:p>
+    <ns0:tbl>
+      <ns0:tblPr>
+        <ns0:tblW ns0:w="9360" ns0:type="dxa"/>
+        <ns0:jc ns0:val="center"/>
+        <ns0:tblBorders>
+          <ns0:top ns0:val="dashed" ns0:sz="6" ns0:space="0" ns0:color="718096"/>
+          <ns0:left ns0:val="dashed" ns0:sz="6" ns0:space="0" ns0:color="718096"/>
+          <ns0:bottom ns0:val="dashed" ns0:sz="6" ns0:space="0" ns0:color="718096"/>
+          <ns0:right ns0:val="dashed" ns0:sz="6" ns0:space="0" ns0:color="718096"/>
+        </ns0:tblBorders>
+      </ns0:tblPr>
+      <ns0:tr>
+        <ns0:trPr>
+          <ns0:trHeight ns0:val="3400" ns0:hRule="exact"/>
+        </ns0:trPr>
+        <ns0:tc>
+          <ns0:tcPr>
+            <ns0:tcW ns0:w="9360" ns0:type="dxa"/>
+            <ns0:tcMar>
+              <ns0:top ns0:w="120" ns0:type="dxa"/>
+              <ns0:left ns0:w="180" ns0:type="dxa"/>
+              <ns0:bottom ns0:w="120" ns0:type="dxa"/>
+              <ns0:right ns0:w="180" ns0:type="dxa"/>
+            </ns0:tcMar>
+            <ns0:shd ns0:val="clear" ns0:color="auto" ns0:fill="F7FAFC"/>
+            <ns0:vAlign ns0:val="center"/>
+          </ns0:tcPr>
+          <ns0:p>
+            <ns0:pPr>
+              <ns0:spacing ns0:before="0" ns0:after="40"/>
+              <ns0:jc ns0:val="center"/>
+            </ns0:pPr>
+            <ns0:r>
+              <ns0:rPr>
+                <ns0:b/>
+                <ns0:sz ns0:val="19"/>
+                <ns0:color ns0:val="2D3748"/>
+              </ns0:rPr>
+              <ns0:t>ATTACH 4" × 6" FIELD PLACEMENT / DRILL COORDINATE CARD HERE</ns0:t>
+            </ns0:r>
+          </ns0:p>
+          <ns0:p>
+            <ns0:pPr>
+              <ns0:spacing ns0:before="0" ns0:after="40"/>
+              <ns0:jc ns0:val="center"/>
+            </ns0:pPr>
+            <ns0:r>
+              <ns0:rPr>
+                <ns0:sz ns0:val="17"/>
+                <ns0:color ns0:val="718096"/>
+              </ns0:rPr>
+              <ns0:t>(Affix laminated 4x6 printout showing field drill coordinate, yard line, and hash alignment for this prop)</ns0:t>
+            </ns0:r>
+          </ns0:p>
+          <ns0:p>
+            <ns0:pPr>
+              <ns0:spacing ns0:before="60" ns0:after="20"/>
+              <ns0:jc ns0:val="center"/>
+            </ns0:pPr>
+            <ns0:r>
+              <ns0:rPr>
+                <ns0:b/>
+                <ns0:sz ns0:val="17"/>
+              </ns0:rPr>
+              <ns0:t xml:space="preserve">Prop Number: ________   |   Field Coordinate: ________________________   |   Show Side: [  ] Side 1 (Left)   [  ] Side 2 (Right)</ns0:t>
+            </ns0:r>
+          </ns0:p>
+          <ns0:p>
+            <ns0:pPr>
+              <ns0:spacing ns0:before="20" ns0:after="0"/>
+              <ns0:jc ns0:val="center"/>
+            </ns0:pPr>
+            <ns0:r>
+              <ns0:rPr>
+                <ns0:sz ns0:val="16"/>
+                <ns0:color ns0:val="4A5568"/>
+              </ns0:rPr>
+              <ns0:t xml:space="preserve">Assigned Handlers: 1) __________________________________   2) __________________________________</ns0:t>
+            </ns0:r>
+          </ns0:p>
+        </ns0:tc>
+      </ns0:tr>
+    </ns0:tbl>
+    <ns0:p>
+      <ns0:pPr>
+        <ns0:pStyle ns0:val="Heading2"/>
+        <ns0:spacing ns0:before="80" ns0:after="30"/>
+      </ns0:pPr>
+      <ns0:r>
+        <ns0:rPr>
+          <ns0:b/>
+          <ns0:sz ns0:val="19"/>
+          <ns0:color ns0:val="1A365D"/>
+        </ns0:rPr>
+        <ns0:t>1. Wind Velocity Limits &amp; Standardized Ballasting Schedule</ns0:t>
+      </ns0:r>
+    </ns0:p>
+    <ns0:tbl>
+      <ns0:tblPr>
+        <ns0:tblW ns0:w="9360" ns0:type="dxa"/>
+        <ns0:jc ns0:val="center"/>
+        <ns0:tblBorders>
+          <ns0:top ns0:val="single" ns0:sz="4" ns0:space="0" ns0:color="CBD5E0"/>
+          <ns0:left ns0:val="single" ns0:sz="4" ns0:space="0" ns0:color="CBD5E0"/>
+          <ns0:bottom ns0:val="single" ns0:sz="4" ns0:space="0" ns0:color="CBD5E0"/>
+          <ns0:right ns0:val="single" ns0:sz="4" ns0:space="0" ns0:color="CBD5E0"/>
+          <ns0:insideH ns0:val="single" ns0:sz="4" ns0:space="0" ns0:color="CBD5E0"/>
+          <ns0:insideV ns0:val="single" ns0:sz="4" ns0:space="0" ns0:color="CBD5E0"/>
+        </ns0:tblBorders>
+      </ns0:tblPr>
+      <ns0:tr>
+        <ns0:trPr>
+          <ns0:tblHeader/>
+        </ns0:trPr>
+        <ns0:tc>
+          <ns0:tcPr>
+            <ns0:tcW ns0:w="1500" ns0:type="dxa"/>
+            <ns0:shd ns0:val="clear" ns0:color="auto" ns0:fill="EDF2F7"/>
+          </ns0:tcPr>
+          <ns0:p>
+            <ns0:pPr>
+              <ns0:spacing ns0:before="20" ns0:after="20"/>
+            </ns0:pPr>
+            <ns0:r>
+              <ns0:rPr>
+                <ns0:b/>
+                <ns0:sz ns0:val="16"/>
+              </ns0:rPr>
+              <ns0:t>Tier / State</ns0:t>
+            </ns0:r>
+          </ns0:p>
+        </ns0:tc>
+        <ns0:tc>
+          <ns0:tcPr>
+            <ns0:tcW ns0:w="1600" ns0:type="dxa"/>
+            <ns0:shd ns0:val="clear" ns0:color="auto" ns0:fill="EDF2F7"/>
+          </ns0:tcPr>
+          <ns0:p>
+            <ns0:pPr>
+              <ns0:spacing ns0:before="20" ns0:after="20"/>
+            </ns0:pPr>
+            <ns0:r>
+              <ns0:rPr>
+                <ns0:b/>
+                <ns0:sz ns0:val="16"/>
+              </ns0:rPr>
+              <ns0:t>Wind Velocity</ns0:t>
+            </ns0:r>
+          </ns0:p>
+        </ns0:tc>
+        <ns0:tc>
+          <ns0:tcPr>
+            <ns0:tcW ns0:w="2660" ns0:type="dxa"/>
+            <ns0:shd ns0:val="clear" ns0:color="auto" ns0:fill="EDF2F7"/>
+          </ns0:tcPr>
+          <ns0:p>
+            <ns0:pPr>
+              <ns0:spacing ns0:before="20" ns0:after="20"/>
+            </ns0:pPr>
+            <ns0:r>
+              <ns0:rPr>
+                <ns0:b/>
+                <ns0:sz ns0:val="16"/>
+              </ns0:rPr>
+              <ns0:t>Ballast Deployment (15-lb Bags)</ns0:t>
+            </ns0:r>
+          </ns0:p>
+        </ns0:tc>
+        <ns0:tc>
+          <ns0:tcPr>
+            <ns0:tcW ns0:w="1100" ns0:type="dxa"/>
+            <ns0:shd ns0:val="clear" ns0:color="auto" ns0:fill="EDF2F7"/>
+          </ns0:tcPr>
+          <ns0:p>
+            <ns0:pPr>
+              <ns0:spacing ns0:before="20" ns0:after="20"/>
+            </ns0:pPr>
+            <ns0:r>
+              <ns0:rPr>
+                <ns0:b/>
+                <ns0:sz ns0:val="16"/>
+              </ns0:rPr>
+              <ns0:t>Total Wt</ns0:t>
+            </ns0:r>
+          </ns0:p>
+        </ns0:tc>
+        <ns0:tc>
+          <ns0:tcPr>
+            <ns0:tcW ns0:w="2500" ns0:type="dxa"/>
+            <ns0:shd ns0:val="clear" ns0:color="auto" ns0:fill="EDF2F7"/>
+          </ns0:tcPr>
+          <ns0:p>
+            <ns0:pPr>
+              <ns0:spacing ns0:before="20" ns0:after="20"/>
+            </ns0:pPr>
+            <ns0:r>
+              <ns0:rPr>
+                <ns0:b/>
+                <ns0:sz ns0:val="16"/>
+              </ns0:rPr>
+              <ns0:t>Operational Limits &amp; Action</ns0:t>
+            </ns0:r>
+          </ns0:p>
+        </ns0:tc>
+      </ns0:tr>
+      <ns0:tr>
+        <ns0:tc>
+          <ns0:tcPr>
+            <ns0:tcW ns0:w="1500" ns0:type="dxa"/>
+          </ns0:tcPr>
+          <ns0:p>
+            <ns0:pPr>
+              <ns0:spacing ns0:before="15" ns0:after="15"/>
+            </ns0:pPr>
+            <ns0:r>
+              <ns0:rPr>
+                <ns0:b/>
+                <ns0:sz ns0:val="15"/>
+              </ns0:rPr>
+              <ns0:t>Tier 0: Calm</ns0:t>
+            </ns0:r>
+          </ns0:p>
+        </ns0:tc>
+        <ns0:tc>
+          <ns0:tcPr>
+            <ns0:tcW ns0:w="1600" ns0:type="dxa"/>
+          </ns0:tcPr>
+          <ns0:p>
+            <ns0:pPr>
+              <ns0:spacing ns0:before="15" ns0:after="15"/>
+            </ns0:pPr>
+            <ns0:r>
+              <ns0:rPr>
+                <ns0:sz ns0:val="15"/>
+              </ns0:rPr>
+              <ns0:t>0–8 mph (gusts ≤10)</ns0:t>
+            </ns0:r>
+          </ns0:p>
+        </ns0:tc>
+        <ns0:tc>
+          <ns0:tcPr>
+            <ns0:tcW ns0:w="2660" ns0:type="dxa"/>
+          </ns0:tcPr>
+          <ns0:p>
+            <ns0:pPr>
+              <ns0:spacing ns0:before="15" ns0:after="15"/>
+            </ns0:pPr>
+            <ns0:r>
+              <ns0:rPr>
+                <ns0:sz ns0:val="15"/>
+              </ns0:rPr>
+              <ns0:t>0 bags (unballasted)</ns0:t>
+            </ns0:r>
+          </ns0:p>
+        </ns0:tc>
+        <ns0:tc>
+          <ns0:tcPr>
+            <ns0:tcW ns0:w="1100" ns0:type="dxa"/>
+          </ns0:tcPr>
+          <ns0:p>
+            <ns0:pPr>
+              <ns0:spacing ns0:before="15" ns0:after="15"/>
+            </ns0:pPr>
+            <ns0:r>
+              <ns0:rPr>
+                <ns0:sz ns0:val="15"/>
+              </ns0:rPr>
+              <ns0:t>153 lbs</ns0:t>
+            </ns0:r>
+          </ns0:p>
+        </ns0:tc>
+        <ns0:tc>
+          <ns0:tcPr>
+            <ns0:tcW ns0:w="2500" ns0:type="dxa"/>
+          </ns0:tcPr>
+          <ns0:p>
+            <ns0:pPr>
+              <ns0:spacing ns0:before="15" ns0:after="15"/>
+            </ns0:pPr>
+            <ns0:r>
+              <ns0:rPr>
+                <ns0:sz ns0:val="15"/>
+              </ns0:rPr>
+              <ns0:t>Safe to 8 mph (10 gust max). Must upgrade to Tier 1 if wind &gt;8 mph.</ns0:t>
+            </ns0:r>
+          </ns0:p>
+        </ns0:tc>
+      </ns0:tr>
+      <ns0:tr>
+        <ns0:tc>
+          <ns0:tcPr>
+            <ns0:tcW ns0:w="1500" ns0:type="dxa"/>
+          </ns0:tcPr>
+          <ns0:p>
+            <ns0:pPr>
+              <ns0:spacing ns0:before="15" ns0:after="15"/>
+            </ns0:pPr>
+            <ns0:r>
+              <ns0:rPr>
+                <ns0:b/>
+                <ns0:sz ns0:val="15"/>
+              </ns0:rPr>
+              <ns0:t>Tier 1: Normal</ns0:t>
+            </ns0:r>
+          </ns0:p>
+        </ns0:tc>
+        <ns0:tc>
+          <ns0:tcPr>
+            <ns0:tcW ns0:w="1600" ns0:type="dxa"/>
+          </ns0:tcPr>
+          <ns0:p>
+            <ns0:pPr>
+              <ns0:spacing ns0:before="15" ns0:after="15"/>
+            </ns0:pPr>
+            <ns0:r>
+              <ns0:rPr>
+                <ns0:sz ns0:val="15"/>
+              </ns0:rPr>
+              <ns0:t>8–12 mph</ns0:t>
+            </ns0:r>
+          </ns0:p>
+        </ns0:tc>
+        <ns0:tc>
+          <ns0:tcPr>
+            <ns0:tcW ns0:w="2660" ns0:type="dxa"/>
+          </ns0:tcPr>
+          <ns0:p>
+            <ns0:pPr>
+              <ns0:spacing ns0:before="15" ns0:after="15"/>
+            </ns0:pPr>
+            <ns0:r>
+              <ns0:rPr>
+                <ns0:sz ns0:val="15"/>
+              </ns0:rPr>
+              <ns0:t>4x bags (2 per wing post; 60 lb ballast)</ns0:t>
+            </ns0:r>
+          </ns0:p>
+        </ns0:tc>
+        <ns0:tc>
+          <ns0:tcPr>
+            <ns0:tcW ns0:w="1100" ns0:type="dxa"/>
+          </ns0:tcPr>
+          <ns0:p>
+            <ns0:pPr>
+              <ns0:spacing ns0:before="15" ns0:after="15"/>
+            </ns0:pPr>
+            <ns0:r>
+              <ns0:rPr>
+                <ns0:sz ns0:val="15"/>
+              </ns0:rPr>
+              <ns0:t>213 lbs</ns0:t>
+            </ns0:r>
+          </ns0:p>
+        </ns0:tc>
+        <ns0:tc>
+          <ns0:tcPr>
+            <ns0:tcW ns0:w="2500" ns0:type="dxa"/>
+          </ns0:tcPr>
+          <ns0:p>
+            <ns0:pPr>
+              <ns0:spacing ns0:before="15" ns0:after="15"/>
+            </ns0:pPr>
+            <ns0:r>
+              <ns0:rPr>
+                <ns0:sz ns0:val="15"/>
+              </ns0:rPr>
+              <ns0:t>Standard field staging. 16.9 mph max gust. Zero turf compaction.</ns0:t>
+            </ns0:r>
+          </ns0:p>
+        </ns0:tc>
+      </ns0:tr>
+      <ns0:tr>
+        <ns0:tc>
+          <ns0:tcPr>
+            <ns0:tcW ns0:w="1500" ns0:type="dxa"/>
+          </ns0:tcPr>
+          <ns0:p>
+            <ns0:pPr>
+              <ns0:spacing ns0:before="15" ns0:after="15"/>
+            </ns0:pPr>
+            <ns0:r>
+              <ns0:rPr>
+                <ns0:b/>
+                <ns0:sz ns0:val="15"/>
+              </ns0:rPr>
+              <ns0:t>Tier 2: Advisory</ns0:t>
+            </ns0:r>
+          </ns0:p>
+        </ns0:tc>
+        <ns0:tc>
+          <ns0:tcPr>
+            <ns0:tcW ns0:w="1600" ns0:type="dxa"/>
+          </ns0:tcPr>
+          <ns0:p>
+            <ns0:pPr>
+              <ns0:spacing ns0:before="15" ns0:after="15"/>
+            </ns0:pPr>
+            <ns0:r>
+              <ns0:rPr>
+                <ns0:sz ns0:val="15"/>
+              </ns0:rPr>
+              <ns0:t>12–18 mph</ns0:t>
+            </ns0:r>
+          </ns0:p>
+        </ns0:tc>
+        <ns0:tc>
+          <ns0:tcPr>
+            <ns0:tcW ns0:w="2660" ns0:type="dxa"/>
+          </ns0:tcPr>
+          <ns0:p>
+            <ns0:pPr>
+              <ns0:spacing ns0:before="15" ns0:after="15"/>
+            </ns0:pPr>
+            <ns0:r>
+              <ns0:rPr>
+                <ns0:sz ns0:val="15"/>
+              </ns0:rPr>
+              <ns0:t>6x bags (3 per wing post; 90 lb ballast)</ns0:t>
+            </ns0:r>
+          </ns0:p>
+        </ns0:tc>
+        <ns0:tc>
+          <ns0:tcPr>
+            <ns0:tcW ns0:w="1100" ns0:type="dxa"/>
+          </ns0:tcPr>
+          <ns0:p>
+            <ns0:pPr>
+              <ns0:spacing ns0:before="15" ns0:after="15"/>
+            </ns0:pPr>
+            <ns0:r>
+              <ns0:rPr>
+                <ns0:sz ns0:val="15"/>
+              </ns0:rPr>
+              <ns0:t>243 lbs</ns0:t>
+            </ns0:r>
+          </ns0:p>
+        </ns0:tc>
+        <ns0:tc>
+          <ns0:tcPr>
+            <ns0:tcW ns0:w="2500" ns0:type="dxa"/>
+          </ns0:tcPr>
+          <ns0:p>
+            <ns0:pPr>
+              <ns0:spacing ns0:before="15" ns0:after="15"/>
+            </ns0:pPr>
+            <ns0:r>
+              <ns0:rPr>
+                <ns0:sz ns0:val="15"/>
+              </ns0:rPr>
+              <ns0:t>Attentive staging. 18.4 mph max gust. Deploy ground wheel chocks.</ns0:t>
+            </ns0:r>
+          </ns0:p>
+        </ns0:tc>
+      </ns0:tr>
+      <ns0:tr>
+        <ns0:tc>
+          <ns0:tcPr>
+            <ns0:tcW ns0:w="1500" ns0:type="dxa"/>
+          </ns0:tcPr>
+          <ns0:p>
+            <ns0:pPr>
+              <ns0:spacing ns0:before="15" ns0:after="15"/>
+            </ns0:pPr>
+            <ns0:r>
+              <ns0:rPr>
+                <ns0:b/>
+                <ns0:sz ns0:val="15"/>
+              </ns0:rPr>
+              <ns0:t>Tier 3: High-Wind</ns0:t>
+            </ns0:r>
+          </ns0:p>
+        </ns0:tc>
+        <ns0:tc>
+          <ns0:tcPr>
+            <ns0:tcW ns0:w="1600" ns0:type="dxa"/>
+          </ns0:tcPr>
+          <ns0:p>
+            <ns0:pPr>
+              <ns0:spacing ns0:before="15" ns0:after="15"/>
+            </ns0:pPr>
+            <ns0:r>
+              <ns0:rPr>
+                <ns0:sz ns0:val="15"/>
+              </ns0:rPr>
+              <ns0:t>18–22 mph</ns0:t>
+            </ns0:r>
+          </ns0:p>
+        </ns0:tc>
+        <ns0:tc>
+          <ns0:tcPr>
+            <ns0:tcW ns0:w="2660" ns0:type="dxa"/>
+          </ns0:tcPr>
+          <ns0:p>
+            <ns0:pPr>
+              <ns0:spacing ns0:before="15" ns0:after="15"/>
+            </ns0:pPr>
+            <ns0:r>
+              <ns0:rPr>
+                <ns0:sz ns0:val="15"/>
+              </ns0:rPr>
+              <ns0:t>6 on wings + 3 across rear rail A (135 lb)</ns0:t>
+            </ns0:r>
+          </ns0:p>
+        </ns0:tc>
+        <ns0:tc>
+          <ns0:tcPr>
+            <ns0:tcW ns0:w="1100" ns0:type="dxa"/>
+          </ns0:tcPr>
+          <ns0:p>
+            <ns0:pPr>
+              <ns0:spacing ns0:before="15" ns0:after="15"/>
+            </ns0:pPr>
+            <ns0:r>
+              <ns0:rPr>
+                <ns0:sz ns0:val="15"/>
+              </ns0:rPr>
+              <ns0:t>288 lbs</ns0:t>
+            </ns0:r>
+          </ns0:p>
+        </ns0:tc>
+        <ns0:tc>
+          <ns0:tcPr>
+            <ns0:tcW ns0:w="2500" ns0:type="dxa"/>
+          </ns0:tcPr>
+          <ns0:p>
+            <ns0:pPr>
+              <ns0:spacing ns0:before="15" ns0:after="15"/>
+            </ns0:pPr>
+            <ns0:r>
+              <ns0:rPr>
+                <ns0:sz ns0:val="15"/>
+              </ns0:rPr>
+              <ns0:t>22.5 mph max gust. Rear rail doubles leverage. Max safe turf load.</ns0:t>
+            </ns0:r>
+          </ns0:p>
+        </ns0:tc>
+      </ns0:tr>
+      <ns0:tr>
+        <ns0:tc>
+          <ns0:tcPr>
+            <ns0:tcW ns0:w="1500" ns0:type="dxa"/>
+          </ns0:tcPr>
+          <ns0:p>
+            <ns0:pPr>
+              <ns0:spacing ns0:before="15" ns0:after="15"/>
+            </ns0:pPr>
+            <ns0:r>
+              <ns0:rPr>
+                <ns0:b/>
+                <ns0:sz ns0:val="15"/>
+                <ns0:color ns0:val="C53030"/>
+              </ns0:rPr>
+              <ns0:t>Tier 4: ABORT</ns0:t>
+            </ns0:r>
+          </ns0:p>
+        </ns0:tc>
+        <ns0:tc>
+          <ns0:tcPr>
+            <ns0:tcW ns0:w="1600" ns0:type="dxa"/>
+          </ns0:tcPr>
+          <ns0:p>
+            <ns0:pPr>
+              <ns0:spacing ns0:before="15" ns0:after="15"/>
+            </ns0:pPr>
+            <ns0:r>
+              <ns0:rPr>
+                <ns0:b/>
+                <ns0:sz ns0:val="15"/>
+                <ns0:color ns0:val="C53030"/>
+              </ns0:rPr>
+              <ns0:t>&gt;20 sust. / &gt;25 gust</ns0:t>
+            </ns0:r>
+          </ns0:p>
+        </ns0:tc>
+        <ns0:tc>
+          <ns0:tcPr>
+            <ns0:tcW ns0:w="2660" ns0:type="dxa"/>
+          </ns0:tcPr>
+          <ns0:p>
+            <ns0:pPr>
+              <ns0:spacing ns0:before="15" ns0:after="15"/>
+            </ns0:pPr>
+            <ns0:r>
+              <ns0:rPr>
+                <ns0:sz ns0:val="15"/>
+              </ns0:rPr>
+              <ns0:t>—</ns0:t>
+            </ns0:r>
+          </ns0:p>
+        </ns0:tc>
+        <ns0:tc>
+          <ns0:tcPr>
+            <ns0:tcW ns0:w="1100" ns0:type="dxa"/>
+          </ns0:tcPr>
+          <ns0:p>
+            <ns0:pPr>
+              <ns0:spacing ns0:before="15" ns0:after="15"/>
+            </ns0:pPr>
+            <ns0:r>
+              <ns0:rPr>
+                <ns0:sz ns0:val="15"/>
+              </ns0:rPr>
+              <ns0:t>—</ns0:t>
+            </ns0:r>
+          </ns0:p>
+        </ns0:tc>
+        <ns0:tc>
+          <ns0:tcPr>
+            <ns0:tcW ns0:w="2500" ns0:type="dxa"/>
+          </ns0:tcPr>
+          <ns0:p>
+            <ns0:pPr>
+              <ns0:spacing ns0:before="15" ns0:after="15"/>
+            </ns0:pPr>
+            <ns0:r>
+              <ns0:rPr>
+                <ns0:b/>
+                <ns0:sz ns0:val="15"/>
+                <ns0:color ns0:val="C53030"/>
+              </ns0:rPr>
+              <ns0:t>STRICT SAFETY NO-GO. Withdraw props or immediately lay flat.</ns0:t>
+            </ns0:r>
+          </ns0:p>
+        </ns0:tc>
+      </ns0:tr>
+    </ns0:tbl>
+    <ns0:p>
+      <ns0:pPr>
+        <ns0:pStyle ns0:val="Heading2"/>
+        <ns0:spacing ns0:before="60" ns0:after="20"/>
+      </ns0:pPr>
+      <ns0:r>
+        <ns0:rPr>
+          <ns0:b/>
+          <ns0:sz ns0:val="19"/>
+          <ns0:color ns0:val="1A365D"/>
+        </ns0:rPr>
+        <ns0:t>2. Critical On-Field Safety &amp; Turf Protection Rules</ns0:t>
+      </ns0:r>
+    </ns0:p>
+    <ns0:p>
+      <ns0:pPr>
+        <ns0:spacing ns0:before="10" ns0:after="10"/>
+        <ns0:ind ns0:left="360" ns0:hanging="240"/>
+      </ns0:pPr>
+      <ns0:r>
+        <ns0:rPr>
+          <ns0:b/>
+          <ns0:sz ns0:val="15"/>
+        </ns0:rPr>
+        <ns0:t xml:space="preserve">• Non-Locking Casters &amp; Ground Chocking: </ns0:t>
+      </ns0:r>
+      <ns0:r>
+        <ns0:rPr>
+          <ns0:sz ns0:val="15"/>
+        </ns0:rPr>
+        <ns0:t>Carts use non-locking swivel casters for rapid rolling agility. When positioned at drill coordinates in breezy conditions, place extra double-bagged 15-lb sandbags on the turf firmly against wheels as wheel chocks to prevent roll drift.</ns0:t>
+      </ns0:r>
+    </ns0:p>
+    <ns0:p>
+      <ns0:pPr>
+        <ns0:spacing ns0:before="10" ns0:after="10"/>
+        <ns0:ind ns0:left="360" ns0:hanging="240"/>
+      </ns0:pPr>
+      <ns0:r>
+        <ns0:rPr>
+          <ns0:b/>
+          <ns0:sz ns0:val="15"/>
+        </ns0:rPr>
+        <ns0:t xml:space="preserve">• Hand Placement &amp; Low Leverage: </ns0:t>
+      </ns0:r>
+      <ns0:r>
+        <ns0:rPr>
+          <ns0:sz ns0:val="15"/>
+        </ns0:rPr>
+        <ns0:t>Always push from the lower 2x4 wooden cart base framing. NEVER push, pull, or climb on the upright steel pipes or diagonal struts, which introduces severe overturning tipping leverage.</ns0:t>
+      </ns0:r>
+    </ns0:p>
+    <ns0:p>
+      <ns0:pPr>
+        <ns0:spacing ns0:before="10" ns0:after="10"/>
+        <ns0:ind ns0:left="360" ns0:hanging="240"/>
+      </ns0:pPr>
+      <ns0:r>
+        <ns0:rPr>
+          <ns0:b/>
+          <ns0:sz ns0:val="15"/>
+        </ns0:rPr>
+        <ns0:t xml:space="preserve">• Mandatory Double-Bagging (Rule 8.05): </ns0:t>
+      </ns0:r>
+      <ns0:r>
+        <ns0:rPr>
+          <ns0:sz ns0:val="15"/>
+        </ns0:rPr>
+        <ns0:t>All 15-lb sandbags must have intact heavy-duty plastic inner liners. Never bring single-layer bags onto athletic turf. Carts must not exceed 300 lbs total (~75 lb/wheel) to prevent rubber infill rutting.</ns0:t>
+      </ns0:r>
+    </ns0:p>
+    <ns0:p>
+      <ns0:pPr>
+        <ns0:spacing ns0:before="10" ns0:after="10"/>
+        <ns0:ind ns0:left="360" ns0:hanging="240"/>
+      </ns0:pPr>
+      <ns0:r>
+        <ns0:rPr>
+          <ns0:b/>
+          <ns0:sz ns0:val="15"/>
+          <ns0:color ns0:val="C53030"/>
+        </ns0:rPr>
+        <ns0:t xml:space="preserve">• High-Wind Emergency Abort: </ns0:t>
+      </ns0:r>
+      <ns0:r>
+        <ns0:rPr>
+          <ns0:sz ns0:val="15"/>
+        </ns0:rPr>
+        <ns0:t>If severe gusts strike on-field, handlers immediately brace against the upwind 2x4 base. Authorized parent crew (with Rule 9.07 Field Pass wristbands) will assist to lay props flat on turf if ordered by directors.</ns0:t>
+      </ns0:r>
+    </ns0:p>
+    <ns0:p>
+      <ns0:pPr>
+        <ns0:pStyle ns0:val="Heading2"/>
+        <ns0:spacing ns0:before="60" ns0:after="20"/>
+      </ns0:pPr>
+      <ns0:r>
+        <ns0:rPr>
+          <ns0:b/>
+          <ns0:sz ns0:val="19"/>
+          <ns0:color ns0:val="1A365D"/>
+        </ns0:rPr>
+        <ns0:t>3. Rapid Field Assembly &amp; Teardown Checklist</ns0:t>
+      </ns0:r>
+    </ns0:p>
+    <ns0:p>
+      <ns0:pPr>
+        <ns0:spacing ns0:before="10" ns0:after="10"/>
+        <ns0:ind ns0:left="360" ns0:hanging="240"/>
+      </ns0:pPr>
+      <ns0:r>
+        <ns0:rPr>
+          <ns0:b/>
+          <ns0:sz ns0:val="15"/>
+        </ns0:rPr>
+        <ns0:t xml:space="preserve">• Unloading &amp; Staging (Reverse of Loading): </ns0:t>
+      </ns0:r>
+      <ns0:r>
+        <ns0:rPr>
+          <ns0:sz ns0:val="15"/>
+        </ns0:rPr>
+        <ns0:t>1) Unstrap carts from trailer nose wall &amp; lower from short ends; 2) Retrieve 10'×8' frames from cross support beams; 3) Pull off protective tennis balls from upper struts (stow in tote); 4) Rapidly bolt frame to cart using cordless power driver with socket; 5) Mate 2-piece struts and lock quick-release retaining pins; 6) Stage required ballast &amp; wheel chocks.</ns0:t>
+      </ns0:r>
+    </ns0:p>
+    <ns0:p>
+      <ns0:pPr>
+        <ns0:spacing ns0:before="10" ns0:after="0"/>
+        <ns0:ind ns0:left="360" ns0:hanging="240"/>
+      </ns0:pPr>
+      <ns0:r>
+        <ns0:rPr>
+          <ns0:b/>
+          <ns0:sz ns0:val="15"/>
+        </ns0:rPr>
+        <ns0:t xml:space="preserve">• Teardown &amp; Trailer Packing: </ns0:t>
+      </ns0:r>
+      <ns0:r>
+        <ns0:rPr>
+          <ns0:sz ns0:val="15"/>
+        </ns0:rPr>
+        <ns0:t>1) Immediate de-ballasting at stadium exit chute; 2) Stack sandbags low over trailer axles; 3) Pull strut retaining pins (stow in tote); 4) Lower strut arm folds flat on cart; 5) Install protective tennis balls over upper strut ends; 6) Unbolt frame using cordless power driver (stow bolts in tote); 7) Slide frames onto trailer cross beams; 8) Stand carts vertically on short ends strapped against front nose wall.</ns0:t>
+      </ns0:r>
+    </ns0:p>
     <ns0:sectPr>
       <ns0:headerReference ns0:type="default" ns4:id="rId1"/>
       <ns0:footerReference ns0:type="default" ns4:id="rId2"/>

</xml_diff>

<commit_message>
fix(pchsmb): update crew pairing to 'no fewer than two' and add steep ramp/tunnel handling rules in Backdrop D3
</commit_message>
<xml_diff>
--- a/PCHSMB/_Backdrop/docs/Backdrop_Assembly_Guide.docx
+++ b/PCHSMB/_Backdrop/docs/Backdrop_Assembly_Guide.docx
@@ -1075,10 +1075,10 @@
         <ns0:rPr>
           <ns0:b/>
         </ns0:rPr>
-        <ns0:t xml:space="preserve">Crew Pairing: </ns0:t>
-      </ns0:r>
-      <ns0:r>
-        <ns0:t xml:space="preserve">Exactly two student handlers are assigned to each backdrop cart, positioned on opposite outer end perimeter rails (B).</ns0:t>
+        <ns0:t xml:space="preserve">Crew Pairing &amp; Incline Safety: </ns0:t>
+      </ns0:r>
+      <ns0:r>
+        <ns0:t xml:space="preserve">No fewer than two student handlers are assigned to each backdrop cart under normal conditions, positioned on opposite outer end perimeter rails (B). During high-wind conditions or when navigating steep grades—such as the steep concrete tunnel entrance ramp at USAFA Falcon Stadium—additional student handlers (three to four students per cart) must be assigned to maintain positive braking, prevent runaway acceleration on downgrades, and provide adequate uphill momentum.</ns0:t>
       </ns0:r>
     </ns0:p>
     <ns0:p>
@@ -1214,10 +1214,10 @@
         <ns0:rPr>
           <ns0:b/>
         </ns0:rPr>
-        <ns0:t xml:space="preserve">Track &amp; Curb Crossovers: </ns0:t>
-      </ns0:r>
-      <ns0:r>
-        <ns0:t xml:space="preserve">Approach all running track crossings, track protector mats, and turf curb transitions square-on at a controlled walking pace. Both front casters MUST cross curbs simultaneously. Never approach curbs at an angle, which can bind casters or induce frame tipping.</ns0:t>
+        <ns0:t xml:space="preserve">Track, Curb &amp; Steep Ramp Transitions: </ns0:t>
+      </ns0:r>
+      <ns0:r>
+        <ns0:t xml:space="preserve">Approach all running track crossings, track protector mats, and turf curb transitions square-on at a controlled walking pace. Both front casters MUST cross curbs simultaneously. Never approach curbs at an angle, which can bind casters or induce frame tipping. When navigating steep slopes, stadium tunnels (such as Falcon Stadium), or windy ramps, deploy supplemental handlers to maintain positive deceleration control and prevent runaway roll.</ns0:t>
       </ns0:r>
     </ns0:p>
     <ns0:p>
@@ -2194,7 +2194,7 @@
         <ns0:t xml:space="preserve">Falcon Stadium Venue Update (2025/2026): </ns0:t>
       </ns0:r>
       <ns0:r>
-        <ns0:t xml:space="preserve">While the 9'6" tunnel restriction remains in the printed CBA rulebook, it has been rendered obsolete by stadium renovations completed prior to the 2025 season. The lower overhead crossbeam at the bottom of the Falcon Stadium tunnel was permanently removed, and these backdrop props cleared the tunnel entrance at their full upright height (~10.5 ft) without issue throughout the 2025 season.</ns0:t>
+        <ns0:t xml:space="preserve">While the 9'6" tunnel restriction remains in the printed CBA rulebook, it has been rendered obsolete by stadium renovations completed prior to the 2025 season. The lower overhead crossbeam at the bottom of the Falcon Stadium tunnel was permanently removed, and these backdrop props cleared the tunnel entrance at their full upright height (~10.5 ft) without issue throughout the 2025 season. However, the tunnel concrete ramp is exceptionally steep; crews must assign supplemental handlers (3–4 students per cart) rather than the standard two-student pairing to control cart descent and ascent.</ns0:t>
       </ns0:r>
     </ns0:p>
     <ns0:p>
@@ -6826,7 +6826,7 @@
         <ns0:rPr>
           <ns0:sz ns0:val="15"/>
         </ns0:rPr>
-        <ns0:t>Always push from the lower 2x4 wooden cart base framing. NEVER push, pull, or climb on the upright steel pipes or diagonal struts, which introduces severe overturning tipping leverage.</ns0:t>
+        <ns0:t>Always push from the lower 2x4 wooden cart base framing. NEVER push, pull, or climb on the upright steel pipes or diagonal struts, which introduces severe overturning tipping leverage. No fewer than 2 handlers per cart (assign 3–4 handlers for steep ramps like the Falcon Stadium tunnel or in high winds).</ns0:t>
       </ns0:r>
     </ns0:p>
     <ns0:p>

</xml_diff>

<commit_message>
feat(pchsmb): add continuous uphill egress, two-shot show staging, exact 6x4 placard box, and Appendix C.1 printable field drill card template
</commit_message>
<xml_diff>
--- a/PCHSMB/_Backdrop/docs/Backdrop_Assembly_Guide.docx
+++ b/PCHSMB/_Backdrop/docs/Backdrop_Assembly_Guide.docx
@@ -1032,10 +1032,10 @@
         <ns0:rPr>
           <ns0:b/>
         </ns0:rPr>
-        <ns0:t xml:space="preserve">Exit Catch Crew: </ns0:t>
-      </ns0:r>
-      <ns0:r>
-        <ns0:t xml:space="preserve">Position parent volunteers (holding official Field Pass wristbands per Rule 9.07) at the stadium exit gate to receive carts from students, assist with deceleration, remove ballast sandbags, and pack the trailer.</ns0:t>
+        <ns0:t xml:space="preserve">Exit Catch Crew &amp; Uphill Transit Assistance: </ns0:t>
+      </ns0:r>
+      <ns0:r>
+        <ns0:t xml:space="preserve">Position parent volunteers (holding official Field Pass wristbands per Rule 9.07) at the stadium exit gate to receive carts from student handlers, assist with deceleration, and join students in pushing the fully ballasted carts all the way up the stadium ramp/hill to the trailer staging lot. Props cannot be de-ballasted at the stadium exit chute due to continuous traffic flow regulations.</ns0:t>
       </ns0:r>
     </ns0:p>
     <ns0:p>
@@ -1256,10 +1256,10 @@
         <ns0:rPr>
           <ns0:b/>
         </ns0:rPr>
-        <ns0:t xml:space="preserve">Rapid Field Egress: </ns0:t>
-      </ns0:r>
-      <ns0:r>
-        <ns0:t xml:space="preserve">On the final performance cue, handlers place instruments in the tote, quickly lift any ground sandbag chocks onto the cart base or hand them to sideline crew, and push the carts in assigned exit order directly toward the exit gate. All props must maintain continuous movement off the field per Rule 8.05.</ns0:t>
+        <ns0:t xml:space="preserve">Rapid Field Egress &amp; Continuous Uphill Transit: </ns0:t>
+      </ns0:r>
+      <ns0:r>
+        <ns0:t xml:space="preserve">On the final performance cue, handlers place instruments into the tote, quickly lift any ground sandbag chocks onto the cart base or hand them to sideline parent crew, and push the carts in assigned exit order directly through the gate. Under CBA Rule 8.05, props must maintain continuous movement off the field and CANNOT be de-ballasted at the stadium exit chute or tunnel. Props remain fully ballasted (213–288 lbs) and are pushed all the way up the hill to the trailer staging lot. On steep inclines (such as USAFA Falcon Stadium), assign 3 to 4 student handlers per cart to maintain uphill momentum.</ns0:t>
       </ns0:r>
     </ns0:p>
     <ns0:p>
@@ -2248,10 +2248,10 @@
         <ns0:rPr>
           <ns0:b/>
         </ns0:rPr>
-        <ns0:t xml:space="preserve">Immediate De-Ballasting &amp; Chock Retrieval: </ns0:t>
-      </ns0:r>
-      <ns0:r>
-        <ns0:t>Remove all 15-lb sandbags from the 3/4" vertical wing posts, rear lumber framing rail, and ground wheel chocks at the stadium exit chute immediately following performance exit. Never transport carts in trailers or across curbs with ballast loaded on the posts or frame.</ns0:t>
+        <ns0:t xml:space="preserve">Continuous Egress &amp; Uphill Transit to Trailer: </ns0:t>
+      </ns0:r>
+      <ns0:r>
+        <ns0:t>Props CANNOT be de-ballasted at the stadium exit chute or concourse. Rule 8.05 requires continuous movement off the field, and stadium chutes must remain clear for following bands. Student handlers and parent crew push fully ballasted carts (213–288 lbs total) all the way up the hill/ramp to the equipment trailer staging lot. On steep inclines (such as Falcon Stadium), 3 to 4 handlers must be assigned per cart to ensure adequate pushing force and prevent rollbacks.</ns0:t>
       </ns0:r>
     </ns0:p>
     <ns0:p>
@@ -2269,10 +2269,10 @@
         <ns0:rPr>
           <ns0:b/>
         </ns0:rPr>
-        <ns0:t xml:space="preserve">Sandbag Trailer Staging: </ns0:t>
-      </ns0:r>
-      <ns0:r>
-        <ns0:t>Stack all de-ballasted sandbags low over the trailer axles on rubber floor mats to maintain a low trailer center of gravity and prevent shifting during road transit.</ns0:t>
+        <ns0:t xml:space="preserve">"Two-Shot" Competitions (Prelims &amp; Finals Inter-Show Staging): </ns0:t>
+      </ns0:r>
+      <ns0:r>
+        <ns0:t>Most marching band competitions feature an afternoon Preliminary contest followed by an evening Finals competition. Between shows, props remain staged in the trailer lot with all sandbag ballast left in place on the carts to minimize volunteer labor and avoid hardware wear. If wind gusts threaten during inter-show lot staging, crew lay the vinyl frames flat directly onto the carts by pulling the quick-release retaining pin from each two-piece diagonal support strut. This eliminates wind sail area while keeping props fully ballasted and ready for rapid re-erection before Finals.</ns0:t>
       </ns0:r>
     </ns0:p>
     <ns0:p>
@@ -2290,10 +2290,10 @@
         <ns0:rPr>
           <ns0:b/>
         </ns0:rPr>
-        <ns0:t xml:space="preserve">Two-Piece Strut Disassembly &amp; Pin Stowage: </ns0:t>
-      </ns0:r>
-      <ns0:r>
-        <ns0:t>Each diagonal support strut is a two-piece modular assembly. Pull the quick-release retaining pin holding the upper and lower strut pieces together. Stow the pins immediately in the hardware container inside the center HDX tough tote to prevent loss.</ns0:t>
+        <ns0:t xml:space="preserve">Final Teardown De-Ballasting (At Trailer Only): </ns0:t>
+      </ns0:r>
+      <ns0:r>
+        <ns0:t>Following the final performance of the day (or when preparing for trailer transport), remove all 15-lb sandbags at the trailer. Stack sandbags low over the trailer axles on rubber floor mats to maintain a low center of gravity and balanced axle load during transit.</ns0:t>
       </ns0:r>
     </ns0:p>
     <ns0:p>
@@ -2311,10 +2311,10 @@
         <ns0:rPr>
           <ns0:b/>
         </ns0:rPr>
-        <ns0:t xml:space="preserve">Strut Lower Arm Stowing &amp; Upper Arm Vinyl Protection (Tennis Balls): </ns0:t>
-      </ns0:r>
-      <ns0:r>
-        <ns0:t>Allow the lower half of each strut to pivot down flat against the cart decking (it remains anchored to the base U-bolt throughout transport). Install a standard tennis ball with a hole cut in it securely over the exposed open end of each upper strut arm (which remains attached to the vinyl frame upright). This cushioned ball prevents the metal tube end from puncturing, tearing, or abrading the printed scrim vinyl during transit and handling.</ns0:t>
+        <ns0:t xml:space="preserve">Two-Piece Strut Disassembly &amp; Pin Stowage: </ns0:t>
+      </ns0:r>
+      <ns0:r>
+        <ns0:t>Pull the quick-release wire-lock retaining pin holding the upper and lower strut sections together. Stow the pins immediately in the hardware container inside the center HDX tough tote to prevent loss during travel.</ns0:t>
       </ns0:r>
     </ns0:p>
     <ns0:p>
@@ -2332,10 +2332,10 @@
         <ns0:rPr>
           <ns0:b/>
         </ns0:rPr>
-        <ns0:t xml:space="preserve">Rapid Frame-to-Cart Unbolting (Power Driver Recommended): </ns0:t>
-      </ns0:r>
-      <ns0:r>
-        <ns0:t>Remove the bolts securing the vertical upright steel frame to the cart base tension bands / clamp brackets along the front lumber rail. Using a cordless power drill/driver with an appropriate socket is strongly recommended to accelerate nut and bolt removal during tight post-show teardown intervals. Stow all mounting bolts, nuts, and washers in the cart's hardware container.</ns0:t>
+        <ns0:t xml:space="preserve">Strut Lower Arm Stowing &amp; Upper Arm Vinyl Protection (Tennis Balls): </ns0:t>
+      </ns0:r>
+      <ns0:r>
+        <ns0:t>Allow the lower half of each strut to pivot down flat against the cart decking (it remains anchored to the base U-bolt throughout transport). Install a standard tennis ball with a hole cut in it securely over the exposed open end of each upper strut arm (which remains attached to the vertical frame upright). This cushioned ball prevents the metal tube end from puncturing, tearing, or abrading the printed scrim vinyl during transit and handling.</ns0:t>
       </ns0:r>
     </ns0:p>
     <ns0:p>
@@ -2353,6 +2353,27 @@
         <ns0:rPr>
           <ns0:b/>
         </ns0:rPr>
+        <ns0:t xml:space="preserve">Rapid Frame-to-Cart Unbolting (Power Driver Recommended): </ns0:t>
+      </ns0:r>
+      <ns0:r>
+        <ns0:t>Remove the bolts securing the vertical upright steel frame to the cart base tension bands / clamp brackets along the front lumber rail. Using a cordless power drill/driver with an appropriate socket is strongly recommended to accelerate nut and bolt removal during tight post-show teardown intervals. Stow all mounting bolts, nuts, and washers in the cart's hardware container.</ns0:t>
+      </ns0:r>
+    </ns0:p>
+    <ns0:p>
+      <ns0:pPr>
+        <ns0:spacing ns0:before="40" ns0:after="40"/>
+        <ns0:ind ns0:left="720" ns0:hanging="480"/>
+      </ns0:pPr>
+      <ns0:r>
+        <ns0:rPr>
+          <ns0:b/>
+        </ns0:rPr>
+        <ns0:t xml:space="preserve">7.  </ns0:t>
+      </ns0:r>
+      <ns0:r>
+        <ns0:rPr>
+          <ns0:b/>
+        </ns0:rPr>
         <ns0:t xml:space="preserve">Vinyl Frame Loading onto Trailer Cross Support Beams: </ns0:t>
       </ns0:r>
       <ns0:r>
@@ -2368,7 +2389,7 @@
         <ns0:rPr>
           <ns0:b/>
         </ns0:rPr>
-        <ns0:t xml:space="preserve">7.  </ns0:t>
+        <ns0:t xml:space="preserve">8.  </ns0:t>
       </ns0:r>
       <ns0:r>
         <ns0:rPr>
@@ -6125,27 +6146,27 @@
       <ns0:pPr>
         <ns0:pStyle ns0:val="Heading1"/>
         <ns0:pageBreakBefore/>
+        <ns0:spacing ns0:before="0" ns0:after="20"/>
+        <ns0:jc ns0:val="center"/>
+      </ns0:pPr>
+      <ns0:r>
+        <ns0:rPr>
+          <ns0:b/>
+          <ns0:sz ns0:val="23"/>
+          <ns0:color ns0:val="1A365D"/>
+        </ns0:rPr>
+        <ns0:t>APPENDIX C: FIELD OPERATIONS PLACARD</ns0:t>
+      </ns0:r>
+    </ns0:p>
+    <ns0:p>
+      <ns0:pPr>
         <ns0:spacing ns0:before="0" ns0:after="40"/>
         <ns0:jc ns0:val="center"/>
       </ns0:pPr>
       <ns0:r>
         <ns0:rPr>
-          <ns0:b/>
-          <ns0:sz ns0:val="24"/>
-          <ns0:color ns0:val="1A365D"/>
-        </ns0:rPr>
-        <ns0:t>APPENDIX C: FIELD OPERATIONS PLACARD</ns0:t>
-      </ns0:r>
-    </ns0:p>
-    <ns0:p>
-      <ns0:pPr>
-        <ns0:spacing ns0:before="0" ns0:after="60"/>
-        <ns0:jc ns0:val="center"/>
-      </ns0:pPr>
-      <ns0:r>
-        <ns0:rPr>
           <ns0:i/>
-          <ns0:sz ns0:val="17"/>
+          <ns0:sz ns0:val="16"/>
           <ns0:color ns0:val="4A5568"/>
         </ns0:rPr>
         <ns0:t>One-Page Laminated Field Reference for Trained Student Handlers &amp; Parent Pit Crew</ns0:t>
@@ -6153,7 +6174,7 @@
     </ns0:p>
     <ns0:tbl>
       <ns0:tblPr>
-        <ns0:tblW ns0:w="9360" ns0:type="dxa"/>
+        <ns0:tblW ns0:w="8640" ns0:type="dxa"/>
         <ns0:jc ns0:val="center"/>
         <ns0:tblBorders>
           <ns0:top ns0:val="dashed" ns0:sz="6" ns0:space="0" ns0:color="718096"/>
@@ -6164,32 +6185,32 @@
       </ns0:tblPr>
       <ns0:tr>
         <ns0:trPr>
-          <ns0:trHeight ns0:val="3400" ns0:hRule="exact"/>
+          <ns0:trHeight ns0:val="5760" ns0:hRule="exact"/>
         </ns0:trPr>
         <ns0:tc>
           <ns0:tcPr>
-            <ns0:tcW ns0:w="9360" ns0:type="dxa"/>
+            <ns0:tcW ns0:w="8640" ns0:type="dxa"/>
             <ns0:tcMar>
-              <ns0:top ns0:w="120" ns0:type="dxa"/>
-              <ns0:left ns0:w="180" ns0:type="dxa"/>
-              <ns0:bottom ns0:w="120" ns0:type="dxa"/>
-              <ns0:right ns0:w="180" ns0:type="dxa"/>
+              <ns0:top ns0:w="160" ns0:type="dxa"/>
+              <ns0:left ns0:w="200" ns0:type="dxa"/>
+              <ns0:bottom ns0:w="160" ns0:type="dxa"/>
+              <ns0:right ns0:w="200" ns0:type="dxa"/>
             </ns0:tcMar>
             <ns0:shd ns0:val="clear" ns0:color="auto" ns0:fill="F7FAFC"/>
             <ns0:vAlign ns0:val="center"/>
           </ns0:tcPr>
           <ns0:p>
             <ns0:pPr>
-              <ns0:spacing ns0:before="0" ns0:after="40"/>
+              <ns0:spacing ns0:before="0" ns0:after="30"/>
               <ns0:jc ns0:val="center"/>
             </ns0:pPr>
             <ns0:r>
               <ns0:rPr>
                 <ns0:b/>
-                <ns0:sz ns0:val="19"/>
+                <ns0:sz ns0:val="18"/>
                 <ns0:color ns0:val="2D3748"/>
               </ns0:rPr>
-              <ns0:t>ATTACH 4" × 6" FIELD PLACEMENT / DRILL COORDINATE CARD HERE</ns0:t>
+              <ns0:t>ATTACH 4" × 6" FIELD PLACEMENT / DRILL CARD HERE</ns0:t>
             </ns0:r>
           </ns0:p>
           <ns0:p>
@@ -6199,23 +6220,49 @@
             </ns0:pPr>
             <ns0:r>
               <ns0:rPr>
-                <ns0:sz ns0:val="17"/>
+                <ns0:sz ns0:val="15"/>
                 <ns0:color ns0:val="718096"/>
               </ns0:rPr>
-              <ns0:t>(Affix laminated 4x6 printout showing field drill coordinate, yard line, and hash alignment for this prop)</ns0:t>
+              <ns0:t>(Exact 6.0" wide × 4.0" high mounting area for laminated drill card from Appendix C.1)</ns0:t>
             </ns0:r>
           </ns0:p>
           <ns0:p>
             <ns0:pPr>
-              <ns0:spacing ns0:before="60" ns0:after="20"/>
+              <ns0:spacing ns0:before="40" ns0:after="20"/>
               <ns0:jc ns0:val="center"/>
             </ns0:pPr>
             <ns0:r>
               <ns0:rPr>
                 <ns0:b/>
-                <ns0:sz ns0:val="17"/>
+                <ns0:sz ns0:val="16"/>
               </ns0:rPr>
-              <ns0:t xml:space="preserve">Prop Number: ________   |   Field Coordinate: ________________________   |   Show Side: [  ] Side 1 (Left)   [  ] Side 2 (Right)</ns0:t>
+              <ns0:t xml:space="preserve">Prop #: _________   |   Show Segment: _________________   |   Side: [  ] Side 1   [  ] Side 2</ns0:t>
+            </ns0:r>
+          </ns0:p>
+          <ns0:p>
+            <ns0:pPr>
+              <ns0:spacing ns0:before="20" ns0:after="20"/>
+              <ns0:jc ns0:val="center"/>
+            </ns0:pPr>
+            <ns0:r>
+              <ns0:rPr>
+                <ns0:sz ns0:val="15"/>
+                <ns0:color ns0:val="4A5568"/>
+              </ns0:rPr>
+              <ns0:t xml:space="preserve">Field Drill Coordinate: _______________________________________________________________</ns0:t>
+            </ns0:r>
+          </ns0:p>
+          <ns0:p>
+            <ns0:pPr>
+              <ns0:spacing ns0:before="20" ns0:after="20"/>
+              <ns0:jc ns0:val="center"/>
+            </ns0:pPr>
+            <ns0:r>
+              <ns0:rPr>
+                <ns0:sz ns0:val="15"/>
+                <ns0:color ns0:val="4A5568"/>
+              </ns0:rPr>
+              <ns0:t xml:space="preserve">Assigned Handlers (Min. 2; 3–4 on ramps/wind): 1) _______________ 2) _______________ 3) _______________</ns0:t>
             </ns0:r>
           </ns0:p>
           <ns0:p>
@@ -6225,10 +6272,10 @@
             </ns0:pPr>
             <ns0:r>
               <ns0:rPr>
-                <ns0:sz ns0:val="16"/>
-                <ns0:color ns0:val="4A5568"/>
+                <ns0:sz ns0:val="15"/>
+                <ns0:color ns0:val="718096"/>
               </ns0:rPr>
-              <ns0:t xml:space="preserve">Assigned Handlers (Min. 2; 3–4 for ramps/wind): 1) _______________  2) _______________  3) _______________</ns0:t>
+              <ns0:t xml:space="preserve">Facing: [  ] Flat to Front Sideline   [  ] Angled (____°)   |   [  ] Ground Wheel Chocks Staged</ns0:t>
             </ns0:r>
           </ns0:p>
         </ns0:tc>
@@ -6237,12 +6284,12 @@
     <ns0:p>
       <ns0:pPr>
         <ns0:pStyle ns0:val="Heading2"/>
-        <ns0:spacing ns0:before="80" ns0:after="30"/>
+        <ns0:spacing ns0:before="50" ns0:after="20"/>
       </ns0:pPr>
       <ns0:r>
         <ns0:rPr>
           <ns0:b/>
-          <ns0:sz ns0:val="19"/>
+          <ns0:sz ns0:val="18"/>
           <ns0:color ns0:val="1A365D"/>
         </ns0:rPr>
         <ns0:t>1. Wind Velocity Limits &amp; Standardized Ballasting Schedule</ns0:t>
@@ -6272,12 +6319,12 @@
           </ns0:tcPr>
           <ns0:p>
             <ns0:pPr>
-              <ns0:spacing ns0:before="20" ns0:after="20"/>
+              <ns0:spacing ns0:before="15" ns0:after="15"/>
             </ns0:pPr>
             <ns0:r>
               <ns0:rPr>
                 <ns0:b/>
-                <ns0:sz ns0:val="16"/>
+                <ns0:sz ns0:val="15"/>
               </ns0:rPr>
               <ns0:t>Tier / State</ns0:t>
             </ns0:r>
@@ -6285,17 +6332,17 @@
         </ns0:tc>
         <ns0:tc>
           <ns0:tcPr>
-            <ns0:tcW ns0:w="1600" ns0:type="dxa"/>
+            <ns0:tcW ns0:w="1500" ns0:type="dxa"/>
             <ns0:shd ns0:val="clear" ns0:color="auto" ns0:fill="EDF2F7"/>
           </ns0:tcPr>
           <ns0:p>
             <ns0:pPr>
-              <ns0:spacing ns0:before="20" ns0:after="20"/>
+              <ns0:spacing ns0:before="15" ns0:after="15"/>
             </ns0:pPr>
             <ns0:r>
               <ns0:rPr>
                 <ns0:b/>
-                <ns0:sz ns0:val="16"/>
+                <ns0:sz ns0:val="15"/>
               </ns0:rPr>
               <ns0:t>Wind Velocity</ns0:t>
             </ns0:r>
@@ -6303,17 +6350,17 @@
         </ns0:tc>
         <ns0:tc>
           <ns0:tcPr>
-            <ns0:tcW ns0:w="2660" ns0:type="dxa"/>
+            <ns0:tcW ns0:w="2760" ns0:type="dxa"/>
             <ns0:shd ns0:val="clear" ns0:color="auto" ns0:fill="EDF2F7"/>
           </ns0:tcPr>
           <ns0:p>
             <ns0:pPr>
-              <ns0:spacing ns0:before="20" ns0:after="20"/>
+              <ns0:spacing ns0:before="15" ns0:after="15"/>
             </ns0:pPr>
             <ns0:r>
               <ns0:rPr>
                 <ns0:b/>
-                <ns0:sz ns0:val="16"/>
+                <ns0:sz ns0:val="15"/>
               </ns0:rPr>
               <ns0:t>Ballast Deployment (15-lb Bags)</ns0:t>
             </ns0:r>
@@ -6326,12 +6373,12 @@
           </ns0:tcPr>
           <ns0:p>
             <ns0:pPr>
-              <ns0:spacing ns0:before="20" ns0:after="20"/>
+              <ns0:spacing ns0:before="15" ns0:after="15"/>
             </ns0:pPr>
             <ns0:r>
               <ns0:rPr>
                 <ns0:b/>
-                <ns0:sz ns0:val="16"/>
+                <ns0:sz ns0:val="15"/>
               </ns0:rPr>
               <ns0:t>Total Wt</ns0:t>
             </ns0:r>
@@ -6344,12 +6391,12 @@
           </ns0:tcPr>
           <ns0:p>
             <ns0:pPr>
-              <ns0:spacing ns0:before="20" ns0:after="20"/>
+              <ns0:spacing ns0:before="15" ns0:after="15"/>
             </ns0:pPr>
             <ns0:r>
               <ns0:rPr>
                 <ns0:b/>
-                <ns0:sz ns0:val="16"/>
+                <ns0:sz ns0:val="15"/>
               </ns0:rPr>
               <ns0:t>Operational Limits &amp; Action</ns0:t>
             </ns0:r>
@@ -6363,12 +6410,12 @@
           </ns0:tcPr>
           <ns0:p>
             <ns0:pPr>
-              <ns0:spacing ns0:before="15" ns0:after="15"/>
+              <ns0:spacing ns0:before="10" ns0:after="10"/>
             </ns0:pPr>
             <ns0:r>
               <ns0:rPr>
                 <ns0:b/>
-                <ns0:sz ns0:val="15"/>
+                <ns0:sz ns0:val="14"/>
               </ns0:rPr>
               <ns0:t>Tier 0: Calm</ns0:t>
             </ns0:r>
@@ -6376,15 +6423,15 @@
         </ns0:tc>
         <ns0:tc>
           <ns0:tcPr>
-            <ns0:tcW ns0:w="1600" ns0:type="dxa"/>
+            <ns0:tcW ns0:w="1500" ns0:type="dxa"/>
           </ns0:tcPr>
           <ns0:p>
             <ns0:pPr>
-              <ns0:spacing ns0:before="15" ns0:after="15"/>
+              <ns0:spacing ns0:before="10" ns0:after="10"/>
             </ns0:pPr>
             <ns0:r>
               <ns0:rPr>
-                <ns0:sz ns0:val="15"/>
+                <ns0:sz ns0:val="14"/>
               </ns0:rPr>
               <ns0:t>0–8 mph (gusts ≤10)</ns0:t>
             </ns0:r>
@@ -6392,15 +6439,15 @@
         </ns0:tc>
         <ns0:tc>
           <ns0:tcPr>
-            <ns0:tcW ns0:w="2660" ns0:type="dxa"/>
+            <ns0:tcW ns0:w="2760" ns0:type="dxa"/>
           </ns0:tcPr>
           <ns0:p>
             <ns0:pPr>
-              <ns0:spacing ns0:before="15" ns0:after="15"/>
+              <ns0:spacing ns0:before="10" ns0:after="10"/>
             </ns0:pPr>
             <ns0:r>
               <ns0:rPr>
-                <ns0:sz ns0:val="15"/>
+                <ns0:sz ns0:val="14"/>
               </ns0:rPr>
               <ns0:t>0 bags (unballasted)</ns0:t>
             </ns0:r>
@@ -6412,11 +6459,11 @@
           </ns0:tcPr>
           <ns0:p>
             <ns0:pPr>
-              <ns0:spacing ns0:before="15" ns0:after="15"/>
+              <ns0:spacing ns0:before="10" ns0:after="10"/>
             </ns0:pPr>
             <ns0:r>
               <ns0:rPr>
-                <ns0:sz ns0:val="15"/>
+                <ns0:sz ns0:val="14"/>
               </ns0:rPr>
               <ns0:t>153 lbs</ns0:t>
             </ns0:r>
@@ -6428,11 +6475,11 @@
           </ns0:tcPr>
           <ns0:p>
             <ns0:pPr>
-              <ns0:spacing ns0:before="15" ns0:after="15"/>
+              <ns0:spacing ns0:before="10" ns0:after="10"/>
             </ns0:pPr>
             <ns0:r>
               <ns0:rPr>
-                <ns0:sz ns0:val="15"/>
+                <ns0:sz ns0:val="14"/>
               </ns0:rPr>
               <ns0:t>Safe to 8 mph (10 gust max). Must upgrade to Tier 1 if wind &gt;8 mph.</ns0:t>
             </ns0:r>
@@ -6446,12 +6493,12 @@
           </ns0:tcPr>
           <ns0:p>
             <ns0:pPr>
-              <ns0:spacing ns0:before="15" ns0:after="15"/>
+              <ns0:spacing ns0:before="10" ns0:after="10"/>
             </ns0:pPr>
             <ns0:r>
               <ns0:rPr>
                 <ns0:b/>
-                <ns0:sz ns0:val="15"/>
+                <ns0:sz ns0:val="14"/>
               </ns0:rPr>
               <ns0:t>Tier 1: Normal</ns0:t>
             </ns0:r>
@@ -6459,15 +6506,15 @@
         </ns0:tc>
         <ns0:tc>
           <ns0:tcPr>
-            <ns0:tcW ns0:w="1600" ns0:type="dxa"/>
+            <ns0:tcW ns0:w="1500" ns0:type="dxa"/>
           </ns0:tcPr>
           <ns0:p>
             <ns0:pPr>
-              <ns0:spacing ns0:before="15" ns0:after="15"/>
+              <ns0:spacing ns0:before="10" ns0:after="10"/>
             </ns0:pPr>
             <ns0:r>
               <ns0:rPr>
-                <ns0:sz ns0:val="15"/>
+                <ns0:sz ns0:val="14"/>
               </ns0:rPr>
               <ns0:t>8–12 mph</ns0:t>
             </ns0:r>
@@ -6475,15 +6522,15 @@
         </ns0:tc>
         <ns0:tc>
           <ns0:tcPr>
-            <ns0:tcW ns0:w="2660" ns0:type="dxa"/>
+            <ns0:tcW ns0:w="2760" ns0:type="dxa"/>
           </ns0:tcPr>
           <ns0:p>
             <ns0:pPr>
-              <ns0:spacing ns0:before="15" ns0:after="15"/>
+              <ns0:spacing ns0:before="10" ns0:after="10"/>
             </ns0:pPr>
             <ns0:r>
               <ns0:rPr>
-                <ns0:sz ns0:val="15"/>
+                <ns0:sz ns0:val="14"/>
               </ns0:rPr>
               <ns0:t>4x bags (2 per wing post; 60 lb ballast)</ns0:t>
             </ns0:r>
@@ -6495,11 +6542,11 @@
           </ns0:tcPr>
           <ns0:p>
             <ns0:pPr>
-              <ns0:spacing ns0:before="15" ns0:after="15"/>
+              <ns0:spacing ns0:before="10" ns0:after="10"/>
             </ns0:pPr>
             <ns0:r>
               <ns0:rPr>
-                <ns0:sz ns0:val="15"/>
+                <ns0:sz ns0:val="14"/>
               </ns0:rPr>
               <ns0:t>213 lbs</ns0:t>
             </ns0:r>
@@ -6511,11 +6558,11 @@
           </ns0:tcPr>
           <ns0:p>
             <ns0:pPr>
-              <ns0:spacing ns0:before="15" ns0:after="15"/>
+              <ns0:spacing ns0:before="10" ns0:after="10"/>
             </ns0:pPr>
             <ns0:r>
               <ns0:rPr>
-                <ns0:sz ns0:val="15"/>
+                <ns0:sz ns0:val="14"/>
               </ns0:rPr>
               <ns0:t>Standard field staging. 16.9 mph max gust. Zero turf compaction.</ns0:t>
             </ns0:r>
@@ -6529,12 +6576,12 @@
           </ns0:tcPr>
           <ns0:p>
             <ns0:pPr>
-              <ns0:spacing ns0:before="15" ns0:after="15"/>
+              <ns0:spacing ns0:before="10" ns0:after="10"/>
             </ns0:pPr>
             <ns0:r>
               <ns0:rPr>
                 <ns0:b/>
-                <ns0:sz ns0:val="15"/>
+                <ns0:sz ns0:val="14"/>
               </ns0:rPr>
               <ns0:t>Tier 2: Advisory</ns0:t>
             </ns0:r>
@@ -6542,15 +6589,15 @@
         </ns0:tc>
         <ns0:tc>
           <ns0:tcPr>
-            <ns0:tcW ns0:w="1600" ns0:type="dxa"/>
+            <ns0:tcW ns0:w="1500" ns0:type="dxa"/>
           </ns0:tcPr>
           <ns0:p>
             <ns0:pPr>
-              <ns0:spacing ns0:before="15" ns0:after="15"/>
+              <ns0:spacing ns0:before="10" ns0:after="10"/>
             </ns0:pPr>
             <ns0:r>
               <ns0:rPr>
-                <ns0:sz ns0:val="15"/>
+                <ns0:sz ns0:val="14"/>
               </ns0:rPr>
               <ns0:t>12–18 mph</ns0:t>
             </ns0:r>
@@ -6558,15 +6605,15 @@
         </ns0:tc>
         <ns0:tc>
           <ns0:tcPr>
-            <ns0:tcW ns0:w="2660" ns0:type="dxa"/>
+            <ns0:tcW ns0:w="2760" ns0:type="dxa"/>
           </ns0:tcPr>
           <ns0:p>
             <ns0:pPr>
-              <ns0:spacing ns0:before="15" ns0:after="15"/>
+              <ns0:spacing ns0:before="10" ns0:after="10"/>
             </ns0:pPr>
             <ns0:r>
               <ns0:rPr>
-                <ns0:sz ns0:val="15"/>
+                <ns0:sz ns0:val="14"/>
               </ns0:rPr>
               <ns0:t>6x bags (3 per wing post; 90 lb ballast)</ns0:t>
             </ns0:r>
@@ -6578,11 +6625,11 @@
           </ns0:tcPr>
           <ns0:p>
             <ns0:pPr>
-              <ns0:spacing ns0:before="15" ns0:after="15"/>
+              <ns0:spacing ns0:before="10" ns0:after="10"/>
             </ns0:pPr>
             <ns0:r>
               <ns0:rPr>
-                <ns0:sz ns0:val="15"/>
+                <ns0:sz ns0:val="14"/>
               </ns0:rPr>
               <ns0:t>243 lbs</ns0:t>
             </ns0:r>
@@ -6594,11 +6641,11 @@
           </ns0:tcPr>
           <ns0:p>
             <ns0:pPr>
-              <ns0:spacing ns0:before="15" ns0:after="15"/>
+              <ns0:spacing ns0:before="10" ns0:after="10"/>
             </ns0:pPr>
             <ns0:r>
               <ns0:rPr>
-                <ns0:sz ns0:val="15"/>
+                <ns0:sz ns0:val="14"/>
               </ns0:rPr>
               <ns0:t>Attentive staging. 18.4 mph max gust. Deploy ground wheel chocks.</ns0:t>
             </ns0:r>
@@ -6612,12 +6659,12 @@
           </ns0:tcPr>
           <ns0:p>
             <ns0:pPr>
-              <ns0:spacing ns0:before="15" ns0:after="15"/>
+              <ns0:spacing ns0:before="10" ns0:after="10"/>
             </ns0:pPr>
             <ns0:r>
               <ns0:rPr>
                 <ns0:b/>
-                <ns0:sz ns0:val="15"/>
+                <ns0:sz ns0:val="14"/>
               </ns0:rPr>
               <ns0:t>Tier 3: High-Wind</ns0:t>
             </ns0:r>
@@ -6625,15 +6672,15 @@
         </ns0:tc>
         <ns0:tc>
           <ns0:tcPr>
-            <ns0:tcW ns0:w="1600" ns0:type="dxa"/>
+            <ns0:tcW ns0:w="1500" ns0:type="dxa"/>
           </ns0:tcPr>
           <ns0:p>
             <ns0:pPr>
-              <ns0:spacing ns0:before="15" ns0:after="15"/>
+              <ns0:spacing ns0:before="10" ns0:after="10"/>
             </ns0:pPr>
             <ns0:r>
               <ns0:rPr>
-                <ns0:sz ns0:val="15"/>
+                <ns0:sz ns0:val="14"/>
               </ns0:rPr>
               <ns0:t>18–22 mph</ns0:t>
             </ns0:r>
@@ -6641,15 +6688,15 @@
         </ns0:tc>
         <ns0:tc>
           <ns0:tcPr>
-            <ns0:tcW ns0:w="2660" ns0:type="dxa"/>
+            <ns0:tcW ns0:w="2760" ns0:type="dxa"/>
           </ns0:tcPr>
           <ns0:p>
             <ns0:pPr>
-              <ns0:spacing ns0:before="15" ns0:after="15"/>
+              <ns0:spacing ns0:before="10" ns0:after="10"/>
             </ns0:pPr>
             <ns0:r>
               <ns0:rPr>
-                <ns0:sz ns0:val="15"/>
+                <ns0:sz ns0:val="14"/>
               </ns0:rPr>
               <ns0:t>6 on wings + 3 across rear rail A (135 lb)</ns0:t>
             </ns0:r>
@@ -6661,11 +6708,11 @@
           </ns0:tcPr>
           <ns0:p>
             <ns0:pPr>
-              <ns0:spacing ns0:before="15" ns0:after="15"/>
+              <ns0:spacing ns0:before="10" ns0:after="10"/>
             </ns0:pPr>
             <ns0:r>
               <ns0:rPr>
-                <ns0:sz ns0:val="15"/>
+                <ns0:sz ns0:val="14"/>
               </ns0:rPr>
               <ns0:t>288 lbs</ns0:t>
             </ns0:r>
@@ -6677,11 +6724,11 @@
           </ns0:tcPr>
           <ns0:p>
             <ns0:pPr>
-              <ns0:spacing ns0:before="15" ns0:after="15"/>
+              <ns0:spacing ns0:before="10" ns0:after="10"/>
             </ns0:pPr>
             <ns0:r>
               <ns0:rPr>
-                <ns0:sz ns0:val="15"/>
+                <ns0:sz ns0:val="14"/>
               </ns0:rPr>
               <ns0:t>22.5 mph max gust. Rear rail doubles leverage. Max safe turf load.</ns0:t>
             </ns0:r>
@@ -6695,12 +6742,12 @@
           </ns0:tcPr>
           <ns0:p>
             <ns0:pPr>
-              <ns0:spacing ns0:before="15" ns0:after="15"/>
+              <ns0:spacing ns0:before="10" ns0:after="10"/>
             </ns0:pPr>
             <ns0:r>
               <ns0:rPr>
                 <ns0:b/>
-                <ns0:sz ns0:val="15"/>
+                <ns0:sz ns0:val="14"/>
                 <ns0:color ns0:val="C53030"/>
               </ns0:rPr>
               <ns0:t>Tier 4: ABORT</ns0:t>
@@ -6709,16 +6756,16 @@
         </ns0:tc>
         <ns0:tc>
           <ns0:tcPr>
-            <ns0:tcW ns0:w="1600" ns0:type="dxa"/>
+            <ns0:tcW ns0:w="1500" ns0:type="dxa"/>
           </ns0:tcPr>
           <ns0:p>
             <ns0:pPr>
-              <ns0:spacing ns0:before="15" ns0:after="15"/>
+              <ns0:spacing ns0:before="10" ns0:after="10"/>
             </ns0:pPr>
             <ns0:r>
               <ns0:rPr>
                 <ns0:b/>
-                <ns0:sz ns0:val="15"/>
+                <ns0:sz ns0:val="14"/>
                 <ns0:color ns0:val="C53030"/>
               </ns0:rPr>
               <ns0:t>&gt;20 sust. / &gt;25 gust</ns0:t>
@@ -6727,15 +6774,15 @@
         </ns0:tc>
         <ns0:tc>
           <ns0:tcPr>
-            <ns0:tcW ns0:w="2660" ns0:type="dxa"/>
+            <ns0:tcW ns0:w="2760" ns0:type="dxa"/>
           </ns0:tcPr>
           <ns0:p>
             <ns0:pPr>
-              <ns0:spacing ns0:before="15" ns0:after="15"/>
+              <ns0:spacing ns0:before="10" ns0:after="10"/>
             </ns0:pPr>
             <ns0:r>
               <ns0:rPr>
-                <ns0:sz ns0:val="15"/>
+                <ns0:sz ns0:val="14"/>
               </ns0:rPr>
               <ns0:t>—</ns0:t>
             </ns0:r>
@@ -6747,11 +6794,11 @@
           </ns0:tcPr>
           <ns0:p>
             <ns0:pPr>
-              <ns0:spacing ns0:before="15" ns0:after="15"/>
+              <ns0:spacing ns0:before="10" ns0:after="10"/>
             </ns0:pPr>
             <ns0:r>
               <ns0:rPr>
-                <ns0:sz ns0:val="15"/>
+                <ns0:sz ns0:val="14"/>
               </ns0:rPr>
               <ns0:t>—</ns0:t>
             </ns0:r>
@@ -6763,12 +6810,12 @@
           </ns0:tcPr>
           <ns0:p>
             <ns0:pPr>
-              <ns0:spacing ns0:before="15" ns0:after="15"/>
+              <ns0:spacing ns0:before="10" ns0:after="10"/>
             </ns0:pPr>
             <ns0:r>
               <ns0:rPr>
                 <ns0:b/>
-                <ns0:sz ns0:val="15"/>
+                <ns0:sz ns0:val="14"/>
                 <ns0:color ns0:val="C53030"/>
               </ns0:rPr>
               <ns0:t>STRICT SAFETY NO-GO. Withdraw props or immediately lay flat.</ns0:t>
@@ -6780,15 +6827,342 @@
     <ns0:p>
       <ns0:pPr>
         <ns0:pStyle ns0:val="Heading2"/>
-        <ns0:spacing ns0:before="60" ns0:after="20"/>
+        <ns0:spacing ns0:before="40" ns0:after="15"/>
       </ns0:pPr>
       <ns0:r>
         <ns0:rPr>
           <ns0:b/>
-          <ns0:sz ns0:val="19"/>
+          <ns0:sz ns0:val="18"/>
           <ns0:color ns0:val="1A365D"/>
         </ns0:rPr>
         <ns0:t>2. Critical On-Field Safety &amp; Turf Protection Rules</ns0:t>
+      </ns0:r>
+    </ns0:p>
+    <ns0:p>
+      <ns0:pPr>
+        <ns0:spacing ns0:before="8" ns0:after="8"/>
+        <ns0:ind ns0:left="360" ns0:hanging="240"/>
+      </ns0:pPr>
+      <ns0:r>
+        <ns0:rPr>
+          <ns0:b/>
+          <ns0:sz ns0:val="14"/>
+        </ns0:rPr>
+        <ns0:t xml:space="preserve">• Non-Locking Casters &amp; Ground Chocking: </ns0:t>
+      </ns0:r>
+      <ns0:r>
+        <ns0:rPr>
+          <ns0:sz ns0:val="14"/>
+        </ns0:rPr>
+        <ns0:t>Carts use non-locking swivel casters for rapid agility. When positioned at drill coordinates in breezy conditions, place extra double-bagged 15-lb sandbags on the turf firmly against wheels as wheel chocks to prevent roll drift.</ns0:t>
+      </ns0:r>
+    </ns0:p>
+    <ns0:p>
+      <ns0:pPr>
+        <ns0:spacing ns0:before="8" ns0:after="8"/>
+        <ns0:ind ns0:left="360" ns0:hanging="240"/>
+      </ns0:pPr>
+      <ns0:r>
+        <ns0:rPr>
+          <ns0:b/>
+          <ns0:sz ns0:val="14"/>
+        </ns0:rPr>
+        <ns0:t xml:space="preserve">• Hand Placement &amp; Crew Pairing: </ns0:t>
+      </ns0:r>
+      <ns0:r>
+        <ns0:rPr>
+          <ns0:sz ns0:val="14"/>
+        </ns0:rPr>
+        <ns0:t>Always push from lower 2x4 cart framing; NEVER push or climb on upright pipes or struts. No fewer than 2 handlers per cart under normal conditions; assign 3 to 4 handlers on steep grades (such as the Falcon Stadium tunnel ramp) or in high winds.</ns0:t>
+      </ns0:r>
+    </ns0:p>
+    <ns0:p>
+      <ns0:pPr>
+        <ns0:spacing ns0:before="8" ns0:after="8"/>
+        <ns0:ind ns0:left="360" ns0:hanging="240"/>
+      </ns0:pPr>
+      <ns0:r>
+        <ns0:rPr>
+          <ns0:b/>
+          <ns0:sz ns0:val="14"/>
+        </ns0:rPr>
+        <ns0:t xml:space="preserve">• Mandatory Double-Bagging (Rule 8.05): </ns0:t>
+      </ns0:r>
+      <ns0:r>
+        <ns0:rPr>
+          <ns0:sz ns0:val="14"/>
+        </ns0:rPr>
+        <ns0:t>All 15-lb sandbags must have intact heavy-duty plastic inner liners. Never bring single-layer bags onto athletic turf. Carts must not exceed 300 lbs total (~75 lb/wheel) to prevent rubber infill rutting.</ns0:t>
+      </ns0:r>
+    </ns0:p>
+    <ns0:p>
+      <ns0:pPr>
+        <ns0:spacing ns0:before="8" ns0:after="8"/>
+        <ns0:ind ns0:left="360" ns0:hanging="240"/>
+      </ns0:pPr>
+      <ns0:r>
+        <ns0:rPr>
+          <ns0:b/>
+          <ns0:sz ns0:val="14"/>
+          <ns0:color ns0:val="C53030"/>
+        </ns0:rPr>
+        <ns0:t xml:space="preserve">• High-Wind Emergency Abort: </ns0:t>
+      </ns0:r>
+      <ns0:r>
+        <ns0:rPr>
+          <ns0:sz ns0:val="14"/>
+        </ns0:rPr>
+        <ns0:t>If severe gusts strike on-field, handlers brace on the upwind 2x4 base. Authorized parent crew (with Rule 9.07 wristbands) will assist to lay props flat on turf if ordered by directors.</ns0:t>
+      </ns0:r>
+    </ns0:p>
+    <ns0:p>
+      <ns0:pPr>
+        <ns0:pStyle ns0:val="Heading2"/>
+        <ns0:spacing ns0:before="40" ns0:after="15"/>
+      </ns0:pPr>
+      <ns0:r>
+        <ns0:rPr>
+          <ns0:b/>
+          <ns0:sz ns0:val="18"/>
+          <ns0:color ns0:val="1A365D"/>
+        </ns0:rPr>
+        <ns0:t>3. Rapid Field Assembly, Egress &amp; Two-Shot Staging Checklist</ns0:t>
+      </ns0:r>
+    </ns0:p>
+    <ns0:p>
+      <ns0:pPr>
+        <ns0:spacing ns0:before="8" ns0:after="8"/>
+        <ns0:ind ns0:left="360" ns0:hanging="240"/>
+      </ns0:pPr>
+      <ns0:r>
+        <ns0:rPr>
+          <ns0:b/>
+          <ns0:sz ns0:val="14"/>
+        </ns0:rPr>
+        <ns0:t xml:space="preserve">• Unloading &amp; Venue Staging: </ns0:t>
+      </ns0:r>
+      <ns0:r>
+        <ns0:rPr>
+          <ns0:sz ns0:val="14"/>
+        </ns0:rPr>
+        <ns0:t>1) Unstrap carts &amp; lower from short ends; 2) Retrieve 10'×8' frames from trailer cross beams; 3) Pull off protective tennis balls (stow in tote); 4) Rapidly bolt frame to cart using cordless power driver; 5) Mate 2-piece struts and lock quick-release retaining pins; 6) Stage required ballast &amp; wheel chocks.</ns0:t>
+      </ns0:r>
+    </ns0:p>
+    <ns0:p>
+      <ns0:pPr>
+        <ns0:spacing ns0:before="8" ns0:after="0"/>
+        <ns0:ind ns0:left="360" ns0:hanging="240"/>
+      </ns0:pPr>
+      <ns0:r>
+        <ns0:rPr>
+          <ns0:b/>
+          <ns0:sz ns0:val="14"/>
+        </ns0:rPr>
+        <ns0:t xml:space="preserve">• Egress, "Two-Shot" Staging &amp; Teardown: </ns0:t>
+      </ns0:r>
+      <ns0:r>
+        <ns0:rPr>
+          <ns0:sz ns0:val="14"/>
+        </ns0:rPr>
+        <ns0:t>1) Continuous egress up hill to trailer lot (NEVER de-ballast at stadium chute); 2) Between Prelims &amp; Finals ("Two-Shot"), leave ballast on carts in trailer lot; if gusts pick up, pull strut pins to lay vinyl frames flat on carts; 3) Final teardown: remove sandbags over axles; 4) Pull strut pins (stow in tote); 5) Install tennis balls over upper strut ends; 6) Unbolt frame using power driver; 7) Frames onto cross beams; 8) Carts vertical on short ends strapped against front nose wall.</ns0:t>
+      </ns0:r>
+    </ns0:p>
+    <ns0:p>
+      <ns0:pPr>
+        <ns0:pStyle ns0:val="Heading1"/>
+        <ns0:pageBreakBefore/>
+        <ns0:spacing ns0:before="0" ns0:after="20"/>
+        <ns0:jc ns0:val="center"/>
+      </ns0:pPr>
+      <ns0:r>
+        <ns0:rPr>
+          <ns0:b/>
+          <ns0:sz ns0:val="23"/>
+          <ns0:color ns0:val="1A365D"/>
+        </ns0:rPr>
+        <ns0:t>APPENDIX C.1: 4" × 6" FIELD PLACEMENT CARD TEMPLATE</ns0:t>
+      </ns0:r>
+    </ns0:p>
+    <ns0:p>
+      <ns0:pPr>
+        <ns0:spacing ns0:before="0" ns0:after="40"/>
+        <ns0:jc ns0:val="center"/>
+      </ns0:pPr>
+      <ns0:r>
+        <ns0:rPr>
+          <ns0:i/>
+          <ns0:sz ns0:val="16"/>
+          <ns0:color ns0:val="4A5568"/>
+        </ns0:rPr>
+        <ns0:t>Printable &amp; Fillable Coordinate Card for Appendix C On-Prop Placard (Cut along dashed line)</ns0:t>
+      </ns0:r>
+    </ns0:p>
+    <ns0:tbl>
+      <ns0:tblPr>
+        <ns0:tblW ns0:w="8640" ns0:type="dxa"/>
+        <ns0:jc ns0:val="center"/>
+        <ns0:tblBorders>
+          <ns0:top ns0:val="dashed" ns0:sz="8" ns0:space="0" ns0:color="2B6CB0"/>
+          <ns0:left ns0:val="dashed" ns0:sz="8" ns0:space="0" ns0:color="2B6CB0"/>
+          <ns0:bottom ns0:val="dashed" ns0:sz="8" ns0:space="0" ns0:color="2B6CB0"/>
+          <ns0:right ns0:val="dashed" ns0:sz="8" ns0:space="0" ns0:color="2B6CB0"/>
+        </ns0:tblBorders>
+      </ns0:tblPr>
+      <ns0:tr>
+        <ns0:trPr>
+          <ns0:trHeight ns0:val="5760" ns0:hRule="exact"/>
+        </ns0:trPr>
+        <ns0:tc>
+          <ns0:tcPr>
+            <ns0:tcW ns0:w="8640" ns0:type="dxa"/>
+            <ns0:tcMar>
+              <ns0:top ns0:w="120" ns0:type="dxa"/>
+              <ns0:left ns0:w="160" ns0:type="dxa"/>
+              <ns0:bottom ns0:w="120" ns0:type="dxa"/>
+              <ns0:right ns0:w="160" ns0:type="dxa"/>
+            </ns0:tcMar>
+            <ns0:shd ns0:val="clear" ns0:color="auto" ns0:fill="FFFFFF"/>
+            <ns0:vAlign ns0:val="top"/>
+          </ns0:tcPr>
+          <ns0:p>
+            <ns0:pPr>
+              <ns0:spacing ns0:before="0" ns0:after="20"/>
+              <ns0:jc ns0:val="center"/>
+            </ns0:pPr>
+            <ns0:r>
+              <ns0:rPr>
+                <ns0:b/>
+                <ns0:sz ns0:val="18"/>
+                <ns0:color ns0:val="1A365D"/>
+              </ns0:rPr>
+              <ns0:t>PCHS MARCHING BAND — BACKDROP FIELD DRILL CARD</ns0:t>
+            </ns0:r>
+          </ns0:p>
+          <ns0:p>
+            <ns0:pPr>
+              <ns0:spacing ns0:before="0" ns0:after="15"/>
+              <ns0:jc ns0:val="center"/>
+            </ns0:pPr>
+            <ns0:r>
+              <ns0:rPr>
+                <ns0:b/>
+                <ns0:sz ns0:val="15"/>
+              </ns0:rPr>
+              <ns0:t xml:space="preserve">Prop #: ________   |   Segment/Song: ___________________   |   Side: [  ] Side 1 (Left)   [  ] Side 2 (Right)</ns0:t>
+            </ns0:r>
+          </ns0:p>
+          <ns0:p>
+            <ns0:pPr>
+              <ns0:spacing ns0:before="0" ns0:after="15"/>
+              <ns0:jc ns0:val="center"/>
+            </ns0:pPr>
+            <ns0:r>
+              <ns0:rPr>
+                <ns0:sz ns0:val="14"/>
+                <ns0:color ns0:val="2D3748"/>
+              </ns0:rPr>
+              <ns0:t xml:space="preserve">Drill Coordinate: _________________________________________________________________________________</ns0:t>
+            </ns0:r>
+          </ns0:p>
+          <ns0:p>
+            <ns0:pPr>
+              <ns0:spacing ns0:before="0" ns0:after="25"/>
+              <ns0:jc ns0:val="center"/>
+            </ns0:pPr>
+            <ns0:r>
+              <ns0:rPr>
+                <ns0:sz ns0:val="14"/>
+                <ns0:color ns0:val="2D3748"/>
+              </ns0:rPr>
+              <ns0:t xml:space="preserve">Handlers (Min. 2; 3–4 for ramps/wind): 1) ____________________  2) ____________________  3) ____________________</ns0:t>
+            </ns0:r>
+          </ns0:p>
+          <ns0:p>
+            <ns0:pPr>
+              <ns0:spacing ns0:before="0" ns0:after="20"/>
+              <ns0:jc ns0:val="center"/>
+            </ns0:pPr>
+            <ns0:r>
+              <ns0:drawing>
+                <ns1:inline distT="0" distB="0" distL="0" distR="0">
+                  <ns1:extent cx="5029200" cy="1920240"/>
+                  <ns1:effectExtent l="0" t="0" r="0" b="0"/>
+                  <ns1:docPr id="10" name="Figure 10" descr="Blank regulation high school marching band field diagram for marking backdrop drill coordinates and prop orientation."/>
+                  <ns1:cNvGraphicFramePr>
+                    <ns2:graphicFrameLocks noChangeAspect="1"/>
+                  </ns1:cNvGraphicFramePr>
+                  <ns2:graphic>
+                    <ns2:graphicData uri="http://schemas.openxmlformats.org/drawingml/2006/picture">
+                      <ns3:pic>
+                        <ns3:nvPicPr>
+                          <ns3:cNvPr id="0" name="Figure 10"/>
+                          <ns3:cNvPicPr/>
+                        </ns3:nvPicPr>
+                        <ns3:blipFill>
+                          <ns2:blip ns4:embed="rIdFieldDiagram"/>
+                          <ns2:stretch>
+                            <ns2:fillRect/>
+                          </ns2:stretch>
+                        </ns3:blipFill>
+                        <ns3:spPr>
+                          <ns2:xfrm>
+                            <ns2:off x="0" y="0"/>
+                            <ns2:ext cx="5029200" cy="1920240"/>
+                          </ns2:xfrm>
+                          <ns2:prstGeom prst="rect">
+                            <ns2:avLst/>
+                          </ns2:prstGeom>
+                        </ns3:spPr>
+                      </ns3:pic>
+                    </ns2:graphicData>
+                  </ns2:graphic>
+                </ns1:inline>
+              </ns0:drawing>
+            </ns0:r>
+          </ns0:p>
+          <ns0:p>
+            <ns0:pPr>
+              <ns0:spacing ns0:before="0" ns0:after="0"/>
+              <ns0:jc ns0:val="center"/>
+            </ns0:pPr>
+            <ns0:r>
+              <ns0:rPr>
+                <ns0:b/>
+                <ns0:sz ns0:val="14"/>
+                <ns0:color ns0:val="1A365D"/>
+              </ns0:rPr>
+              <ns0:t xml:space="preserve">Facing: [  ] Flat to Front Sideline   [  ] Angled Inward (____°)   |   [  ] Ground Chocks Required</ns0:t>
+            </ns0:r>
+          </ns0:p>
+        </ns0:tc>
+      </ns0:tr>
+    </ns0:tbl>
+    <ns0:p>
+      <ns0:pPr>
+        <ns0:spacing ns0:before="40" ns0:after="40"/>
+        <ns0:jc ns0:val="center"/>
+      </ns0:pPr>
+      <ns0:r>
+        <ns0:rPr>
+          <ns0:i/>
+          <ns0:sz ns0:val="15"/>
+          <ns0:color ns0:val="718096"/>
+        </ns0:rPr>
+        <ns0:t>✂ Cut along dashed blue border (exact 6.0" × 4.0" card). Mark prop location with red marker, laminate, and attach to placard.</ns0:t>
+      </ns0:r>
+    </ns0:p>
+    <ns0:p>
+      <ns0:pPr>
+        <ns0:pStyle ns0:val="Heading2"/>
+        <ns0:spacing ns0:before="60" ns0:after="20"/>
+      </ns0:pPr>
+      <ns0:r>
+        <ns0:rPr>
+          <ns0:b/>
+          <ns0:sz ns0:val="18"/>
+          <ns0:color ns0:val="1A365D"/>
+        </ns0:rPr>
+        <ns0:t>Field Coordinator &amp; Drill Writer Instructions</ns0:t>
       </ns0:r>
     </ns0:p>
     <ns0:p>
@@ -6801,13 +7175,13 @@
           <ns0:b/>
           <ns0:sz ns0:val="15"/>
         </ns0:rPr>
-        <ns0:t xml:space="preserve">• Non-Locking Casters &amp; Ground Chocking: </ns0:t>
+        <ns0:t xml:space="preserve">1. Drill Card Marking: </ns0:t>
       </ns0:r>
       <ns0:r>
         <ns0:rPr>
           <ns0:sz ns0:val="15"/>
         </ns0:rPr>
-        <ns0:t>Carts use non-locking swivel casters for rapid rolling agility. When positioned at drill coordinates in breezy conditions, place extra double-bagged 15-lb sandbags on the turf firmly against wheels as wheel chocks to prevent roll drift.</ns0:t>
+        <ns0:t>Before each competition or dress rehearsal, drill coordinators fill in the prop number, show segment, and exact coordinate. Use a bright permanent marker to draw the prop outline on the field diagram, indicating front-facing orientation relative to the front sideline.</ns0:t>
       </ns0:r>
     </ns0:p>
     <ns0:p>
@@ -6820,13 +7194,13 @@
           <ns0:b/>
           <ns0:sz ns0:val="15"/>
         </ns0:rPr>
-        <ns0:t xml:space="preserve">• Hand Placement &amp; Low Leverage: </ns0:t>
+        <ns0:t xml:space="preserve">2. Laminate &amp; Mount: </ns0:t>
       </ns0:r>
       <ns0:r>
         <ns0:rPr>
           <ns0:sz ns0:val="15"/>
         </ns0:rPr>
-        <ns0:t>Always push from the lower 2x4 wooden cart base framing. NEVER push, pull, or climb on the upright steel pipes or diagonal struts, which introduces severe overturning tipping leverage. No fewer than 2 handlers per cart (assign 3–4 handlers for steep ramps like the Falcon Stadium tunnel or in high winds).</ns0:t>
+        <ns0:t>Cut out the 6" × 4" card, laminate in standard 4x6 heat-seal pouches, and affix into the placeholder box on Appendix C using clear outdoor hook-and-loop (Velcro) coins or corner photo tabs for easy mid-season drill revisions.</ns0:t>
       </ns0:r>
     </ns0:p>
     <ns0:p>
@@ -6839,52 +7213,18 @@
           <ns0:b/>
           <ns0:sz ns0:val="15"/>
         </ns0:rPr>
-        <ns0:t xml:space="preserve">• Mandatory Double-Bagging (Rule 8.05): </ns0:t>
+        <ns0:t xml:space="preserve">3. Two-Shot Staging Protocol: </ns0:t>
       </ns0:r>
       <ns0:r>
         <ns0:rPr>
           <ns0:sz ns0:val="15"/>
         </ns0:rPr>
-        <ns0:t>All 15-lb sandbags must have intact heavy-duty plastic inner liners. Never bring single-layer bags onto athletic turf. Carts must not exceed 300 lbs total (~75 lb/wheel) to prevent rubber infill rutting.</ns0:t>
+        <ns0:t>During two-shot competitions (Prelims &amp; Finals), leave sandbag ballast intact on the carts in the trailer lot between shows. If winds increase during the afternoon break, simply remove the quick-release pin from each diagonal strut to lay the vinyl frames flat on the carts, eliminating sail area while maintaining readiness.</ns0:t>
       </ns0:r>
     </ns0:p>
     <ns0:p>
       <ns0:pPr>
-        <ns0:spacing ns0:before="10" ns0:after="10"/>
-        <ns0:ind ns0:left="360" ns0:hanging="240"/>
-      </ns0:pPr>
-      <ns0:r>
-        <ns0:rPr>
-          <ns0:b/>
-          <ns0:sz ns0:val="15"/>
-          <ns0:color ns0:val="C53030"/>
-        </ns0:rPr>
-        <ns0:t xml:space="preserve">• High-Wind Emergency Abort: </ns0:t>
-      </ns0:r>
-      <ns0:r>
-        <ns0:rPr>
-          <ns0:sz ns0:val="15"/>
-        </ns0:rPr>
-        <ns0:t>If severe gusts strike on-field, handlers immediately brace against the upwind 2x4 base. Authorized parent crew (with Rule 9.07 Field Pass wristbands) will assist to lay props flat on turf if ordered by directors.</ns0:t>
-      </ns0:r>
-    </ns0:p>
-    <ns0:p>
-      <ns0:pPr>
-        <ns0:pStyle ns0:val="Heading2"/>
-        <ns0:spacing ns0:before="60" ns0:after="20"/>
-      </ns0:pPr>
-      <ns0:r>
-        <ns0:rPr>
-          <ns0:b/>
-          <ns0:sz ns0:val="19"/>
-          <ns0:color ns0:val="1A365D"/>
-        </ns0:rPr>
-        <ns0:t>3. Rapid Field Assembly &amp; Teardown Checklist</ns0:t>
-      </ns0:r>
-    </ns0:p>
-    <ns0:p>
-      <ns0:pPr>
-        <ns0:spacing ns0:before="10" ns0:after="10"/>
+        <ns0:spacing ns0:before="10" ns0:after="20"/>
         <ns0:ind ns0:left="360" ns0:hanging="240"/>
       </ns0:pPr>
       <ns0:r>
@@ -6892,32 +7232,13 @@
           <ns0:b/>
           <ns0:sz ns0:val="15"/>
         </ns0:rPr>
-        <ns0:t xml:space="preserve">• Unloading &amp; Staging (Reverse of Loading): </ns0:t>
+        <ns0:t xml:space="preserve">4. Continuous Uphill Egress: </ns0:t>
       </ns0:r>
       <ns0:r>
         <ns0:rPr>
           <ns0:sz ns0:val="15"/>
         </ns0:rPr>
-        <ns0:t>1) Unstrap carts from trailer nose wall &amp; lower from short ends; 2) Retrieve 10'×8' frames from cross support beams; 3) Pull off protective tennis balls from upper struts (stow in tote); 4) Rapidly bolt frame to cart using cordless power driver with socket; 5) Mate 2-piece struts and lock quick-release retaining pins; 6) Stage required ballast &amp; wheel chocks.</ns0:t>
-      </ns0:r>
-    </ns0:p>
-    <ns0:p>
-      <ns0:pPr>
-        <ns0:spacing ns0:before="10" ns0:after="0"/>
-        <ns0:ind ns0:left="360" ns0:hanging="240"/>
-      </ns0:pPr>
-      <ns0:r>
-        <ns0:rPr>
-          <ns0:b/>
-          <ns0:sz ns0:val="15"/>
-        </ns0:rPr>
-        <ns0:t xml:space="preserve">• Teardown &amp; Trailer Packing: </ns0:t>
-      </ns0:r>
-      <ns0:r>
-        <ns0:rPr>
-          <ns0:sz ns0:val="15"/>
-        </ns0:rPr>
-        <ns0:t>1) Immediate de-ballasting at stadium exit chute; 2) Stack sandbags low over trailer axles; 3) Pull strut retaining pins (stow in tote); 4) Lower strut arm folds flat on cart; 5) Install protective tennis balls over upper strut ends; 6) Unbolt frame using cordless power driver (stow bolts in tote); 7) Slide frames onto trailer cross beams; 8) Stand carts vertically on short ends strapped against front nose wall.</ns0:t>
+        <ns0:t>Always push carts all the way up the hill to the trailer before removing ballast. Carts cannot be de-ballasted at the stadium exit chute. Assign 3 to 4 handlers per cart on steep grades such as Falcon Stadium.</ns0:t>
       </ns0:r>
     </ns0:p>
     <ns0:sectPr>

</xml_diff>

<commit_message>
fix(pchsmb): eliminate placard spillover to ensure exact 1-page placard on Page 40 and card template on Page 41
</commit_message>
<xml_diff>
--- a/PCHSMB/_Backdrop/docs/Backdrop_Assembly_Guide.docx
+++ b/PCHSMB/_Backdrop/docs/Backdrop_Assembly_Guide.docx
@@ -6146,27 +6146,27 @@
       <ns0:pPr>
         <ns0:pStyle ns0:val="Heading1"/>
         <ns0:pageBreakBefore/>
+        <ns0:spacing ns0:before="0" ns0:after="10"/>
+        <ns0:jc ns0:val="center"/>
+      </ns0:pPr>
+      <ns0:r>
+        <ns0:rPr>
+          <ns0:b/>
+          <ns0:sz ns0:val="22"/>
+          <ns0:color ns0:val="1A365D"/>
+        </ns0:rPr>
+        <ns0:t>APPENDIX C: FIELD OPERATIONS PLACARD</ns0:t>
+      </ns0:r>
+    </ns0:p>
+    <ns0:p>
+      <ns0:pPr>
         <ns0:spacing ns0:before="0" ns0:after="20"/>
         <ns0:jc ns0:val="center"/>
       </ns0:pPr>
       <ns0:r>
         <ns0:rPr>
-          <ns0:b/>
-          <ns0:sz ns0:val="23"/>
-          <ns0:color ns0:val="1A365D"/>
-        </ns0:rPr>
-        <ns0:t>APPENDIX C: FIELD OPERATIONS PLACARD</ns0:t>
-      </ns0:r>
-    </ns0:p>
-    <ns0:p>
-      <ns0:pPr>
-        <ns0:spacing ns0:before="0" ns0:after="40"/>
-        <ns0:jc ns0:val="center"/>
-      </ns0:pPr>
-      <ns0:r>
-        <ns0:rPr>
           <ns0:i/>
-          <ns0:sz ns0:val="16"/>
+          <ns0:sz ns0:val="15"/>
           <ns0:color ns0:val="4A5568"/>
         </ns0:rPr>
         <ns0:t>One-Page Laminated Field Reference for Trained Student Handlers &amp; Parent Pit Crew</ns0:t>
@@ -6191,17 +6191,17 @@
           <ns0:tcPr>
             <ns0:tcW ns0:w="8640" ns0:type="dxa"/>
             <ns0:tcMar>
-              <ns0:top ns0:w="160" ns0:type="dxa"/>
-              <ns0:left ns0:w="200" ns0:type="dxa"/>
-              <ns0:bottom ns0:w="160" ns0:type="dxa"/>
-              <ns0:right ns0:w="200" ns0:type="dxa"/>
+              <ns0:top ns0:w="120" ns0:type="dxa"/>
+              <ns0:left ns0:w="160" ns0:type="dxa"/>
+              <ns0:bottom ns0:w="120" ns0:type="dxa"/>
+              <ns0:right ns0:w="160" ns0:type="dxa"/>
             </ns0:tcMar>
             <ns0:shd ns0:val="clear" ns0:color="auto" ns0:fill="F7FAFC"/>
             <ns0:vAlign ns0:val="center"/>
           </ns0:tcPr>
           <ns0:p>
             <ns0:pPr>
-              <ns0:spacing ns0:before="0" ns0:after="30"/>
+              <ns0:spacing ns0:before="0" ns0:after="20"/>
               <ns0:jc ns0:val="center"/>
             </ns0:pPr>
             <ns0:r>
@@ -6215,12 +6215,12 @@
           </ns0:p>
           <ns0:p>
             <ns0:pPr>
-              <ns0:spacing ns0:before="0" ns0:after="40"/>
+              <ns0:spacing ns0:before="0" ns0:after="30"/>
               <ns0:jc ns0:val="center"/>
             </ns0:pPr>
             <ns0:r>
               <ns0:rPr>
-                <ns0:sz ns0:val="15"/>
+                <ns0:sz ns0:val="14"/>
                 <ns0:color ns0:val="718096"/>
               </ns0:rPr>
               <ns0:t>(Exact 6.0" wide × 4.0" high mounting area for laminated drill card from Appendix C.1)</ns0:t>
@@ -6228,25 +6228,25 @@
           </ns0:p>
           <ns0:p>
             <ns0:pPr>
-              <ns0:spacing ns0:before="40" ns0:after="20"/>
+              <ns0:spacing ns0:before="20" ns0:after="15"/>
               <ns0:jc ns0:val="center"/>
             </ns0:pPr>
             <ns0:r>
               <ns0:rPr>
                 <ns0:b/>
-                <ns0:sz ns0:val="16"/>
+                <ns0:sz ns0:val="15"/>
               </ns0:rPr>
               <ns0:t xml:space="preserve">Prop #: _________   |   Show Segment: _________________   |   Side: [  ] Side 1   [  ] Side 2</ns0:t>
             </ns0:r>
           </ns0:p>
           <ns0:p>
             <ns0:pPr>
-              <ns0:spacing ns0:before="20" ns0:after="20"/>
+              <ns0:spacing ns0:before="15" ns0:after="15"/>
               <ns0:jc ns0:val="center"/>
             </ns0:pPr>
             <ns0:r>
               <ns0:rPr>
-                <ns0:sz ns0:val="15"/>
+                <ns0:sz ns0:val="14"/>
                 <ns0:color ns0:val="4A5568"/>
               </ns0:rPr>
               <ns0:t xml:space="preserve">Field Drill Coordinate: _______________________________________________________________</ns0:t>
@@ -6254,12 +6254,12 @@
           </ns0:p>
           <ns0:p>
             <ns0:pPr>
-              <ns0:spacing ns0:before="20" ns0:after="20"/>
+              <ns0:spacing ns0:before="15" ns0:after="15"/>
               <ns0:jc ns0:val="center"/>
             </ns0:pPr>
             <ns0:r>
               <ns0:rPr>
-                <ns0:sz ns0:val="15"/>
+                <ns0:sz ns0:val="14"/>
                 <ns0:color ns0:val="4A5568"/>
               </ns0:rPr>
               <ns0:t xml:space="preserve">Assigned Handlers (Min. 2; 3–4 on ramps/wind): 1) _______________ 2) _______________ 3) _______________</ns0:t>
@@ -6267,12 +6267,12 @@
           </ns0:p>
           <ns0:p>
             <ns0:pPr>
-              <ns0:spacing ns0:before="20" ns0:after="0"/>
+              <ns0:spacing ns0:before="15" ns0:after="0"/>
               <ns0:jc ns0:val="center"/>
             </ns0:pPr>
             <ns0:r>
               <ns0:rPr>
-                <ns0:sz ns0:val="15"/>
+                <ns0:sz ns0:val="14"/>
                 <ns0:color ns0:val="718096"/>
               </ns0:rPr>
               <ns0:t xml:space="preserve">Facing: [  ] Flat to Front Sideline   [  ] Angled (____°)   |   [  ] Ground Wheel Chocks Staged</ns0:t>
@@ -6284,12 +6284,12 @@
     <ns0:p>
       <ns0:pPr>
         <ns0:pStyle ns0:val="Heading2"/>
-        <ns0:spacing ns0:before="50" ns0:after="20"/>
+        <ns0:spacing ns0:before="25" ns0:after="10"/>
       </ns0:pPr>
       <ns0:r>
         <ns0:rPr>
           <ns0:b/>
-          <ns0:sz ns0:val="18"/>
+          <ns0:sz ns0:val="17"/>
           <ns0:color ns0:val="1A365D"/>
         </ns0:rPr>
         <ns0:t>1. Wind Velocity Limits &amp; Standardized Ballasting Schedule</ns0:t>
@@ -6299,6 +6299,12 @@
       <ns0:tblPr>
         <ns0:tblW ns0:w="9360" ns0:type="dxa"/>
         <ns0:jc ns0:val="center"/>
+        <ns0:tblCellMar>
+          <ns0:top ns0:w="20" ns0:type="dxa"/>
+          <ns0:bottom ns0:w="20" ns0:type="dxa"/>
+          <ns0:left ns0:w="60" ns0:type="dxa"/>
+          <ns0:right ns0:w="60" ns0:type="dxa"/>
+        </ns0:tblCellMar>
         <ns0:tblBorders>
           <ns0:top ns0:val="single" ns0:sz="4" ns0:space="0" ns0:color="CBD5E0"/>
           <ns0:left ns0:val="single" ns0:sz="4" ns0:space="0" ns0:color="CBD5E0"/>
@@ -6319,12 +6325,12 @@
           </ns0:tcPr>
           <ns0:p>
             <ns0:pPr>
-              <ns0:spacing ns0:before="15" ns0:after="15"/>
+              <ns0:spacing ns0:before="0" ns0:after="0" ns0:line="180" ns0:lineRule="auto"/>
             </ns0:pPr>
             <ns0:r>
               <ns0:rPr>
                 <ns0:b/>
-                <ns0:sz ns0:val="15"/>
+                <ns0:sz ns0:val="14"/>
               </ns0:rPr>
               <ns0:t>Tier / State</ns0:t>
             </ns0:r>
@@ -6337,12 +6343,12 @@
           </ns0:tcPr>
           <ns0:p>
             <ns0:pPr>
-              <ns0:spacing ns0:before="15" ns0:after="15"/>
+              <ns0:spacing ns0:before="0" ns0:after="0" ns0:line="180" ns0:lineRule="auto"/>
             </ns0:pPr>
             <ns0:r>
               <ns0:rPr>
                 <ns0:b/>
-                <ns0:sz ns0:val="15"/>
+                <ns0:sz ns0:val="14"/>
               </ns0:rPr>
               <ns0:t>Wind Velocity</ns0:t>
             </ns0:r>
@@ -6355,12 +6361,12 @@
           </ns0:tcPr>
           <ns0:p>
             <ns0:pPr>
-              <ns0:spacing ns0:before="15" ns0:after="15"/>
+              <ns0:spacing ns0:before="0" ns0:after="0" ns0:line="180" ns0:lineRule="auto"/>
             </ns0:pPr>
             <ns0:r>
               <ns0:rPr>
                 <ns0:b/>
-                <ns0:sz ns0:val="15"/>
+                <ns0:sz ns0:val="14"/>
               </ns0:rPr>
               <ns0:t>Ballast Deployment (15-lb Bags)</ns0:t>
             </ns0:r>
@@ -6373,12 +6379,12 @@
           </ns0:tcPr>
           <ns0:p>
             <ns0:pPr>
-              <ns0:spacing ns0:before="15" ns0:after="15"/>
+              <ns0:spacing ns0:before="0" ns0:after="0" ns0:line="180" ns0:lineRule="auto"/>
             </ns0:pPr>
             <ns0:r>
               <ns0:rPr>
                 <ns0:b/>
-                <ns0:sz ns0:val="15"/>
+                <ns0:sz ns0:val="14"/>
               </ns0:rPr>
               <ns0:t>Total Wt</ns0:t>
             </ns0:r>
@@ -6391,12 +6397,12 @@
           </ns0:tcPr>
           <ns0:p>
             <ns0:pPr>
-              <ns0:spacing ns0:before="15" ns0:after="15"/>
+              <ns0:spacing ns0:before="0" ns0:after="0" ns0:line="180" ns0:lineRule="auto"/>
             </ns0:pPr>
             <ns0:r>
               <ns0:rPr>
                 <ns0:b/>
-                <ns0:sz ns0:val="15"/>
+                <ns0:sz ns0:val="14"/>
               </ns0:rPr>
               <ns0:t>Operational Limits &amp; Action</ns0:t>
             </ns0:r>
@@ -6410,12 +6416,12 @@
           </ns0:tcPr>
           <ns0:p>
             <ns0:pPr>
-              <ns0:spacing ns0:before="10" ns0:after="10"/>
+              <ns0:spacing ns0:before="0" ns0:after="0" ns0:line="180" ns0:lineRule="auto"/>
             </ns0:pPr>
             <ns0:r>
               <ns0:rPr>
                 <ns0:b/>
-                <ns0:sz ns0:val="14"/>
+                <ns0:sz ns0:val="13"/>
               </ns0:rPr>
               <ns0:t>Tier 0: Calm</ns0:t>
             </ns0:r>
@@ -6427,11 +6433,11 @@
           </ns0:tcPr>
           <ns0:p>
             <ns0:pPr>
-              <ns0:spacing ns0:before="10" ns0:after="10"/>
+              <ns0:spacing ns0:before="0" ns0:after="0" ns0:line="180" ns0:lineRule="auto"/>
             </ns0:pPr>
             <ns0:r>
               <ns0:rPr>
-                <ns0:sz ns0:val="14"/>
+                <ns0:sz ns0:val="13"/>
               </ns0:rPr>
               <ns0:t>0–8 mph (gusts ≤10)</ns0:t>
             </ns0:r>
@@ -6443,11 +6449,11 @@
           </ns0:tcPr>
           <ns0:p>
             <ns0:pPr>
-              <ns0:spacing ns0:before="10" ns0:after="10"/>
+              <ns0:spacing ns0:before="0" ns0:after="0" ns0:line="180" ns0:lineRule="auto"/>
             </ns0:pPr>
             <ns0:r>
               <ns0:rPr>
-                <ns0:sz ns0:val="14"/>
+                <ns0:sz ns0:val="13"/>
               </ns0:rPr>
               <ns0:t>0 bags (unballasted)</ns0:t>
             </ns0:r>
@@ -6459,11 +6465,11 @@
           </ns0:tcPr>
           <ns0:p>
             <ns0:pPr>
-              <ns0:spacing ns0:before="10" ns0:after="10"/>
+              <ns0:spacing ns0:before="0" ns0:after="0" ns0:line="180" ns0:lineRule="auto"/>
             </ns0:pPr>
             <ns0:r>
               <ns0:rPr>
-                <ns0:sz ns0:val="14"/>
+                <ns0:sz ns0:val="13"/>
               </ns0:rPr>
               <ns0:t>153 lbs</ns0:t>
             </ns0:r>
@@ -6475,11 +6481,11 @@
           </ns0:tcPr>
           <ns0:p>
             <ns0:pPr>
-              <ns0:spacing ns0:before="10" ns0:after="10"/>
+              <ns0:spacing ns0:before="0" ns0:after="0" ns0:line="180" ns0:lineRule="auto"/>
             </ns0:pPr>
             <ns0:r>
               <ns0:rPr>
-                <ns0:sz ns0:val="14"/>
+                <ns0:sz ns0:val="13"/>
               </ns0:rPr>
               <ns0:t>Safe to 8 mph (10 gust max). Must upgrade to Tier 1 if wind &gt;8 mph.</ns0:t>
             </ns0:r>
@@ -6493,12 +6499,12 @@
           </ns0:tcPr>
           <ns0:p>
             <ns0:pPr>
-              <ns0:spacing ns0:before="10" ns0:after="10"/>
+              <ns0:spacing ns0:before="0" ns0:after="0" ns0:line="180" ns0:lineRule="auto"/>
             </ns0:pPr>
             <ns0:r>
               <ns0:rPr>
                 <ns0:b/>
-                <ns0:sz ns0:val="14"/>
+                <ns0:sz ns0:val="13"/>
               </ns0:rPr>
               <ns0:t>Tier 1: Normal</ns0:t>
             </ns0:r>
@@ -6510,11 +6516,11 @@
           </ns0:tcPr>
           <ns0:p>
             <ns0:pPr>
-              <ns0:spacing ns0:before="10" ns0:after="10"/>
+              <ns0:spacing ns0:before="0" ns0:after="0" ns0:line="180" ns0:lineRule="auto"/>
             </ns0:pPr>
             <ns0:r>
               <ns0:rPr>
-                <ns0:sz ns0:val="14"/>
+                <ns0:sz ns0:val="13"/>
               </ns0:rPr>
               <ns0:t>8–12 mph</ns0:t>
             </ns0:r>
@@ -6526,13 +6532,13 @@
           </ns0:tcPr>
           <ns0:p>
             <ns0:pPr>
-              <ns0:spacing ns0:before="10" ns0:after="10"/>
+              <ns0:spacing ns0:before="0" ns0:after="0" ns0:line="180" ns0:lineRule="auto"/>
             </ns0:pPr>
             <ns0:r>
               <ns0:rPr>
-                <ns0:sz ns0:val="14"/>
+                <ns0:sz ns0:val="13"/>
               </ns0:rPr>
-              <ns0:t>4x bags (2 per wing post; 60 lb ballast)</ns0:t>
+              <ns0:t>4x bags (2 per wing post; 60 lb)</ns0:t>
             </ns0:r>
           </ns0:p>
         </ns0:tc>
@@ -6542,11 +6548,11 @@
           </ns0:tcPr>
           <ns0:p>
             <ns0:pPr>
-              <ns0:spacing ns0:before="10" ns0:after="10"/>
+              <ns0:spacing ns0:before="0" ns0:after="0" ns0:line="180" ns0:lineRule="auto"/>
             </ns0:pPr>
             <ns0:r>
               <ns0:rPr>
-                <ns0:sz ns0:val="14"/>
+                <ns0:sz ns0:val="13"/>
               </ns0:rPr>
               <ns0:t>213 lbs</ns0:t>
             </ns0:r>
@@ -6558,13 +6564,13 @@
           </ns0:tcPr>
           <ns0:p>
             <ns0:pPr>
-              <ns0:spacing ns0:before="10" ns0:after="10"/>
+              <ns0:spacing ns0:before="0" ns0:after="0" ns0:line="180" ns0:lineRule="auto"/>
             </ns0:pPr>
             <ns0:r>
               <ns0:rPr>
-                <ns0:sz ns0:val="14"/>
+                <ns0:sz ns0:val="13"/>
               </ns0:rPr>
-              <ns0:t>Standard field staging. 16.9 mph max gust. Zero turf compaction.</ns0:t>
+              <ns0:t>Standard staging. 16.9 mph max gust. Zero turf compaction.</ns0:t>
             </ns0:r>
           </ns0:p>
         </ns0:tc>
@@ -6576,12 +6582,12 @@
           </ns0:tcPr>
           <ns0:p>
             <ns0:pPr>
-              <ns0:spacing ns0:before="10" ns0:after="10"/>
+              <ns0:spacing ns0:before="0" ns0:after="0" ns0:line="180" ns0:lineRule="auto"/>
             </ns0:pPr>
             <ns0:r>
               <ns0:rPr>
                 <ns0:b/>
-                <ns0:sz ns0:val="14"/>
+                <ns0:sz ns0:val="13"/>
               </ns0:rPr>
               <ns0:t>Tier 2: Advisory</ns0:t>
             </ns0:r>
@@ -6593,11 +6599,11 @@
           </ns0:tcPr>
           <ns0:p>
             <ns0:pPr>
-              <ns0:spacing ns0:before="10" ns0:after="10"/>
+              <ns0:spacing ns0:before="0" ns0:after="0" ns0:line="180" ns0:lineRule="auto"/>
             </ns0:pPr>
             <ns0:r>
               <ns0:rPr>
-                <ns0:sz ns0:val="14"/>
+                <ns0:sz ns0:val="13"/>
               </ns0:rPr>
               <ns0:t>12–18 mph</ns0:t>
             </ns0:r>
@@ -6609,13 +6615,13 @@
           </ns0:tcPr>
           <ns0:p>
             <ns0:pPr>
-              <ns0:spacing ns0:before="10" ns0:after="10"/>
+              <ns0:spacing ns0:before="0" ns0:after="0" ns0:line="180" ns0:lineRule="auto"/>
             </ns0:pPr>
             <ns0:r>
               <ns0:rPr>
-                <ns0:sz ns0:val="14"/>
+                <ns0:sz ns0:val="13"/>
               </ns0:rPr>
-              <ns0:t>6x bags (3 per wing post; 90 lb ballast)</ns0:t>
+              <ns0:t>6x bags (3 per wing post; 90 lb)</ns0:t>
             </ns0:r>
           </ns0:p>
         </ns0:tc>
@@ -6625,11 +6631,11 @@
           </ns0:tcPr>
           <ns0:p>
             <ns0:pPr>
-              <ns0:spacing ns0:before="10" ns0:after="10"/>
+              <ns0:spacing ns0:before="0" ns0:after="0" ns0:line="180" ns0:lineRule="auto"/>
             </ns0:pPr>
             <ns0:r>
               <ns0:rPr>
-                <ns0:sz ns0:val="14"/>
+                <ns0:sz ns0:val="13"/>
               </ns0:rPr>
               <ns0:t>243 lbs</ns0:t>
             </ns0:r>
@@ -6641,11 +6647,11 @@
           </ns0:tcPr>
           <ns0:p>
             <ns0:pPr>
-              <ns0:spacing ns0:before="10" ns0:after="10"/>
+              <ns0:spacing ns0:before="0" ns0:after="0" ns0:line="180" ns0:lineRule="auto"/>
             </ns0:pPr>
             <ns0:r>
               <ns0:rPr>
-                <ns0:sz ns0:val="14"/>
+                <ns0:sz ns0:val="13"/>
               </ns0:rPr>
               <ns0:t>Attentive staging. 18.4 mph max gust. Deploy ground wheel chocks.</ns0:t>
             </ns0:r>
@@ -6659,12 +6665,12 @@
           </ns0:tcPr>
           <ns0:p>
             <ns0:pPr>
-              <ns0:spacing ns0:before="10" ns0:after="10"/>
+              <ns0:spacing ns0:before="0" ns0:after="0" ns0:line="180" ns0:lineRule="auto"/>
             </ns0:pPr>
             <ns0:r>
               <ns0:rPr>
                 <ns0:b/>
-                <ns0:sz ns0:val="14"/>
+                <ns0:sz ns0:val="13"/>
               </ns0:rPr>
               <ns0:t>Tier 3: High-Wind</ns0:t>
             </ns0:r>
@@ -6676,11 +6682,11 @@
           </ns0:tcPr>
           <ns0:p>
             <ns0:pPr>
-              <ns0:spacing ns0:before="10" ns0:after="10"/>
+              <ns0:spacing ns0:before="0" ns0:after="0" ns0:line="180" ns0:lineRule="auto"/>
             </ns0:pPr>
             <ns0:r>
               <ns0:rPr>
-                <ns0:sz ns0:val="14"/>
+                <ns0:sz ns0:val="13"/>
               </ns0:rPr>
               <ns0:t>18–22 mph</ns0:t>
             </ns0:r>
@@ -6692,13 +6698,13 @@
           </ns0:tcPr>
           <ns0:p>
             <ns0:pPr>
-              <ns0:spacing ns0:before="10" ns0:after="10"/>
+              <ns0:spacing ns0:before="0" ns0:after="0" ns0:line="180" ns0:lineRule="auto"/>
             </ns0:pPr>
             <ns0:r>
               <ns0:rPr>
-                <ns0:sz ns0:val="14"/>
+                <ns0:sz ns0:val="13"/>
               </ns0:rPr>
-              <ns0:t>6 on wings + 3 across rear rail A (135 lb)</ns0:t>
+              <ns0:t>6 on wings + 3 across rear rail (135 lb)</ns0:t>
             </ns0:r>
           </ns0:p>
         </ns0:tc>
@@ -6708,11 +6714,11 @@
           </ns0:tcPr>
           <ns0:p>
             <ns0:pPr>
-              <ns0:spacing ns0:before="10" ns0:after="10"/>
+              <ns0:spacing ns0:before="0" ns0:after="0" ns0:line="180" ns0:lineRule="auto"/>
             </ns0:pPr>
             <ns0:r>
               <ns0:rPr>
-                <ns0:sz ns0:val="14"/>
+                <ns0:sz ns0:val="13"/>
               </ns0:rPr>
               <ns0:t>288 lbs</ns0:t>
             </ns0:r>
@@ -6724,11 +6730,11 @@
           </ns0:tcPr>
           <ns0:p>
             <ns0:pPr>
-              <ns0:spacing ns0:before="10" ns0:after="10"/>
+              <ns0:spacing ns0:before="0" ns0:after="0" ns0:line="180" ns0:lineRule="auto"/>
             </ns0:pPr>
             <ns0:r>
               <ns0:rPr>
-                <ns0:sz ns0:val="14"/>
+                <ns0:sz ns0:val="13"/>
               </ns0:rPr>
               <ns0:t>22.5 mph max gust. Rear rail doubles leverage. Max safe turf load.</ns0:t>
             </ns0:r>
@@ -6742,12 +6748,12 @@
           </ns0:tcPr>
           <ns0:p>
             <ns0:pPr>
-              <ns0:spacing ns0:before="10" ns0:after="10"/>
+              <ns0:spacing ns0:before="0" ns0:after="0" ns0:line="180" ns0:lineRule="auto"/>
             </ns0:pPr>
             <ns0:r>
               <ns0:rPr>
                 <ns0:b/>
-                <ns0:sz ns0:val="14"/>
+                <ns0:sz ns0:val="13"/>
                 <ns0:color ns0:val="C53030"/>
               </ns0:rPr>
               <ns0:t>Tier 4: ABORT</ns0:t>
@@ -6760,12 +6766,12 @@
           </ns0:tcPr>
           <ns0:p>
             <ns0:pPr>
-              <ns0:spacing ns0:before="10" ns0:after="10"/>
+              <ns0:spacing ns0:before="0" ns0:after="0" ns0:line="180" ns0:lineRule="auto"/>
             </ns0:pPr>
             <ns0:r>
               <ns0:rPr>
                 <ns0:b/>
-                <ns0:sz ns0:val="14"/>
+                <ns0:sz ns0:val="13"/>
                 <ns0:color ns0:val="C53030"/>
               </ns0:rPr>
               <ns0:t>&gt;20 sust. / &gt;25 gust</ns0:t>
@@ -6778,11 +6784,11 @@
           </ns0:tcPr>
           <ns0:p>
             <ns0:pPr>
-              <ns0:spacing ns0:before="10" ns0:after="10"/>
+              <ns0:spacing ns0:before="0" ns0:after="0" ns0:line="180" ns0:lineRule="auto"/>
             </ns0:pPr>
             <ns0:r>
               <ns0:rPr>
-                <ns0:sz ns0:val="14"/>
+                <ns0:sz ns0:val="13"/>
               </ns0:rPr>
               <ns0:t>—</ns0:t>
             </ns0:r>
@@ -6794,11 +6800,11 @@
           </ns0:tcPr>
           <ns0:p>
             <ns0:pPr>
-              <ns0:spacing ns0:before="10" ns0:after="10"/>
+              <ns0:spacing ns0:before="0" ns0:after="0" ns0:line="180" ns0:lineRule="auto"/>
             </ns0:pPr>
             <ns0:r>
               <ns0:rPr>
-                <ns0:sz ns0:val="14"/>
+                <ns0:sz ns0:val="13"/>
               </ns0:rPr>
               <ns0:t>—</ns0:t>
             </ns0:r>
@@ -6810,12 +6816,12 @@
           </ns0:tcPr>
           <ns0:p>
             <ns0:pPr>
-              <ns0:spacing ns0:before="10" ns0:after="10"/>
+              <ns0:spacing ns0:before="0" ns0:after="0" ns0:line="180" ns0:lineRule="auto"/>
             </ns0:pPr>
             <ns0:r>
               <ns0:rPr>
                 <ns0:b/>
-                <ns0:sz ns0:val="14"/>
+                <ns0:sz ns0:val="13"/>
                 <ns0:color ns0:val="C53030"/>
               </ns0:rPr>
               <ns0:t>STRICT SAFETY NO-GO. Withdraw props or immediately lay flat.</ns0:t>
@@ -6827,12 +6833,12 @@
     <ns0:p>
       <ns0:pPr>
         <ns0:pStyle ns0:val="Heading2"/>
-        <ns0:spacing ns0:before="40" ns0:after="15"/>
+        <ns0:spacing ns0:before="25" ns0:after="8"/>
       </ns0:pPr>
       <ns0:r>
         <ns0:rPr>
           <ns0:b/>
-          <ns0:sz ns0:val="18"/>
+          <ns0:sz ns0:val="17"/>
           <ns0:color ns0:val="1A365D"/>
         </ns0:rPr>
         <ns0:t>2. Critical On-Field Safety &amp; Turf Protection Rules</ns0:t>
@@ -6840,77 +6846,77 @@
     </ns0:p>
     <ns0:p>
       <ns0:pPr>
-        <ns0:spacing ns0:before="8" ns0:after="8"/>
+        <ns0:spacing ns0:before="0" ns0:after="6" ns0:line="185" ns0:lineRule="auto"/>
         <ns0:ind ns0:left="360" ns0:hanging="240"/>
       </ns0:pPr>
       <ns0:r>
         <ns0:rPr>
           <ns0:b/>
-          <ns0:sz ns0:val="14"/>
+          <ns0:sz ns0:val="13"/>
         </ns0:rPr>
         <ns0:t xml:space="preserve">• Non-Locking Casters &amp; Ground Chocking: </ns0:t>
       </ns0:r>
       <ns0:r>
         <ns0:rPr>
-          <ns0:sz ns0:val="14"/>
+          <ns0:sz ns0:val="13"/>
         </ns0:rPr>
         <ns0:t>Carts use non-locking swivel casters for rapid agility. When positioned at drill coordinates in breezy conditions, place extra double-bagged 15-lb sandbags on the turf firmly against wheels as wheel chocks to prevent roll drift.</ns0:t>
       </ns0:r>
     </ns0:p>
     <ns0:p>
       <ns0:pPr>
-        <ns0:spacing ns0:before="8" ns0:after="8"/>
+        <ns0:spacing ns0:before="0" ns0:after="6" ns0:line="185" ns0:lineRule="auto"/>
         <ns0:ind ns0:left="360" ns0:hanging="240"/>
       </ns0:pPr>
       <ns0:r>
         <ns0:rPr>
           <ns0:b/>
-          <ns0:sz ns0:val="14"/>
+          <ns0:sz ns0:val="13"/>
         </ns0:rPr>
         <ns0:t xml:space="preserve">• Hand Placement &amp; Crew Pairing: </ns0:t>
       </ns0:r>
       <ns0:r>
         <ns0:rPr>
-          <ns0:sz ns0:val="14"/>
+          <ns0:sz ns0:val="13"/>
         </ns0:rPr>
         <ns0:t>Always push from lower 2x4 cart framing; NEVER push or climb on upright pipes or struts. No fewer than 2 handlers per cart under normal conditions; assign 3 to 4 handlers on steep grades (such as the Falcon Stadium tunnel ramp) or in high winds.</ns0:t>
       </ns0:r>
     </ns0:p>
     <ns0:p>
       <ns0:pPr>
-        <ns0:spacing ns0:before="8" ns0:after="8"/>
+        <ns0:spacing ns0:before="0" ns0:after="6" ns0:line="185" ns0:lineRule="auto"/>
         <ns0:ind ns0:left="360" ns0:hanging="240"/>
       </ns0:pPr>
       <ns0:r>
         <ns0:rPr>
           <ns0:b/>
-          <ns0:sz ns0:val="14"/>
+          <ns0:sz ns0:val="13"/>
         </ns0:rPr>
         <ns0:t xml:space="preserve">• Mandatory Double-Bagging (Rule 8.05): </ns0:t>
       </ns0:r>
       <ns0:r>
         <ns0:rPr>
-          <ns0:sz ns0:val="14"/>
+          <ns0:sz ns0:val="13"/>
         </ns0:rPr>
         <ns0:t>All 15-lb sandbags must have intact heavy-duty plastic inner liners. Never bring single-layer bags onto athletic turf. Carts must not exceed 300 lbs total (~75 lb/wheel) to prevent rubber infill rutting.</ns0:t>
       </ns0:r>
     </ns0:p>
     <ns0:p>
       <ns0:pPr>
-        <ns0:spacing ns0:before="8" ns0:after="8"/>
+        <ns0:spacing ns0:before="0" ns0:after="6" ns0:line="185" ns0:lineRule="auto"/>
         <ns0:ind ns0:left="360" ns0:hanging="240"/>
       </ns0:pPr>
       <ns0:r>
         <ns0:rPr>
           <ns0:b/>
-          <ns0:sz ns0:val="14"/>
+          <ns0:sz ns0:val="13"/>
           <ns0:color ns0:val="C53030"/>
         </ns0:rPr>
         <ns0:t xml:space="preserve">• High-Wind Emergency Abort: </ns0:t>
       </ns0:r>
       <ns0:r>
         <ns0:rPr>
-          <ns0:sz ns0:val="14"/>
+          <ns0:sz ns0:val="13"/>
         </ns0:rPr>
         <ns0:t>If severe gusts strike on-field, handlers brace on the upwind 2x4 base. Authorized parent crew (with Rule 9.07 wristbands) will assist to lay props flat on turf if ordered by directors.</ns0:t>
       </ns0:r>
@@ -6918,12 +6924,12 @@
     <ns0:p>
       <ns0:pPr>
         <ns0:pStyle ns0:val="Heading2"/>
-        <ns0:spacing ns0:before="40" ns0:after="15"/>
+        <ns0:spacing ns0:before="25" ns0:after="8"/>
       </ns0:pPr>
       <ns0:r>
         <ns0:rPr>
           <ns0:b/>
-          <ns0:sz ns0:val="18"/>
+          <ns0:sz ns0:val="17"/>
           <ns0:color ns0:val="1A365D"/>
         </ns0:rPr>
         <ns0:t>3. Rapid Field Assembly, Egress &amp; Two-Shot Staging Checklist</ns0:t>
@@ -6931,38 +6937,38 @@
     </ns0:p>
     <ns0:p>
       <ns0:pPr>
-        <ns0:spacing ns0:before="8" ns0:after="8"/>
+        <ns0:spacing ns0:before="0" ns0:after="6" ns0:line="185" ns0:lineRule="auto"/>
         <ns0:ind ns0:left="360" ns0:hanging="240"/>
       </ns0:pPr>
       <ns0:r>
         <ns0:rPr>
           <ns0:b/>
-          <ns0:sz ns0:val="14"/>
+          <ns0:sz ns0:val="13"/>
         </ns0:rPr>
         <ns0:t xml:space="preserve">• Unloading &amp; Venue Staging: </ns0:t>
       </ns0:r>
       <ns0:r>
         <ns0:rPr>
-          <ns0:sz ns0:val="14"/>
+          <ns0:sz ns0:val="13"/>
         </ns0:rPr>
         <ns0:t>1) Unstrap carts &amp; lower from short ends; 2) Retrieve 10'×8' frames from trailer cross beams; 3) Pull off protective tennis balls (stow in tote); 4) Rapidly bolt frame to cart using cordless power driver; 5) Mate 2-piece struts and lock quick-release retaining pins; 6) Stage required ballast &amp; wheel chocks.</ns0:t>
       </ns0:r>
     </ns0:p>
     <ns0:p>
       <ns0:pPr>
-        <ns0:spacing ns0:before="8" ns0:after="0"/>
+        <ns0:spacing ns0:before="0" ns0:after="0" ns0:line="185" ns0:lineRule="auto"/>
         <ns0:ind ns0:left="360" ns0:hanging="240"/>
       </ns0:pPr>
       <ns0:r>
         <ns0:rPr>
           <ns0:b/>
-          <ns0:sz ns0:val="14"/>
+          <ns0:sz ns0:val="13"/>
         </ns0:rPr>
         <ns0:t xml:space="preserve">• Egress, "Two-Shot" Staging &amp; Teardown: </ns0:t>
       </ns0:r>
       <ns0:r>
         <ns0:rPr>
-          <ns0:sz ns0:val="14"/>
+          <ns0:sz ns0:val="13"/>
         </ns0:rPr>
         <ns0:t>1) Continuous egress up hill to trailer lot (NEVER de-ballast at stadium chute); 2) Between Prelims &amp; Finals ("Two-Shot"), leave ballast on carts in trailer lot; if gusts pick up, pull strut pins to lay vinyl frames flat on carts; 3) Final teardown: remove sandbags over axles; 4) Pull strut pins (stow in tote); 5) Install tennis balls over upper strut ends; 6) Unbolt frame using power driver; 7) Frames onto cross beams; 8) Carts vertical on short ends strapped against front nose wall.</ns0:t>
       </ns0:r>

</xml_diff>

<commit_message>
fix(pchsmb): isolate Appendix C/C.1 margins, add goal posts and red X to field, center drawing, and add CBA routing
</commit_message>
<xml_diff>
--- a/PCHSMB/_Backdrop/docs/Backdrop_Assembly_Guide.docx
+++ b/PCHSMB/_Backdrop/docs/Backdrop_Assembly_Guide.docx
@@ -6131,6 +6131,14 @@
     <ns0:p>
       <ns0:pPr>
         <ns0:pStyle ns0:val="IndexFileLink"/>
+        <ns0:sectPr>
+          <ns0:headerReference ns0:type="default" ns4:id="rId1"/>
+          <ns0:footerReference ns0:type="default" ns4:id="rId2"/>
+          <ns0:pgSz ns0:w="12240" ns0:h="15840"/>
+          <ns0:pgMar ns0:top="1440" ns0:right="1440" ns0:bottom="1440" ns0:left="1440" ns0:header="720" ns0:footer="720" ns0:gutter="0"/>
+          <ns0:cols ns0:space="720"/>
+          <ns0:docGrid ns0:linePitch="360"/>
+        </ns0:sectPr>
       </ns0:pPr>
       <ns0:hyperlink ns4:id="rId29">
         <ns0:r>
@@ -6145,14 +6153,13 @@
     <ns0:p>
       <ns0:pPr>
         <ns0:pStyle ns0:val="Heading1"/>
-        <ns0:pageBreakBefore/>
-        <ns0:spacing ns0:before="0" ns0:after="10"/>
+        <ns0:spacing ns0:before="0" ns0:after="15"/>
         <ns0:jc ns0:val="center"/>
       </ns0:pPr>
       <ns0:r>
         <ns0:rPr>
           <ns0:b/>
-          <ns0:sz ns0:val="22"/>
+          <ns0:sz ns0:val="24"/>
           <ns0:color ns0:val="1A365D"/>
         </ns0:rPr>
         <ns0:t>APPENDIX C: FIELD OPERATIONS PLACARD</ns0:t>
@@ -6160,7 +6167,7 @@
     </ns0:p>
     <ns0:p>
       <ns0:pPr>
-        <ns0:spacing ns0:before="0" ns0:after="20"/>
+        <ns0:spacing ns0:before="0" ns0:after="25"/>
         <ns0:jc ns0:val="center"/>
       </ns0:pPr>
       <ns0:r>
@@ -6201,7 +6208,7 @@
           </ns0:tcPr>
           <ns0:p>
             <ns0:pPr>
-              <ns0:spacing ns0:before="0" ns0:after="20"/>
+              <ns0:spacing ns0:before="0" ns0:after="25"/>
               <ns0:jc ns0:val="center"/>
             </ns0:pPr>
             <ns0:r>
@@ -6215,7 +6222,7 @@
           </ns0:p>
           <ns0:p>
             <ns0:pPr>
-              <ns0:spacing ns0:before="0" ns0:after="30"/>
+              <ns0:spacing ns0:before="0" ns0:after="35"/>
               <ns0:jc ns0:val="center"/>
             </ns0:pPr>
             <ns0:r>
@@ -6223,30 +6230,30 @@
                 <ns0:sz ns0:val="14"/>
                 <ns0:color ns0:val="718096"/>
               </ns0:rPr>
-              <ns0:t>(Exact 6.0" wide × 4.0" high mounting area for laminated drill card from Appendix C.1)</ns0:t>
+              <ns0:t>(Exact 6.0" wide × 4.0" high mounting area for season-printed laminated drill card from Appendix C.1)</ns0:t>
             </ns0:r>
           </ns0:p>
           <ns0:p>
             <ns0:pPr>
-              <ns0:spacing ns0:before="20" ns0:after="15"/>
+              <ns0:spacing ns0:before="25" ns0:after="20"/>
               <ns0:jc ns0:val="center"/>
             </ns0:pPr>
             <ns0:r>
               <ns0:rPr>
                 <ns0:b/>
-                <ns0:sz ns0:val="15"/>
+                <ns0:sz ns0:val="16"/>
               </ns0:rPr>
               <ns0:t xml:space="preserve">Prop #: _________   |   Show Segment: _________________   |   Side: [  ] Side 1   [  ] Side 2</ns0:t>
             </ns0:r>
           </ns0:p>
           <ns0:p>
             <ns0:pPr>
-              <ns0:spacing ns0:before="15" ns0:after="15"/>
+              <ns0:spacing ns0:before="20" ns0:after="20"/>
               <ns0:jc ns0:val="center"/>
             </ns0:pPr>
             <ns0:r>
               <ns0:rPr>
-                <ns0:sz ns0:val="14"/>
+                <ns0:sz ns0:val="15"/>
                 <ns0:color ns0:val="4A5568"/>
               </ns0:rPr>
               <ns0:t xml:space="preserve">Field Drill Coordinate: _______________________________________________________________</ns0:t>
@@ -6254,28 +6261,15 @@
           </ns0:p>
           <ns0:p>
             <ns0:pPr>
-              <ns0:spacing ns0:before="15" ns0:after="15"/>
+              <ns0:spacing ns0:before="20" ns0:after="0"/>
               <ns0:jc ns0:val="center"/>
             </ns0:pPr>
             <ns0:r>
               <ns0:rPr>
-                <ns0:sz ns0:val="14"/>
+                <ns0:sz ns0:val="15"/>
                 <ns0:color ns0:val="4A5568"/>
               </ns0:rPr>
               <ns0:t xml:space="preserve">Assigned Handlers (Min. 2; 3–4 on ramps/wind): 1) _______________ 2) _______________ 3) _______________</ns0:t>
-            </ns0:r>
-          </ns0:p>
-          <ns0:p>
-            <ns0:pPr>
-              <ns0:spacing ns0:before="15" ns0:after="0"/>
-              <ns0:jc ns0:val="center"/>
-            </ns0:pPr>
-            <ns0:r>
-              <ns0:rPr>
-                <ns0:sz ns0:val="14"/>
-                <ns0:color ns0:val="718096"/>
-              </ns0:rPr>
-              <ns0:t xml:space="preserve">Facing: [  ] Flat to Front Sideline   [  ] Angled (____°)   |   [  ] Ground Wheel Chocks Staged</ns0:t>
             </ns0:r>
           </ns0:p>
         </ns0:tc>
@@ -6284,7 +6278,7 @@
     <ns0:p>
       <ns0:pPr>
         <ns0:pStyle ns0:val="Heading2"/>
-        <ns0:spacing ns0:before="25" ns0:after="10"/>
+        <ns0:spacing ns0:before="35" ns0:after="12"/>
       </ns0:pPr>
       <ns0:r>
         <ns0:rPr>
@@ -6300,8 +6294,8 @@
         <ns0:tblW ns0:w="9360" ns0:type="dxa"/>
         <ns0:jc ns0:val="center"/>
         <ns0:tblCellMar>
-          <ns0:top ns0:w="20" ns0:type="dxa"/>
-          <ns0:bottom ns0:w="20" ns0:type="dxa"/>
+          <ns0:top ns0:w="25" ns0:type="dxa"/>
+          <ns0:bottom ns0:w="25" ns0:type="dxa"/>
           <ns0:left ns0:w="60" ns0:type="dxa"/>
           <ns0:right ns0:w="60" ns0:type="dxa"/>
         </ns0:tblCellMar>
@@ -6833,7 +6827,7 @@
     <ns0:p>
       <ns0:pPr>
         <ns0:pStyle ns0:val="Heading2"/>
-        <ns0:spacing ns0:before="25" ns0:after="8"/>
+        <ns0:spacing ns0:before="30" ns0:after="10"/>
       </ns0:pPr>
       <ns0:r>
         <ns0:rPr>
@@ -6912,6 +6906,26 @@
           <ns0:sz ns0:val="13"/>
           <ns0:color ns0:val="C53030"/>
         </ns0:rPr>
+        <ns0:t xml:space="preserve">• CBA Field Entrance &amp; Exit Routing (Rule 8.05 &amp; Timing Rules): </ns0:t>
+      </ns0:r>
+      <ns0:r>
+        <ns0:rPr>
+          <ns0:sz ns0:val="13"/>
+        </ns0:rPr>
+        <ns0:t>Props and handlers must enter and exit strictly via designated back sideline or rear end zone gates (above goal posts). NEVER cross or stage props in the front sideline end zone area below the goal posts (marked with a red 'X' on drill cards)—strictly prohibited under CBA boundary rules to protect front ensemble staging, judge sightlines, and timing intervals.</ns0:t>
+      </ns0:r>
+    </ns0:p>
+    <ns0:p>
+      <ns0:pPr>
+        <ns0:spacing ns0:before="0" ns0:after="6" ns0:line="185" ns0:lineRule="auto"/>
+        <ns0:ind ns0:left="360" ns0:hanging="240"/>
+      </ns0:pPr>
+      <ns0:r>
+        <ns0:rPr>
+          <ns0:b/>
+          <ns0:sz ns0:val="13"/>
+          <ns0:color ns0:val="C53030"/>
+        </ns0:rPr>
         <ns0:t xml:space="preserve">• High-Wind Emergency Abort: </ns0:t>
       </ns0:r>
       <ns0:r>
@@ -6924,7 +6938,7 @@
     <ns0:p>
       <ns0:pPr>
         <ns0:pStyle ns0:val="Heading2"/>
-        <ns0:spacing ns0:before="25" ns0:after="8"/>
+        <ns0:spacing ns0:before="30" ns0:after="10"/>
       </ns0:pPr>
       <ns0:r>
         <ns0:rPr>
@@ -6970,20 +6984,20 @@
         <ns0:rPr>
           <ns0:sz ns0:val="13"/>
         </ns0:rPr>
-        <ns0:t>1) Continuous egress up hill to trailer lot (NEVER de-ballast at stadium chute); 2) Between Prelims &amp; Finals ("Two-Shot"), leave ballast on carts in trailer lot; if gusts pick up, pull strut pins to lay vinyl frames flat on carts; 3) Final teardown: remove sandbags over axles; 4) Pull strut pins (stow in tote); 5) Install tennis balls over upper strut ends; 6) Unbolt frame using power driver; 7) Frames onto cross beams; 8) Carts vertical on short ends strapped against front nose wall.</ns0:t>
+        <ns0:t>1) Continuous egress through designated rear end zone exit up hill to trailer lot (NEVER de-ballast at stadium chute; avoid front end zone restricted area); 2) Between Prelims &amp; Finals ("Two-Shot"), leave ballast on carts in trailer lot; if gusts pick up, pull strut pins to lay vinyl frames flat on carts; 3) Final teardown: remove sandbags over axles; 4) Pull strut pins (stow in tote); 5) Install tennis balls over upper strut ends; 6) Unbolt frame using power driver; 7) Frames onto cross beams; 8) Carts vertical on short ends strapped against front nose wall.</ns0:t>
       </ns0:r>
     </ns0:p>
     <ns0:p>
       <ns0:pPr>
         <ns0:pStyle ns0:val="Heading1"/>
         <ns0:pageBreakBefore/>
-        <ns0:spacing ns0:before="0" ns0:after="20"/>
+        <ns0:spacing ns0:before="0" ns0:after="15"/>
         <ns0:jc ns0:val="center"/>
       </ns0:pPr>
       <ns0:r>
         <ns0:rPr>
           <ns0:b/>
-          <ns0:sz ns0:val="23"/>
+          <ns0:sz ns0:val="24"/>
           <ns0:color ns0:val="1A365D"/>
         </ns0:rPr>
         <ns0:t>APPENDIX C.1: 4" × 6" FIELD PLACEMENT CARD TEMPLATE</ns0:t>
@@ -6991,13 +7005,13 @@
     </ns0:p>
     <ns0:p>
       <ns0:pPr>
-        <ns0:spacing ns0:before="0" ns0:after="40"/>
+        <ns0:spacing ns0:before="0" ns0:after="25"/>
         <ns0:jc ns0:val="center"/>
       </ns0:pPr>
       <ns0:r>
         <ns0:rPr>
           <ns0:i/>
-          <ns0:sz ns0:val="16"/>
+          <ns0:sz ns0:val="15"/>
           <ns0:color ns0:val="4A5568"/>
         </ns0:rPr>
         <ns0:t>Printable &amp; Fillable Coordinate Card for Appendix C On-Prop Placard (Cut along dashed line)</ns0:t>
@@ -7032,7 +7046,7 @@
           </ns0:tcPr>
           <ns0:p>
             <ns0:pPr>
-              <ns0:spacing ns0:before="0" ns0:after="20"/>
+              <ns0:spacing ns0:before="0" ns0:after="15"/>
               <ns0:jc ns0:val="center"/>
             </ns0:pPr>
             <ns0:r>
@@ -7046,7 +7060,7 @@
           </ns0:p>
           <ns0:p>
             <ns0:pPr>
-              <ns0:spacing ns0:before="0" ns0:after="15"/>
+              <ns0:spacing ns0:before="0" ns0:after="12"/>
               <ns0:jc ns0:val="center"/>
             </ns0:pPr>
             <ns0:r>
@@ -7059,7 +7073,7 @@
           </ns0:p>
           <ns0:p>
             <ns0:pPr>
-              <ns0:spacing ns0:before="0" ns0:after="15"/>
+              <ns0:spacing ns0:before="0" ns0:after="12"/>
               <ns0:jc ns0:val="center"/>
             </ns0:pPr>
             <ns0:r>
@@ -7072,7 +7086,7 @@
           </ns0:p>
           <ns0:p>
             <ns0:pPr>
-              <ns0:spacing ns0:before="0" ns0:after="25"/>
+              <ns0:spacing ns0:before="0" ns0:after="15"/>
               <ns0:jc ns0:val="center"/>
             </ns0:pPr>
             <ns0:r>
@@ -7085,7 +7099,7 @@
           </ns0:p>
           <ns0:p>
             <ns0:pPr>
-              <ns0:spacing ns0:before="0" ns0:after="20"/>
+              <ns0:spacing ns0:before="140" ns0:after="0"/>
               <ns0:jc ns0:val="center"/>
             </ns0:pPr>
             <ns0:r>
@@ -7093,7 +7107,7 @@
                 <ns1:inline distT="0" distB="0" distL="0" distR="0">
                   <ns1:extent cx="5029200" cy="1920240"/>
                   <ns1:effectExtent l="0" t="0" r="0" b="0"/>
-                  <ns1:docPr id="10" name="Figure 10" descr="Blank regulation high school marching band field diagram for marking backdrop drill coordinates and prop orientation."/>
+                  <ns1:docPr id="10" name="Figure 10" descr="Regulation high school marching band field diagram showing goal posts and CBA front sideline end zone restricted area for marking entrance and exit routes."/>
                   <ns1:cNvGraphicFramePr>
                     <ns2:graphicFrameLocks noChangeAspect="1"/>
                   </ns1:cNvGraphicFramePr>
@@ -7126,26 +7140,12 @@
               </ns0:drawing>
             </ns0:r>
           </ns0:p>
-          <ns0:p>
-            <ns0:pPr>
-              <ns0:spacing ns0:before="0" ns0:after="0"/>
-              <ns0:jc ns0:val="center"/>
-            </ns0:pPr>
-            <ns0:r>
-              <ns0:rPr>
-                <ns0:b/>
-                <ns0:sz ns0:val="14"/>
-                <ns0:color ns0:val="1A365D"/>
-              </ns0:rPr>
-              <ns0:t xml:space="preserve">Facing: [  ] Flat to Front Sideline   [  ] Angled Inward (____°)   |   [  ] Ground Chocks Required</ns0:t>
-            </ns0:r>
-          </ns0:p>
         </ns0:tc>
       </ns0:tr>
     </ns0:tbl>
     <ns0:p>
       <ns0:pPr>
-        <ns0:spacing ns0:before="40" ns0:after="40"/>
+        <ns0:spacing ns0:before="35" ns0:after="35"/>
         <ns0:jc ns0:val="center"/>
       </ns0:pPr>
       <ns0:r>
@@ -7154,13 +7154,13 @@
           <ns0:sz ns0:val="15"/>
           <ns0:color ns0:val="718096"/>
         </ns0:rPr>
-        <ns0:t>✂ Cut along dashed blue border (exact 6.0" × 4.0" card). Mark prop location with red marker, laminate, and attach to placard.</ns0:t>
+        <ns0:t>✂ Cut along dashed blue border (exact 6.0" × 4.0" card). Mark prop routes with dry/wet-erase marker, laminate, and attach to placard.</ns0:t>
       </ns0:r>
     </ns0:p>
     <ns0:p>
       <ns0:pPr>
         <ns0:pStyle ns0:val="Heading2"/>
-        <ns0:spacing ns0:before="60" ns0:after="20"/>
+        <ns0:spacing ns0:before="45" ns0:after="15"/>
       </ns0:pPr>
       <ns0:r>
         <ns0:rPr>
@@ -7173,7 +7173,7 @@
     </ns0:p>
     <ns0:p>
       <ns0:pPr>
-        <ns0:spacing ns0:before="10" ns0:after="10"/>
+        <ns0:spacing ns0:before="8" ns0:after="8"/>
         <ns0:ind ns0:left="360" ns0:hanging="240"/>
       </ns0:pPr>
       <ns0:r>
@@ -7181,18 +7181,18 @@
           <ns0:b/>
           <ns0:sz ns0:val="15"/>
         </ns0:rPr>
-        <ns0:t xml:space="preserve">1. Drill Card Marking: </ns0:t>
+        <ns0:t xml:space="preserve">1. Season Preparation &amp; Card Fabrication: </ns0:t>
       </ns0:r>
       <ns0:r>
         <ns0:rPr>
           <ns0:sz ns0:val="15"/>
         </ns0:rPr>
-        <ns0:t>Before each competition or dress rehearsal, drill coordinators fill in the prop number, show segment, and exact coordinate. Use a bright permanent marker to draw the prop outline on the field diagram, indicating front-facing orientation relative to the front sideline.</ns0:t>
+        <ns0:t>Coordinate cards are prepared and printed ONCE PER SEASON with all static information at the top filled in (Prop #, Show Segment, Field Coordinate, Show Side, and assigned student handlers). Cut out along the 6" × 4" dashed border, laminate in standard 4x6 heat-seal pouches, and affix into the Appendix C placard placeholder box using outdoor hook-and-loop (Velcro) coins or corner photo tabs.</ns0:t>
       </ns0:r>
     </ns0:p>
     <ns0:p>
       <ns0:pPr>
-        <ns0:spacing ns0:before="10" ns0:after="10"/>
+        <ns0:spacing ns0:before="8" ns0:after="8"/>
         <ns0:ind ns0:left="360" ns0:hanging="240"/>
       </ns0:pPr>
       <ns0:r>
@@ -7200,18 +7200,38 @@
           <ns0:b/>
           <ns0:sz ns0:val="15"/>
         </ns0:rPr>
-        <ns0:t xml:space="preserve">2. Laminate &amp; Mount: </ns0:t>
+        <ns0:t xml:space="preserve">2. Competition Day Route Marking: </ns0:t>
       </ns0:r>
       <ns0:r>
         <ns0:rPr>
           <ns0:sz ns0:val="15"/>
         </ns0:rPr>
-        <ns0:t>Cut out the 6" × 4" card, laminate in standard 4x6 heat-seal pouches, and affix into the placeholder box on Appendix C using clear outdoor hook-and-loop (Velcro) coins or corner photo tabs for easy mid-season drill revisions.</ns0:t>
+        <ns0:t>On the day of each competition, the ONLY update made to the card is drawing the specific field entrance route, coordinate placement, prop facing orientation, and exit trajectory arrows directly onto the laminated card using a wet-erase or dry-erase marker. Students are pre-trained on facing symbols.</ns0:t>
       </ns0:r>
     </ns0:p>
     <ns0:p>
       <ns0:pPr>
-        <ns0:spacing ns0:before="10" ns0:after="10"/>
+        <ns0:spacing ns0:before="8" ns0:after="8"/>
+        <ns0:ind ns0:left="360" ns0:hanging="240"/>
+      </ns0:pPr>
+      <ns0:r>
+        <ns0:rPr>
+          <ns0:b/>
+          <ns0:sz ns0:val="15"/>
+          <ns0:color ns0:val="C53030"/>
+        </ns0:rPr>
+        <ns0:t xml:space="preserve">3. CBA Field Entrance &amp; Exit Routing Rules: </ns0:t>
+      </ns0:r>
+      <ns0:r>
+        <ns0:rPr>
+          <ns0:sz ns0:val="15"/>
+        </ns0:rPr>
+        <ns0:t>Follow all CBA boundary and timing regulations. Enter and exit strictly through designated back sideline or rear end zone gates (above goal posts). NEVER cross, stage, or transit props in the front sideline end zone area below the goal posts (marked with a red 'X'). Maintain continuous egress uphill to the trailer staging lot without de-ballasting at the stadium chute.</ns0:t>
+      </ns0:r>
+    </ns0:p>
+    <ns0:p>
+      <ns0:pPr>
+        <ns0:spacing ns0:before="8" ns0:after="15"/>
         <ns0:ind ns0:left="360" ns0:hanging="240"/>
       </ns0:pPr>
       <ns0:r>
@@ -7219,39 +7239,20 @@
           <ns0:b/>
           <ns0:sz ns0:val="15"/>
         </ns0:rPr>
-        <ns0:t xml:space="preserve">3. Two-Shot Staging Protocol: </ns0:t>
+        <ns0:t xml:space="preserve">4. Two-Shot Staging Protocol: </ns0:t>
       </ns0:r>
       <ns0:r>
         <ns0:rPr>
           <ns0:sz ns0:val="15"/>
         </ns0:rPr>
         <ns0:t>During two-shot competitions (Prelims &amp; Finals), leave sandbag ballast intact on the carts in the trailer lot between shows. If winds increase during the afternoon break, simply remove the quick-release pin from each diagonal strut to lay the vinyl frames flat on the carts, eliminating sail area while maintaining readiness.</ns0:t>
-      </ns0:r>
-    </ns0:p>
-    <ns0:p>
-      <ns0:pPr>
-        <ns0:spacing ns0:before="10" ns0:after="20"/>
-        <ns0:ind ns0:left="360" ns0:hanging="240"/>
-      </ns0:pPr>
-      <ns0:r>
-        <ns0:rPr>
-          <ns0:b/>
-          <ns0:sz ns0:val="15"/>
-        </ns0:rPr>
-        <ns0:t xml:space="preserve">4. Continuous Uphill Egress: </ns0:t>
-      </ns0:r>
-      <ns0:r>
-        <ns0:rPr>
-          <ns0:sz ns0:val="15"/>
-        </ns0:rPr>
-        <ns0:t>Always push carts all the way up the hill to the trailer before removing ballast. Carts cannot be de-ballasted at the stadium exit chute. Assign 3 to 4 handlers per cart on steep grades such as Falcon Stadium.</ns0:t>
       </ns0:r>
     </ns0:p>
     <ns0:sectPr>
       <ns0:headerReference ns0:type="default" ns4:id="rId1"/>
       <ns0:footerReference ns0:type="default" ns4:id="rId2"/>
       <ns0:pgSz ns0:w="12240" ns0:h="15840"/>
-      <ns0:pgMar ns0:top="1440" ns0:right="1440" ns0:bottom="1440" ns0:left="1440" ns0:header="720" ns0:footer="720" ns0:gutter="0"/>
+      <ns0:pgMar ns0:top="576" ns0:right="720" ns0:bottom="576" ns0:left="720" ns0:header="288" ns0:footer="288" ns0:gutter="0"/>
       <ns0:cols ns0:space="720"/>
       <ns0:docGrid ns0:linePitch="360"/>
     </ns0:sectPr>

</xml_diff>

<commit_message>
fix(pchsmb): optimize Appendix C text font size to 8.5 pt (sz=17) without exceeding 1-page limit
</commit_message>
<xml_diff>
--- a/PCHSMB/_Backdrop/docs/Backdrop_Assembly_Guide.docx
+++ b/PCHSMB/_Backdrop/docs/Backdrop_Assembly_Guide.docx
@@ -6153,7 +6153,7 @@
     <ns0:p>
       <ns0:pPr>
         <ns0:pStyle ns0:val="Heading1"/>
-        <ns0:spacing ns0:before="0" ns0:after="15"/>
+        <ns0:spacing ns0:before="0" ns0:after="12"/>
         <ns0:jc ns0:val="center"/>
       </ns0:pPr>
       <ns0:r>
@@ -6167,7 +6167,7 @@
     </ns0:p>
     <ns0:p>
       <ns0:pPr>
-        <ns0:spacing ns0:before="0" ns0:after="25"/>
+        <ns0:spacing ns0:before="0" ns0:after="20"/>
         <ns0:jc ns0:val="center"/>
       </ns0:pPr>
       <ns0:r>
@@ -6278,12 +6278,12 @@
     <ns0:p>
       <ns0:pPr>
         <ns0:pStyle ns0:val="Heading2"/>
-        <ns0:spacing ns0:before="35" ns0:after="12"/>
+        <ns0:spacing ns0:before="30" ns0:after="10"/>
       </ns0:pPr>
       <ns0:r>
         <ns0:rPr>
           <ns0:b/>
-          <ns0:sz ns0:val="17"/>
+          <ns0:sz ns0:val="19"/>
           <ns0:color ns0:val="1A365D"/>
         </ns0:rPr>
         <ns0:t>1. Wind Velocity Limits &amp; Standardized Ballasting Schedule</ns0:t>
@@ -6319,12 +6319,12 @@
           </ns0:tcPr>
           <ns0:p>
             <ns0:pPr>
-              <ns0:spacing ns0:before="0" ns0:after="0" ns0:line="180" ns0:lineRule="auto"/>
+              <ns0:spacing ns0:before="0" ns0:after="0" ns0:line="190" ns0:lineRule="auto"/>
             </ns0:pPr>
             <ns0:r>
               <ns0:rPr>
                 <ns0:b/>
-                <ns0:sz ns0:val="14"/>
+                <ns0:sz ns0:val="15"/>
               </ns0:rPr>
               <ns0:t>Tier / State</ns0:t>
             </ns0:r>
@@ -6337,12 +6337,12 @@
           </ns0:tcPr>
           <ns0:p>
             <ns0:pPr>
-              <ns0:spacing ns0:before="0" ns0:after="0" ns0:line="180" ns0:lineRule="auto"/>
+              <ns0:spacing ns0:before="0" ns0:after="0" ns0:line="190" ns0:lineRule="auto"/>
             </ns0:pPr>
             <ns0:r>
               <ns0:rPr>
                 <ns0:b/>
-                <ns0:sz ns0:val="14"/>
+                <ns0:sz ns0:val="15"/>
               </ns0:rPr>
               <ns0:t>Wind Velocity</ns0:t>
             </ns0:r>
@@ -6355,12 +6355,12 @@
           </ns0:tcPr>
           <ns0:p>
             <ns0:pPr>
-              <ns0:spacing ns0:before="0" ns0:after="0" ns0:line="180" ns0:lineRule="auto"/>
+              <ns0:spacing ns0:before="0" ns0:after="0" ns0:line="190" ns0:lineRule="auto"/>
             </ns0:pPr>
             <ns0:r>
               <ns0:rPr>
                 <ns0:b/>
-                <ns0:sz ns0:val="14"/>
+                <ns0:sz ns0:val="15"/>
               </ns0:rPr>
               <ns0:t>Ballast Deployment (15-lb Bags)</ns0:t>
             </ns0:r>
@@ -6373,12 +6373,12 @@
           </ns0:tcPr>
           <ns0:p>
             <ns0:pPr>
-              <ns0:spacing ns0:before="0" ns0:after="0" ns0:line="180" ns0:lineRule="auto"/>
+              <ns0:spacing ns0:before="0" ns0:after="0" ns0:line="190" ns0:lineRule="auto"/>
             </ns0:pPr>
             <ns0:r>
               <ns0:rPr>
                 <ns0:b/>
-                <ns0:sz ns0:val="14"/>
+                <ns0:sz ns0:val="15"/>
               </ns0:rPr>
               <ns0:t>Total Wt</ns0:t>
             </ns0:r>
@@ -6391,12 +6391,12 @@
           </ns0:tcPr>
           <ns0:p>
             <ns0:pPr>
-              <ns0:spacing ns0:before="0" ns0:after="0" ns0:line="180" ns0:lineRule="auto"/>
+              <ns0:spacing ns0:before="0" ns0:after="0" ns0:line="190" ns0:lineRule="auto"/>
             </ns0:pPr>
             <ns0:r>
               <ns0:rPr>
                 <ns0:b/>
-                <ns0:sz ns0:val="14"/>
+                <ns0:sz ns0:val="15"/>
               </ns0:rPr>
               <ns0:t>Operational Limits &amp; Action</ns0:t>
             </ns0:r>
@@ -6410,12 +6410,12 @@
           </ns0:tcPr>
           <ns0:p>
             <ns0:pPr>
-              <ns0:spacing ns0:before="0" ns0:after="0" ns0:line="180" ns0:lineRule="auto"/>
+              <ns0:spacing ns0:before="0" ns0:after="0" ns0:line="190" ns0:lineRule="auto"/>
             </ns0:pPr>
             <ns0:r>
               <ns0:rPr>
                 <ns0:b/>
-                <ns0:sz ns0:val="13"/>
+                <ns0:sz ns0:val="15"/>
               </ns0:rPr>
               <ns0:t>Tier 0: Calm</ns0:t>
             </ns0:r>
@@ -6427,11 +6427,11 @@
           </ns0:tcPr>
           <ns0:p>
             <ns0:pPr>
-              <ns0:spacing ns0:before="0" ns0:after="0" ns0:line="180" ns0:lineRule="auto"/>
+              <ns0:spacing ns0:before="0" ns0:after="0" ns0:line="190" ns0:lineRule="auto"/>
             </ns0:pPr>
             <ns0:r>
               <ns0:rPr>
-                <ns0:sz ns0:val="13"/>
+                <ns0:sz ns0:val="15"/>
               </ns0:rPr>
               <ns0:t>0–8 mph (gusts ≤10)</ns0:t>
             </ns0:r>
@@ -6443,11 +6443,11 @@
           </ns0:tcPr>
           <ns0:p>
             <ns0:pPr>
-              <ns0:spacing ns0:before="0" ns0:after="0" ns0:line="180" ns0:lineRule="auto"/>
+              <ns0:spacing ns0:before="0" ns0:after="0" ns0:line="190" ns0:lineRule="auto"/>
             </ns0:pPr>
             <ns0:r>
               <ns0:rPr>
-                <ns0:sz ns0:val="13"/>
+                <ns0:sz ns0:val="15"/>
               </ns0:rPr>
               <ns0:t>0 bags (unballasted)</ns0:t>
             </ns0:r>
@@ -6459,11 +6459,11 @@
           </ns0:tcPr>
           <ns0:p>
             <ns0:pPr>
-              <ns0:spacing ns0:before="0" ns0:after="0" ns0:line="180" ns0:lineRule="auto"/>
+              <ns0:spacing ns0:before="0" ns0:after="0" ns0:line="190" ns0:lineRule="auto"/>
             </ns0:pPr>
             <ns0:r>
               <ns0:rPr>
-                <ns0:sz ns0:val="13"/>
+                <ns0:sz ns0:val="15"/>
               </ns0:rPr>
               <ns0:t>153 lbs</ns0:t>
             </ns0:r>
@@ -6475,11 +6475,11 @@
           </ns0:tcPr>
           <ns0:p>
             <ns0:pPr>
-              <ns0:spacing ns0:before="0" ns0:after="0" ns0:line="180" ns0:lineRule="auto"/>
+              <ns0:spacing ns0:before="0" ns0:after="0" ns0:line="190" ns0:lineRule="auto"/>
             </ns0:pPr>
             <ns0:r>
               <ns0:rPr>
-                <ns0:sz ns0:val="13"/>
+                <ns0:sz ns0:val="15"/>
               </ns0:rPr>
               <ns0:t>Safe to 8 mph (10 gust max). Must upgrade to Tier 1 if wind &gt;8 mph.</ns0:t>
             </ns0:r>
@@ -6493,12 +6493,12 @@
           </ns0:tcPr>
           <ns0:p>
             <ns0:pPr>
-              <ns0:spacing ns0:before="0" ns0:after="0" ns0:line="180" ns0:lineRule="auto"/>
+              <ns0:spacing ns0:before="0" ns0:after="0" ns0:line="190" ns0:lineRule="auto"/>
             </ns0:pPr>
             <ns0:r>
               <ns0:rPr>
                 <ns0:b/>
-                <ns0:sz ns0:val="13"/>
+                <ns0:sz ns0:val="15"/>
               </ns0:rPr>
               <ns0:t>Tier 1: Normal</ns0:t>
             </ns0:r>
@@ -6510,11 +6510,11 @@
           </ns0:tcPr>
           <ns0:p>
             <ns0:pPr>
-              <ns0:spacing ns0:before="0" ns0:after="0" ns0:line="180" ns0:lineRule="auto"/>
+              <ns0:spacing ns0:before="0" ns0:after="0" ns0:line="190" ns0:lineRule="auto"/>
             </ns0:pPr>
             <ns0:r>
               <ns0:rPr>
-                <ns0:sz ns0:val="13"/>
+                <ns0:sz ns0:val="15"/>
               </ns0:rPr>
               <ns0:t>8–12 mph</ns0:t>
             </ns0:r>
@@ -6526,11 +6526,11 @@
           </ns0:tcPr>
           <ns0:p>
             <ns0:pPr>
-              <ns0:spacing ns0:before="0" ns0:after="0" ns0:line="180" ns0:lineRule="auto"/>
+              <ns0:spacing ns0:before="0" ns0:after="0" ns0:line="190" ns0:lineRule="auto"/>
             </ns0:pPr>
             <ns0:r>
               <ns0:rPr>
-                <ns0:sz ns0:val="13"/>
+                <ns0:sz ns0:val="15"/>
               </ns0:rPr>
               <ns0:t>4x bags (2 per wing post; 60 lb)</ns0:t>
             </ns0:r>
@@ -6542,11 +6542,11 @@
           </ns0:tcPr>
           <ns0:p>
             <ns0:pPr>
-              <ns0:spacing ns0:before="0" ns0:after="0" ns0:line="180" ns0:lineRule="auto"/>
+              <ns0:spacing ns0:before="0" ns0:after="0" ns0:line="190" ns0:lineRule="auto"/>
             </ns0:pPr>
             <ns0:r>
               <ns0:rPr>
-                <ns0:sz ns0:val="13"/>
+                <ns0:sz ns0:val="15"/>
               </ns0:rPr>
               <ns0:t>213 lbs</ns0:t>
             </ns0:r>
@@ -6558,11 +6558,11 @@
           </ns0:tcPr>
           <ns0:p>
             <ns0:pPr>
-              <ns0:spacing ns0:before="0" ns0:after="0" ns0:line="180" ns0:lineRule="auto"/>
+              <ns0:spacing ns0:before="0" ns0:after="0" ns0:line="190" ns0:lineRule="auto"/>
             </ns0:pPr>
             <ns0:r>
               <ns0:rPr>
-                <ns0:sz ns0:val="13"/>
+                <ns0:sz ns0:val="15"/>
               </ns0:rPr>
               <ns0:t>Standard staging. 16.9 mph max gust. Zero turf compaction.</ns0:t>
             </ns0:r>
@@ -6576,12 +6576,12 @@
           </ns0:tcPr>
           <ns0:p>
             <ns0:pPr>
-              <ns0:spacing ns0:before="0" ns0:after="0" ns0:line="180" ns0:lineRule="auto"/>
+              <ns0:spacing ns0:before="0" ns0:after="0" ns0:line="190" ns0:lineRule="auto"/>
             </ns0:pPr>
             <ns0:r>
               <ns0:rPr>
                 <ns0:b/>
-                <ns0:sz ns0:val="13"/>
+                <ns0:sz ns0:val="15"/>
               </ns0:rPr>
               <ns0:t>Tier 2: Advisory</ns0:t>
             </ns0:r>
@@ -6593,11 +6593,11 @@
           </ns0:tcPr>
           <ns0:p>
             <ns0:pPr>
-              <ns0:spacing ns0:before="0" ns0:after="0" ns0:line="180" ns0:lineRule="auto"/>
+              <ns0:spacing ns0:before="0" ns0:after="0" ns0:line="190" ns0:lineRule="auto"/>
             </ns0:pPr>
             <ns0:r>
               <ns0:rPr>
-                <ns0:sz ns0:val="13"/>
+                <ns0:sz ns0:val="15"/>
               </ns0:rPr>
               <ns0:t>12–18 mph</ns0:t>
             </ns0:r>
@@ -6609,11 +6609,11 @@
           </ns0:tcPr>
           <ns0:p>
             <ns0:pPr>
-              <ns0:spacing ns0:before="0" ns0:after="0" ns0:line="180" ns0:lineRule="auto"/>
+              <ns0:spacing ns0:before="0" ns0:after="0" ns0:line="190" ns0:lineRule="auto"/>
             </ns0:pPr>
             <ns0:r>
               <ns0:rPr>
-                <ns0:sz ns0:val="13"/>
+                <ns0:sz ns0:val="15"/>
               </ns0:rPr>
               <ns0:t>6x bags (3 per wing post; 90 lb)</ns0:t>
             </ns0:r>
@@ -6625,11 +6625,11 @@
           </ns0:tcPr>
           <ns0:p>
             <ns0:pPr>
-              <ns0:spacing ns0:before="0" ns0:after="0" ns0:line="180" ns0:lineRule="auto"/>
+              <ns0:spacing ns0:before="0" ns0:after="0" ns0:line="190" ns0:lineRule="auto"/>
             </ns0:pPr>
             <ns0:r>
               <ns0:rPr>
-                <ns0:sz ns0:val="13"/>
+                <ns0:sz ns0:val="15"/>
               </ns0:rPr>
               <ns0:t>243 lbs</ns0:t>
             </ns0:r>
@@ -6641,11 +6641,11 @@
           </ns0:tcPr>
           <ns0:p>
             <ns0:pPr>
-              <ns0:spacing ns0:before="0" ns0:after="0" ns0:line="180" ns0:lineRule="auto"/>
+              <ns0:spacing ns0:before="0" ns0:after="0" ns0:line="190" ns0:lineRule="auto"/>
             </ns0:pPr>
             <ns0:r>
               <ns0:rPr>
-                <ns0:sz ns0:val="13"/>
+                <ns0:sz ns0:val="15"/>
               </ns0:rPr>
               <ns0:t>Attentive staging. 18.4 mph max gust. Deploy ground wheel chocks.</ns0:t>
             </ns0:r>
@@ -6659,12 +6659,12 @@
           </ns0:tcPr>
           <ns0:p>
             <ns0:pPr>
-              <ns0:spacing ns0:before="0" ns0:after="0" ns0:line="180" ns0:lineRule="auto"/>
+              <ns0:spacing ns0:before="0" ns0:after="0" ns0:line="190" ns0:lineRule="auto"/>
             </ns0:pPr>
             <ns0:r>
               <ns0:rPr>
                 <ns0:b/>
-                <ns0:sz ns0:val="13"/>
+                <ns0:sz ns0:val="15"/>
               </ns0:rPr>
               <ns0:t>Tier 3: High-Wind</ns0:t>
             </ns0:r>
@@ -6676,11 +6676,11 @@
           </ns0:tcPr>
           <ns0:p>
             <ns0:pPr>
-              <ns0:spacing ns0:before="0" ns0:after="0" ns0:line="180" ns0:lineRule="auto"/>
+              <ns0:spacing ns0:before="0" ns0:after="0" ns0:line="190" ns0:lineRule="auto"/>
             </ns0:pPr>
             <ns0:r>
               <ns0:rPr>
-                <ns0:sz ns0:val="13"/>
+                <ns0:sz ns0:val="15"/>
               </ns0:rPr>
               <ns0:t>18–22 mph</ns0:t>
             </ns0:r>
@@ -6692,11 +6692,11 @@
           </ns0:tcPr>
           <ns0:p>
             <ns0:pPr>
-              <ns0:spacing ns0:before="0" ns0:after="0" ns0:line="180" ns0:lineRule="auto"/>
+              <ns0:spacing ns0:before="0" ns0:after="0" ns0:line="190" ns0:lineRule="auto"/>
             </ns0:pPr>
             <ns0:r>
               <ns0:rPr>
-                <ns0:sz ns0:val="13"/>
+                <ns0:sz ns0:val="15"/>
               </ns0:rPr>
               <ns0:t>6 on wings + 3 across rear rail (135 lb)</ns0:t>
             </ns0:r>
@@ -6708,11 +6708,11 @@
           </ns0:tcPr>
           <ns0:p>
             <ns0:pPr>
-              <ns0:spacing ns0:before="0" ns0:after="0" ns0:line="180" ns0:lineRule="auto"/>
+              <ns0:spacing ns0:before="0" ns0:after="0" ns0:line="190" ns0:lineRule="auto"/>
             </ns0:pPr>
             <ns0:r>
               <ns0:rPr>
-                <ns0:sz ns0:val="13"/>
+                <ns0:sz ns0:val="15"/>
               </ns0:rPr>
               <ns0:t>288 lbs</ns0:t>
             </ns0:r>
@@ -6724,11 +6724,11 @@
           </ns0:tcPr>
           <ns0:p>
             <ns0:pPr>
-              <ns0:spacing ns0:before="0" ns0:after="0" ns0:line="180" ns0:lineRule="auto"/>
+              <ns0:spacing ns0:before="0" ns0:after="0" ns0:line="190" ns0:lineRule="auto"/>
             </ns0:pPr>
             <ns0:r>
               <ns0:rPr>
-                <ns0:sz ns0:val="13"/>
+                <ns0:sz ns0:val="15"/>
               </ns0:rPr>
               <ns0:t>22.5 mph max gust. Rear rail doubles leverage. Max safe turf load.</ns0:t>
             </ns0:r>
@@ -6742,12 +6742,12 @@
           </ns0:tcPr>
           <ns0:p>
             <ns0:pPr>
-              <ns0:spacing ns0:before="0" ns0:after="0" ns0:line="180" ns0:lineRule="auto"/>
+              <ns0:spacing ns0:before="0" ns0:after="0" ns0:line="190" ns0:lineRule="auto"/>
             </ns0:pPr>
             <ns0:r>
               <ns0:rPr>
                 <ns0:b/>
-                <ns0:sz ns0:val="13"/>
+                <ns0:sz ns0:val="15"/>
                 <ns0:color ns0:val="C53030"/>
               </ns0:rPr>
               <ns0:t>Tier 4: ABORT</ns0:t>
@@ -6760,12 +6760,12 @@
           </ns0:tcPr>
           <ns0:p>
             <ns0:pPr>
-              <ns0:spacing ns0:before="0" ns0:after="0" ns0:line="180" ns0:lineRule="auto"/>
+              <ns0:spacing ns0:before="0" ns0:after="0" ns0:line="190" ns0:lineRule="auto"/>
             </ns0:pPr>
             <ns0:r>
               <ns0:rPr>
                 <ns0:b/>
-                <ns0:sz ns0:val="13"/>
+                <ns0:sz ns0:val="15"/>
                 <ns0:color ns0:val="C53030"/>
               </ns0:rPr>
               <ns0:t>&gt;20 sust. / &gt;25 gust</ns0:t>
@@ -6778,11 +6778,11 @@
           </ns0:tcPr>
           <ns0:p>
             <ns0:pPr>
-              <ns0:spacing ns0:before="0" ns0:after="0" ns0:line="180" ns0:lineRule="auto"/>
+              <ns0:spacing ns0:before="0" ns0:after="0" ns0:line="190" ns0:lineRule="auto"/>
             </ns0:pPr>
             <ns0:r>
               <ns0:rPr>
-                <ns0:sz ns0:val="13"/>
+                <ns0:sz ns0:val="15"/>
               </ns0:rPr>
               <ns0:t>—</ns0:t>
             </ns0:r>
@@ -6794,11 +6794,11 @@
           </ns0:tcPr>
           <ns0:p>
             <ns0:pPr>
-              <ns0:spacing ns0:before="0" ns0:after="0" ns0:line="180" ns0:lineRule="auto"/>
+              <ns0:spacing ns0:before="0" ns0:after="0" ns0:line="190" ns0:lineRule="auto"/>
             </ns0:pPr>
             <ns0:r>
               <ns0:rPr>
-                <ns0:sz ns0:val="13"/>
+                <ns0:sz ns0:val="15"/>
               </ns0:rPr>
               <ns0:t>—</ns0:t>
             </ns0:r>
@@ -6810,12 +6810,12 @@
           </ns0:tcPr>
           <ns0:p>
             <ns0:pPr>
-              <ns0:spacing ns0:before="0" ns0:after="0" ns0:line="180" ns0:lineRule="auto"/>
+              <ns0:spacing ns0:before="0" ns0:after="0" ns0:line="190" ns0:lineRule="auto"/>
             </ns0:pPr>
             <ns0:r>
               <ns0:rPr>
                 <ns0:b/>
-                <ns0:sz ns0:val="13"/>
+                <ns0:sz ns0:val="15"/>
                 <ns0:color ns0:val="C53030"/>
               </ns0:rPr>
               <ns0:t>STRICT SAFETY NO-GO. Withdraw props or immediately lay flat.</ns0:t>
@@ -6827,110 +6827,110 @@
     <ns0:p>
       <ns0:pPr>
         <ns0:pStyle ns0:val="Heading2"/>
-        <ns0:spacing ns0:before="30" ns0:after="10"/>
+        <ns0:spacing ns0:before="26" ns0:after="8"/>
+      </ns0:pPr>
+      <ns0:r>
+        <ns0:rPr>
+          <ns0:b/>
+          <ns0:sz ns0:val="19"/>
+          <ns0:color ns0:val="1A365D"/>
+        </ns0:rPr>
+        <ns0:t>2. Critical On-Field Safety &amp; Turf Protection Rules</ns0:t>
+      </ns0:r>
+    </ns0:p>
+    <ns0:p>
+      <ns0:pPr>
+        <ns0:spacing ns0:before="0" ns0:after="8" ns0:line="225" ns0:lineRule="auto"/>
+        <ns0:ind ns0:left="360" ns0:hanging="240"/>
       </ns0:pPr>
       <ns0:r>
         <ns0:rPr>
           <ns0:b/>
           <ns0:sz ns0:val="17"/>
-          <ns0:color ns0:val="1A365D"/>
         </ns0:rPr>
-        <ns0:t>2. Critical On-Field Safety &amp; Turf Protection Rules</ns0:t>
+        <ns0:t xml:space="preserve">• Non-Locking Casters &amp; Ground Chocking: </ns0:t>
+      </ns0:r>
+      <ns0:r>
+        <ns0:rPr>
+          <ns0:sz ns0:val="17"/>
+        </ns0:rPr>
+        <ns0:t>Carts use non-locking swivel casters for rapid agility. When positioned at drill coordinates in breezy conditions, place extra double-bagged 15-lb sandbags on the turf firmly against wheels as wheel chocks to prevent roll drift.</ns0:t>
       </ns0:r>
     </ns0:p>
     <ns0:p>
       <ns0:pPr>
-        <ns0:spacing ns0:before="0" ns0:after="6" ns0:line="185" ns0:lineRule="auto"/>
+        <ns0:spacing ns0:before="0" ns0:after="8" ns0:line="225" ns0:lineRule="auto"/>
         <ns0:ind ns0:left="360" ns0:hanging="240"/>
       </ns0:pPr>
       <ns0:r>
         <ns0:rPr>
           <ns0:b/>
-          <ns0:sz ns0:val="13"/>
+          <ns0:sz ns0:val="17"/>
         </ns0:rPr>
-        <ns0:t xml:space="preserve">• Non-Locking Casters &amp; Ground Chocking: </ns0:t>
+        <ns0:t xml:space="preserve">• Hand Placement &amp; Crew Pairing: </ns0:t>
       </ns0:r>
       <ns0:r>
         <ns0:rPr>
-          <ns0:sz ns0:val="13"/>
+          <ns0:sz ns0:val="17"/>
         </ns0:rPr>
-        <ns0:t>Carts use non-locking swivel casters for rapid agility. When positioned at drill coordinates in breezy conditions, place extra double-bagged 15-lb sandbags on the turf firmly against wheels as wheel chocks to prevent roll drift.</ns0:t>
+        <ns0:t>Always push from lower 2x4 cart framing; NEVER push or climb on upright pipes or struts. No fewer than 2 handlers per cart under normal conditions; assign 3 to 4 handlers on steep grades (such as the Falcon Stadium tunnel ramp) or in high winds.</ns0:t>
       </ns0:r>
     </ns0:p>
     <ns0:p>
       <ns0:pPr>
-        <ns0:spacing ns0:before="0" ns0:after="6" ns0:line="185" ns0:lineRule="auto"/>
+        <ns0:spacing ns0:before="0" ns0:after="8" ns0:line="225" ns0:lineRule="auto"/>
         <ns0:ind ns0:left="360" ns0:hanging="240"/>
       </ns0:pPr>
       <ns0:r>
         <ns0:rPr>
           <ns0:b/>
-          <ns0:sz ns0:val="13"/>
+          <ns0:sz ns0:val="17"/>
         </ns0:rPr>
-        <ns0:t xml:space="preserve">• Hand Placement &amp; Crew Pairing: </ns0:t>
+        <ns0:t xml:space="preserve">• Mandatory Double-Bagging (Rule 8.05): </ns0:t>
       </ns0:r>
       <ns0:r>
         <ns0:rPr>
-          <ns0:sz ns0:val="13"/>
+          <ns0:sz ns0:val="17"/>
         </ns0:rPr>
-        <ns0:t>Always push from lower 2x4 cart framing; NEVER push or climb on upright pipes or struts. No fewer than 2 handlers per cart under normal conditions; assign 3 to 4 handlers on steep grades (such as the Falcon Stadium tunnel ramp) or in high winds.</ns0:t>
+        <ns0:t>All 15-lb sandbags must have intact heavy-duty plastic inner liners. Never bring single-layer bags onto athletic turf. Carts must not exceed 300 lbs total (~75 lb/wheel) to prevent rubber infill rutting.</ns0:t>
       </ns0:r>
     </ns0:p>
     <ns0:p>
       <ns0:pPr>
-        <ns0:spacing ns0:before="0" ns0:after="6" ns0:line="185" ns0:lineRule="auto"/>
+        <ns0:spacing ns0:before="0" ns0:after="8" ns0:line="225" ns0:lineRule="auto"/>
         <ns0:ind ns0:left="360" ns0:hanging="240"/>
       </ns0:pPr>
       <ns0:r>
         <ns0:rPr>
           <ns0:b/>
-          <ns0:sz ns0:val="13"/>
+          <ns0:sz ns0:val="17"/>
+          <ns0:color ns0:val="C53030"/>
         </ns0:rPr>
-        <ns0:t xml:space="preserve">• Mandatory Double-Bagging (Rule 8.05): </ns0:t>
+        <ns0:t xml:space="preserve">• CBA Field Entrance &amp; Exit Routing (Rule 8.05 &amp; Timing Rules): </ns0:t>
       </ns0:r>
       <ns0:r>
         <ns0:rPr>
-          <ns0:sz ns0:val="13"/>
+          <ns0:sz ns0:val="17"/>
         </ns0:rPr>
-        <ns0:t>All 15-lb sandbags must have intact heavy-duty plastic inner liners. Never bring single-layer bags onto athletic turf. Carts must not exceed 300 lbs total (~75 lb/wheel) to prevent rubber infill rutting.</ns0:t>
+        <ns0:t>Props and handlers must enter and exit strictly via designated back sideline or rear end zone gates (above goal posts). NEVER cross or stage props in the front sideline end zone area below the goal posts (marked with a red 'X' on drill cards)—strictly prohibited under CBA boundary rules to protect front ensemble staging, judge sightlines, and timing intervals.</ns0:t>
       </ns0:r>
     </ns0:p>
     <ns0:p>
       <ns0:pPr>
-        <ns0:spacing ns0:before="0" ns0:after="6" ns0:line="185" ns0:lineRule="auto"/>
+        <ns0:spacing ns0:before="0" ns0:after="8" ns0:line="225" ns0:lineRule="auto"/>
         <ns0:ind ns0:left="360" ns0:hanging="240"/>
       </ns0:pPr>
       <ns0:r>
         <ns0:rPr>
           <ns0:b/>
-          <ns0:sz ns0:val="13"/>
-          <ns0:color ns0:val="C53030"/>
-        </ns0:rPr>
-        <ns0:t xml:space="preserve">• CBA Field Entrance &amp; Exit Routing (Rule 8.05 &amp; Timing Rules): </ns0:t>
-      </ns0:r>
-      <ns0:r>
-        <ns0:rPr>
-          <ns0:sz ns0:val="13"/>
-        </ns0:rPr>
-        <ns0:t>Props and handlers must enter and exit strictly via designated back sideline or rear end zone gates (above goal posts). NEVER cross or stage props in the front sideline end zone area below the goal posts (marked with a red 'X' on drill cards)—strictly prohibited under CBA boundary rules to protect front ensemble staging, judge sightlines, and timing intervals.</ns0:t>
-      </ns0:r>
-    </ns0:p>
-    <ns0:p>
-      <ns0:pPr>
-        <ns0:spacing ns0:before="0" ns0:after="6" ns0:line="185" ns0:lineRule="auto"/>
-        <ns0:ind ns0:left="360" ns0:hanging="240"/>
-      </ns0:pPr>
-      <ns0:r>
-        <ns0:rPr>
-          <ns0:b/>
-          <ns0:sz ns0:val="13"/>
+          <ns0:sz ns0:val="17"/>
           <ns0:color ns0:val="C53030"/>
         </ns0:rPr>
         <ns0:t xml:space="preserve">• High-Wind Emergency Abort: </ns0:t>
       </ns0:r>
       <ns0:r>
         <ns0:rPr>
-          <ns0:sz ns0:val="13"/>
+          <ns0:sz ns0:val="17"/>
         </ns0:rPr>
         <ns0:t>If severe gusts strike on-field, handlers brace on the upwind 2x4 base. Authorized parent crew (with Rule 9.07 wristbands) will assist to lay props flat on turf if ordered by directors.</ns0:t>
       </ns0:r>
@@ -6938,51 +6938,51 @@
     <ns0:p>
       <ns0:pPr>
         <ns0:pStyle ns0:val="Heading2"/>
-        <ns0:spacing ns0:before="30" ns0:after="10"/>
+        <ns0:spacing ns0:before="26" ns0:after="8"/>
+      </ns0:pPr>
+      <ns0:r>
+        <ns0:rPr>
+          <ns0:b/>
+          <ns0:sz ns0:val="19"/>
+          <ns0:color ns0:val="1A365D"/>
+        </ns0:rPr>
+        <ns0:t>3. Rapid Field Assembly, Egress &amp; Two-Shot Staging Checklist</ns0:t>
+      </ns0:r>
+    </ns0:p>
+    <ns0:p>
+      <ns0:pPr>
+        <ns0:spacing ns0:before="0" ns0:after="8" ns0:line="225" ns0:lineRule="auto"/>
+        <ns0:ind ns0:left="360" ns0:hanging="240"/>
       </ns0:pPr>
       <ns0:r>
         <ns0:rPr>
           <ns0:b/>
           <ns0:sz ns0:val="17"/>
-          <ns0:color ns0:val="1A365D"/>
         </ns0:rPr>
-        <ns0:t>3. Rapid Field Assembly, Egress &amp; Two-Shot Staging Checklist</ns0:t>
+        <ns0:t xml:space="preserve">• Unloading &amp; Venue Staging: </ns0:t>
+      </ns0:r>
+      <ns0:r>
+        <ns0:rPr>
+          <ns0:sz ns0:val="17"/>
+        </ns0:rPr>
+        <ns0:t>1) Unstrap carts &amp; lower from short ends; 2) Retrieve 10'×8' frames from trailer cross beams; 3) Pull off protective tennis balls (stow in tote); 4) Rapidly bolt frame to cart using cordless power driver; 5) Mate 2-piece struts and lock quick-release retaining pins; 6) Stage required ballast &amp; wheel chocks.</ns0:t>
       </ns0:r>
     </ns0:p>
     <ns0:p>
       <ns0:pPr>
-        <ns0:spacing ns0:before="0" ns0:after="6" ns0:line="185" ns0:lineRule="auto"/>
+        <ns0:spacing ns0:before="0" ns0:after="0" ns0:line="225" ns0:lineRule="auto"/>
         <ns0:ind ns0:left="360" ns0:hanging="240"/>
       </ns0:pPr>
       <ns0:r>
         <ns0:rPr>
           <ns0:b/>
-          <ns0:sz ns0:val="13"/>
-        </ns0:rPr>
-        <ns0:t xml:space="preserve">• Unloading &amp; Venue Staging: </ns0:t>
-      </ns0:r>
-      <ns0:r>
-        <ns0:rPr>
-          <ns0:sz ns0:val="13"/>
-        </ns0:rPr>
-        <ns0:t>1) Unstrap carts &amp; lower from short ends; 2) Retrieve 10'×8' frames from trailer cross beams; 3) Pull off protective tennis balls (stow in tote); 4) Rapidly bolt frame to cart using cordless power driver; 5) Mate 2-piece struts and lock quick-release retaining pins; 6) Stage required ballast &amp; wheel chocks.</ns0:t>
-      </ns0:r>
-    </ns0:p>
-    <ns0:p>
-      <ns0:pPr>
-        <ns0:spacing ns0:before="0" ns0:after="0" ns0:line="185" ns0:lineRule="auto"/>
-        <ns0:ind ns0:left="360" ns0:hanging="240"/>
-      </ns0:pPr>
-      <ns0:r>
-        <ns0:rPr>
-          <ns0:b/>
-          <ns0:sz ns0:val="13"/>
+          <ns0:sz ns0:val="17"/>
         </ns0:rPr>
         <ns0:t xml:space="preserve">• Egress, "Two-Shot" Staging &amp; Teardown: </ns0:t>
       </ns0:r>
       <ns0:r>
         <ns0:rPr>
-          <ns0:sz ns0:val="13"/>
+          <ns0:sz ns0:val="17"/>
         </ns0:rPr>
         <ns0:t>1) Continuous egress through designated rear end zone exit up hill to trailer lot (NEVER de-ballast at stadium chute; avoid front end zone restricted area); 2) Between Prelims &amp; Finals ("Two-Shot"), leave ballast on carts in trailer lot; if gusts pick up, pull strut pins to lay vinyl frames flat on carts; 3) Final teardown: remove sandbags over axles; 4) Pull strut pins (stow in tote); 5) Install tennis balls over upper strut ends; 6) Unbolt frame using power driver; 7) Frames onto cross beams; 8) Carts vertical on short ends strapped against front nose wall.</ns0:t>
       </ns0:r>

</xml_diff>